<commit_message>
Deploying to gh-pages from @ Morrison-Lab/mds@3110c00f9f48791f58938e244b29e87659980604 🚀
</commit_message>
<xml_diff>
--- a/linear-algebra-inner-products.docx
+++ b/linear-algebra-inner-products.docx
@@ -15,7 +15,7 @@
         <w:pStyle w:val="Date"/>
       </w:pPr>
       <w:r>
-        <w:t xml:space="preserve">Last modified: 2026-10-15 06:48:48 (PDT)</w:t>
+        <w:t xml:space="preserve">Last modified: 2026-10-15 07:39:11 (PDT)</w:t>
       </w:r>
     </w:p>
     <w:bookmarkStart w:id="24" w:name="sec-inner-products"/>
@@ -8495,7 +8495,7 @@
     </w:p>
     <w:bookmarkEnd w:id="23"/>
     <w:bookmarkEnd w:id="24"/>
-    <w:bookmarkStart w:id="62" w:name="sec-cauchy-schwarz"/>
+    <w:bookmarkStart w:id="63" w:name="sec-cauchy-schwarz"/>
     <w:p>
       <w:pPr>
         <w:pStyle w:val="Heading2"/>
@@ -21910,7 +21910,7 @@
           <w:b/>
           <w:bCs/>
         </w:rPr>
-        <w:t xml:space="preserve">Definition 4 (Norm (normed vector space))</w:t>
+        <w:t xml:space="preserve">Definition 4 (Norm (normed vector space, normed space))</w:t>
       </w:r>
       <w:r>
         <w:t xml:space="preserve"> </w:t>
@@ -22999,7 +22999,7 @@
           <w:b/>
           <w:bCs/>
         </w:rPr>
-        <w:t xml:space="preserve">norm,</w:t>
+        <w:t xml:space="preserve">norm, taxicab norm, Manhattan norm,</w:t>
       </w:r>
       <w:r>
         <w:rPr>
@@ -32750,7 +32750,7 @@
       </w:r>
     </w:p>
     <w:bookmarkEnd w:id="49"/>
-    <w:bookmarkStart w:id="50" w:name="def-cosine-sine"/>
+    <w:bookmarkStart w:id="51" w:name="def-angle"/>
     <w:p>
       <w:pPr>
         <w:pStyle w:val="BodyText"/>
@@ -32760,1386 +32760,7 @@
           <w:b/>
           <w:bCs/>
         </w:rPr>
-        <w:t xml:space="preserve">Definition 7 (Cosine and sine)</w:t>
-      </w:r>
-      <w:r>
-        <w:t xml:space="preserve"> </w:t>
-      </w:r>
-      <w:r>
-        <w:t xml:space="preserve">The</w:t>
-      </w:r>
-      <w:r>
-        <w:t xml:space="preserve"> </w:t>
-      </w:r>
-      <w:r>
-        <w:rPr>
-          <w:i/>
-          <w:iCs/>
-        </w:rPr>
-        <w:t xml:space="preserve">unit circle</w:t>
-      </w:r>
-      <w:r>
-        <w:t xml:space="preserve"> </w:t>
-      </w:r>
-      <w:r>
-        <w:t xml:space="preserve">is the set of points</w:t>
-      </w:r>
-      <w:r>
-        <w:t xml:space="preserve"> </w:t>
-      </w:r>
-      <m:oMath>
-        <m:r>
-          <m:rPr>
-            <m:sty m:val="p"/>
-          </m:rPr>
-          <m:t>(</m:t>
-        </m:r>
-        <m:sSub>
-          <m:e>
-            <m:r>
-              <m:t>x</m:t>
-            </m:r>
-          </m:e>
-          <m:sub>
-            <m:r>
-              <m:t>1</m:t>
-            </m:r>
-          </m:sub>
-        </m:sSub>
-        <m:r>
-          <m:rPr>
-            <m:sty m:val="p"/>
-          </m:rPr>
-          <m:t>,</m:t>
-        </m:r>
-        <m:sSub>
-          <m:e>
-            <m:r>
-              <m:t>x</m:t>
-            </m:r>
-          </m:e>
-          <m:sub>
-            <m:r>
-              <m:t>2</m:t>
-            </m:r>
-          </m:sub>
-        </m:sSub>
-        <m:r>
-          <m:rPr>
-            <m:sty m:val="p"/>
-          </m:rPr>
-          <m:t>)</m:t>
-        </m:r>
-      </m:oMath>
-      <w:r>
-        <w:t xml:space="preserve"> </w:t>
-      </w:r>
-      <w:r>
-        <w:t xml:space="preserve">in the plane with</w:t>
-      </w:r>
-      <w:r>
-        <w:t xml:space="preserve"> </w:t>
-      </w:r>
-      <m:oMath>
-        <m:sSubSup>
-          <m:e>
-            <m:r>
-              <m:t>x</m:t>
-            </m:r>
-          </m:e>
-          <m:sub>
-            <m:r>
-              <m:t>1</m:t>
-            </m:r>
-          </m:sub>
-          <m:sup>
-            <m:r>
-              <m:t>2</m:t>
-            </m:r>
-          </m:sup>
-        </m:sSubSup>
-        <m:r>
-          <m:rPr>
-            <m:sty m:val="p"/>
-          </m:rPr>
-          <m:t>+</m:t>
-        </m:r>
-        <m:sSubSup>
-          <m:e>
-            <m:r>
-              <m:t>x</m:t>
-            </m:r>
-          </m:e>
-          <m:sub>
-            <m:r>
-              <m:t>2</m:t>
-            </m:r>
-          </m:sub>
-          <m:sup>
-            <m:r>
-              <m:t>2</m:t>
-            </m:r>
-          </m:sup>
-        </m:sSubSup>
-        <m:r>
-          <m:rPr>
-            <m:sty m:val="p"/>
-          </m:rPr>
-          <m:t>=</m:t>
-        </m:r>
-        <m:r>
-          <m:t>1</m:t>
-        </m:r>
-      </m:oMath>
-      <w:r>
-        <w:t xml:space="preserve">,</w:t>
-      </w:r>
-      <w:r>
-        <w:t xml:space="preserve"> </w:t>
-      </w:r>
-      <w:r>
-        <w:t xml:space="preserve">and</w:t>
-      </w:r>
-      <w:r>
-        <w:t xml:space="preserve"> </w:t>
-      </w:r>
-      <m:oMath>
-        <m:r>
-          <m:t>π</m:t>
-        </m:r>
-        <m:r>
-          <m:rPr>
-            <m:sty m:val="p"/>
-          </m:rPr>
-          <m:t>≈</m:t>
-        </m:r>
-        <m:r>
-          <m:t>3.14159</m:t>
-        </m:r>
-      </m:oMath>
-      <w:r>
-        <w:t xml:space="preserve"> </w:t>
-      </w:r>
-      <w:r>
-        <w:t xml:space="preserve">is half of its circumference.</w:t>
-      </w:r>
-      <w:r>
-        <w:t xml:space="preserve"> </w:t>
-      </w:r>
-      <w:r>
-        <w:t xml:space="preserve">For a real number</w:t>
-      </w:r>
-      <w:r>
-        <w:t xml:space="preserve"> </w:t>
-      </w:r>
-      <m:oMath>
-        <m:r>
-          <m:t>θ</m:t>
-        </m:r>
-      </m:oMath>
-      <w:r>
-        <w:t xml:space="preserve">, start at the point</w:t>
-      </w:r>
-      <w:r>
-        <w:t xml:space="preserve"> </w:t>
-      </w:r>
-      <m:oMath>
-        <m:r>
-          <m:rPr>
-            <m:sty m:val="p"/>
-          </m:rPr>
-          <m:t>(</m:t>
-        </m:r>
-        <m:r>
-          <m:t>1</m:t>
-        </m:r>
-        <m:r>
-          <m:rPr>
-            <m:sty m:val="p"/>
-          </m:rPr>
-          <m:t>,</m:t>
-        </m:r>
-        <m:r>
-          <m:t>0</m:t>
-        </m:r>
-        <m:r>
-          <m:rPr>
-            <m:sty m:val="p"/>
-          </m:rPr>
-          <m:t>)</m:t>
-        </m:r>
-      </m:oMath>
-      <w:r>
-        <w:t xml:space="preserve"> </w:t>
-      </w:r>
-      <w:r>
-        <w:t xml:space="preserve">and move a distance</w:t>
-      </w:r>
-      <w:r>
-        <w:t xml:space="preserve"> </w:t>
-      </w:r>
-      <m:oMath>
-        <m:r>
-          <m:t>​</m:t>
-        </m:r>
-        <m:d>
-          <m:dPr>
-            <m:begChr m:val="|"/>
-            <m:sepChr m:val=""/>
-            <m:endChr m:val="|"/>
-            <m:grow/>
-          </m:dPr>
-          <m:e>
-            <m:r>
-              <m:t>θ</m:t>
-            </m:r>
-          </m:e>
-        </m:d>
-        <m:r>
-          <m:t>​</m:t>
-        </m:r>
-      </m:oMath>
-      <w:r>
-        <w:t xml:space="preserve"> </w:t>
-      </w:r>
-      <w:r>
-        <w:t xml:space="preserve">along the unit circle,</w:t>
-      </w:r>
-      <w:r>
-        <w:t xml:space="preserve"> </w:t>
-      </w:r>
-      <w:r>
-        <w:t xml:space="preserve">counterclockwise if</w:t>
-      </w:r>
-      <w:r>
-        <w:t xml:space="preserve"> </w:t>
-      </w:r>
-      <m:oMath>
-        <m:r>
-          <m:t>θ</m:t>
-        </m:r>
-        <m:r>
-          <m:rPr>
-            <m:sty m:val="p"/>
-          </m:rPr>
-          <m:t>≥</m:t>
-        </m:r>
-        <m:r>
-          <m:t>0</m:t>
-        </m:r>
-      </m:oMath>
-      <w:r>
-        <w:t xml:space="preserve"> </w:t>
-      </w:r>
-      <w:r>
-        <w:t xml:space="preserve">and clockwise if</w:t>
-      </w:r>
-      <w:r>
-        <w:t xml:space="preserve"> </w:t>
-      </w:r>
-      <m:oMath>
-        <m:r>
-          <m:t>θ</m:t>
-        </m:r>
-        <m:r>
-          <m:rPr>
-            <m:sty m:val="p"/>
-          </m:rPr>
-          <m:t>&lt;</m:t>
-        </m:r>
-        <m:r>
-          <m:t>0</m:t>
-        </m:r>
-      </m:oMath>
-      <w:r>
-        <w:t xml:space="preserve">.</w:t>
-      </w:r>
-      <w:r>
-        <w:t xml:space="preserve"> </w:t>
-      </w:r>
-      <w:r>
-        <w:t xml:space="preserve">The point reached is</w:t>
-      </w:r>
-      <w:r>
-        <w:t xml:space="preserve"> </w:t>
-      </w:r>
-      <m:oMath>
-        <m:r>
-          <m:rPr>
-            <m:sty m:val="p"/>
-          </m:rPr>
-          <m:t>(</m:t>
-        </m:r>
-        <m:r>
-          <m:rPr>
-            <m:sty m:val="p"/>
-          </m:rPr>
-          <m:t>cos</m:t>
-        </m:r>
-        <m:r>
-          <m:t>θ</m:t>
-        </m:r>
-        <m:r>
-          <m:rPr>
-            <m:sty m:val="p"/>
-          </m:rPr>
-          <m:t>,</m:t>
-        </m:r>
-        <m:r>
-          <m:rPr>
-            <m:sty m:val="p"/>
-          </m:rPr>
-          <m:t>sin</m:t>
-        </m:r>
-        <m:r>
-          <m:t>θ</m:t>
-        </m:r>
-        <m:r>
-          <m:rPr>
-            <m:sty m:val="p"/>
-          </m:rPr>
-          <m:t>)</m:t>
-        </m:r>
-      </m:oMath>
-      <w:r>
-        <w:t xml:space="preserve">:</w:t>
-      </w:r>
-      <w:r>
-        <w:t xml:space="preserve"> </w:t>
-      </w:r>
-      <w:r>
-        <w:t xml:space="preserve">its first coordinate is the</w:t>
-      </w:r>
-      <w:r>
-        <w:t xml:space="preserve"> </w:t>
-      </w:r>
-      <w:r>
-        <w:rPr>
-          <w:b/>
-          <w:bCs/>
-        </w:rPr>
-        <w:t xml:space="preserve">cosine</w:t>
-      </w:r>
-      <w:r>
-        <w:t xml:space="preserve"> </w:t>
-      </w:r>
-      <w:r>
-        <w:t xml:space="preserve">of</w:t>
-      </w:r>
-      <w:r>
-        <w:t xml:space="preserve"> </w:t>
-      </w:r>
-      <m:oMath>
-        <m:r>
-          <m:t>θ</m:t>
-        </m:r>
-      </m:oMath>
-      <w:r>
-        <w:t xml:space="preserve">,</w:t>
-      </w:r>
-      <w:r>
-        <w:t xml:space="preserve"> </w:t>
-      </w:r>
-      <w:r>
-        <w:t xml:space="preserve">and its second coordinate is the</w:t>
-      </w:r>
-      <w:r>
-        <w:t xml:space="preserve"> </w:t>
-      </w:r>
-      <w:r>
-        <w:rPr>
-          <w:b/>
-          <w:bCs/>
-        </w:rPr>
-        <w:t xml:space="preserve">sine</w:t>
-      </w:r>
-      <w:r>
-        <w:t xml:space="preserve"> </w:t>
-      </w:r>
-      <w:r>
-        <w:t xml:space="preserve">of</w:t>
-      </w:r>
-      <w:r>
-        <w:t xml:space="preserve"> </w:t>
-      </w:r>
-      <m:oMath>
-        <m:r>
-          <m:t>θ</m:t>
-        </m:r>
-      </m:oMath>
-      <w:r>
-        <w:t xml:space="preserve">.</w:t>
-      </w:r>
-    </w:p>
-    <w:bookmarkEnd w:id="50"/>
-    <w:bookmarkStart w:id="51" w:name="exm-cosine-sine"/>
-    <w:p>
-      <w:pPr>
-        <w:pStyle w:val="BodyText"/>
-      </w:pPr>
-      <w:r>
-        <w:rPr>
-          <w:b/>
-          <w:bCs/>
-        </w:rPr>
-        <w:t xml:space="preserve">Example 13 (Cosines and sines of some angles)</w:t>
-      </w:r>
-      <w:r>
-        <w:t xml:space="preserve"> </w:t>
-      </w:r>
-      <w:r>
-        <w:t xml:space="preserve"> </w:t>
-      </w:r>
-    </w:p>
-    <w:p>
-      <w:pPr>
-        <w:numPr>
-          <w:ilvl w:val="0"/>
-          <w:numId w:val="1016"/>
-        </w:numPr>
-      </w:pPr>
-      <m:oMath>
-        <m:r>
-          <m:t>θ</m:t>
-        </m:r>
-        <m:r>
-          <m:rPr>
-            <m:sty m:val="p"/>
-          </m:rPr>
-          <m:t>=</m:t>
-        </m:r>
-        <m:r>
-          <m:t>0</m:t>
-        </m:r>
-      </m:oMath>
-      <w:r>
-        <w:t xml:space="preserve"> </w:t>
-      </w:r>
-      <w:r>
-        <w:t xml:space="preserve">stays at</w:t>
-      </w:r>
-      <w:r>
-        <w:t xml:space="preserve"> </w:t>
-      </w:r>
-      <m:oMath>
-        <m:r>
-          <m:rPr>
-            <m:sty m:val="p"/>
-          </m:rPr>
-          <m:t>(</m:t>
-        </m:r>
-        <m:r>
-          <m:t>1</m:t>
-        </m:r>
-        <m:r>
-          <m:rPr>
-            <m:sty m:val="p"/>
-          </m:rPr>
-          <m:t>,</m:t>
-        </m:r>
-        <m:r>
-          <m:t>0</m:t>
-        </m:r>
-        <m:r>
-          <m:rPr>
-            <m:sty m:val="p"/>
-          </m:rPr>
-          <m:t>)</m:t>
-        </m:r>
-      </m:oMath>
-      <w:r>
-        <w:t xml:space="preserve">, so</w:t>
-      </w:r>
-      <w:r>
-        <w:t xml:space="preserve"> </w:t>
-      </w:r>
-      <m:oMath>
-        <m:r>
-          <m:rPr>
-            <m:sty m:val="p"/>
-          </m:rPr>
-          <m:t>cos</m:t>
-        </m:r>
-        <m:r>
-          <m:t>0</m:t>
-        </m:r>
-        <m:r>
-          <m:rPr>
-            <m:sty m:val="p"/>
-          </m:rPr>
-          <m:t>=</m:t>
-        </m:r>
-        <m:r>
-          <m:t>1</m:t>
-        </m:r>
-      </m:oMath>
-      <w:r>
-        <w:t xml:space="preserve"> </w:t>
-      </w:r>
-      <w:r>
-        <w:t xml:space="preserve">and</w:t>
-      </w:r>
-      <w:r>
-        <w:t xml:space="preserve"> </w:t>
-      </w:r>
-      <m:oMath>
-        <m:r>
-          <m:rPr>
-            <m:sty m:val="p"/>
-          </m:rPr>
-          <m:t>sin</m:t>
-        </m:r>
-        <m:r>
-          <m:t>0</m:t>
-        </m:r>
-        <m:r>
-          <m:rPr>
-            <m:sty m:val="p"/>
-          </m:rPr>
-          <m:t>=</m:t>
-        </m:r>
-        <m:r>
-          <m:t>0</m:t>
-        </m:r>
-      </m:oMath>
-      <w:r>
-        <w:t xml:space="preserve">.</w:t>
-      </w:r>
-    </w:p>
-    <w:p>
-      <w:pPr>
-        <w:numPr>
-          <w:ilvl w:val="0"/>
-          <w:numId w:val="1016"/>
-        </w:numPr>
-      </w:pPr>
-      <m:oMath>
-        <m:r>
-          <m:t>θ</m:t>
-        </m:r>
-        <m:r>
-          <m:rPr>
-            <m:sty m:val="p"/>
-          </m:rPr>
-          <m:t>=</m:t>
-        </m:r>
-        <m:r>
-          <m:t>π</m:t>
-        </m:r>
-      </m:oMath>
-      <w:r>
-        <w:t xml:space="preserve"> </w:t>
-      </w:r>
-      <w:r>
-        <w:t xml:space="preserve">goes half way around the circle, to</w:t>
-      </w:r>
-      <w:r>
-        <w:t xml:space="preserve"> </w:t>
-      </w:r>
-      <m:oMath>
-        <m:r>
-          <m:rPr>
-            <m:sty m:val="p"/>
-          </m:rPr>
-          <m:t>(</m:t>
-        </m:r>
-        <m:r>
-          <m:rPr>
-            <m:sty m:val="p"/>
-          </m:rPr>
-          <m:t>−</m:t>
-        </m:r>
-        <m:r>
-          <m:t>1</m:t>
-        </m:r>
-        <m:r>
-          <m:rPr>
-            <m:sty m:val="p"/>
-          </m:rPr>
-          <m:t>,</m:t>
-        </m:r>
-        <m:r>
-          <m:t>0</m:t>
-        </m:r>
-        <m:r>
-          <m:rPr>
-            <m:sty m:val="p"/>
-          </m:rPr>
-          <m:t>)</m:t>
-        </m:r>
-      </m:oMath>
-      <w:r>
-        <w:t xml:space="preserve">,</w:t>
-      </w:r>
-      <w:r>
-        <w:t xml:space="preserve"> </w:t>
-      </w:r>
-      <w:r>
-        <w:t xml:space="preserve">so</w:t>
-      </w:r>
-      <w:r>
-        <w:t xml:space="preserve"> </w:t>
-      </w:r>
-      <m:oMath>
-        <m:r>
-          <m:rPr>
-            <m:sty m:val="p"/>
-          </m:rPr>
-          <m:t>cos</m:t>
-        </m:r>
-        <m:r>
-          <m:t>π</m:t>
-        </m:r>
-        <m:r>
-          <m:rPr>
-            <m:sty m:val="p"/>
-          </m:rPr>
-          <m:t>=</m:t>
-        </m:r>
-        <m:r>
-          <m:rPr>
-            <m:sty m:val="p"/>
-          </m:rPr>
-          <m:t>−</m:t>
-        </m:r>
-        <m:r>
-          <m:t>1</m:t>
-        </m:r>
-      </m:oMath>
-      <w:r>
-        <w:t xml:space="preserve"> </w:t>
-      </w:r>
-      <w:r>
-        <w:t xml:space="preserve">and</w:t>
-      </w:r>
-      <w:r>
-        <w:t xml:space="preserve"> </w:t>
-      </w:r>
-      <m:oMath>
-        <m:r>
-          <m:rPr>
-            <m:sty m:val="p"/>
-          </m:rPr>
-          <m:t>sin</m:t>
-        </m:r>
-        <m:r>
-          <m:t>π</m:t>
-        </m:r>
-        <m:r>
-          <m:rPr>
-            <m:sty m:val="p"/>
-          </m:rPr>
-          <m:t>=</m:t>
-        </m:r>
-        <m:r>
-          <m:t>0</m:t>
-        </m:r>
-      </m:oMath>
-      <w:r>
-        <w:t xml:space="preserve">.</w:t>
-      </w:r>
-    </w:p>
-    <w:p>
-      <w:pPr>
-        <w:numPr>
-          <w:ilvl w:val="0"/>
-          <w:numId w:val="1016"/>
-        </w:numPr>
-      </w:pPr>
-      <m:oMath>
-        <m:r>
-          <m:t>θ</m:t>
-        </m:r>
-        <m:r>
-          <m:rPr>
-            <m:sty m:val="p"/>
-          </m:rPr>
-          <m:t>=</m:t>
-        </m:r>
-        <m:r>
-          <m:t>π</m:t>
-        </m:r>
-        <m:r>
-          <m:rPr>
-            <m:sty m:val="p"/>
-          </m:rPr>
-          <m:t>/</m:t>
-        </m:r>
-        <m:r>
-          <m:t>2</m:t>
-        </m:r>
-      </m:oMath>
-      <w:r>
-        <w:t xml:space="preserve"> </w:t>
-      </w:r>
-      <w:r>
-        <w:t xml:space="preserve">goes a quarter of the way round, to</w:t>
-      </w:r>
-      <w:r>
-        <w:t xml:space="preserve"> </w:t>
-      </w:r>
-      <m:oMath>
-        <m:r>
-          <m:rPr>
-            <m:sty m:val="p"/>
-          </m:rPr>
-          <m:t>(</m:t>
-        </m:r>
-        <m:r>
-          <m:t>0</m:t>
-        </m:r>
-        <m:r>
-          <m:rPr>
-            <m:sty m:val="p"/>
-          </m:rPr>
-          <m:t>,</m:t>
-        </m:r>
-        <m:r>
-          <m:t>1</m:t>
-        </m:r>
-        <m:r>
-          <m:rPr>
-            <m:sty m:val="p"/>
-          </m:rPr>
-          <m:t>)</m:t>
-        </m:r>
-      </m:oMath>
-      <w:r>
-        <w:t xml:space="preserve">,</w:t>
-      </w:r>
-      <w:r>
-        <w:t xml:space="preserve"> </w:t>
-      </w:r>
-      <w:r>
-        <w:t xml:space="preserve">so</w:t>
-      </w:r>
-      <w:r>
-        <w:t xml:space="preserve"> </w:t>
-      </w:r>
-      <m:oMath>
-        <m:r>
-          <m:rPr>
-            <m:sty m:val="p"/>
-          </m:rPr>
-          <m:t>cos</m:t>
-        </m:r>
-        <m:r>
-          <m:rPr>
-            <m:sty m:val="p"/>
-          </m:rPr>
-          <m:t>(</m:t>
-        </m:r>
-        <m:r>
-          <m:t>π</m:t>
-        </m:r>
-        <m:r>
-          <m:rPr>
-            <m:sty m:val="p"/>
-          </m:rPr>
-          <m:t>/</m:t>
-        </m:r>
-        <m:r>
-          <m:t>2</m:t>
-        </m:r>
-        <m:r>
-          <m:rPr>
-            <m:sty m:val="p"/>
-          </m:rPr>
-          <m:t>)</m:t>
-        </m:r>
-        <m:r>
-          <m:rPr>
-            <m:sty m:val="p"/>
-          </m:rPr>
-          <m:t>=</m:t>
-        </m:r>
-        <m:r>
-          <m:t>0</m:t>
-        </m:r>
-      </m:oMath>
-      <w:r>
-        <w:t xml:space="preserve"> </w:t>
-      </w:r>
-      <w:r>
-        <w:t xml:space="preserve">and</w:t>
-      </w:r>
-      <w:r>
-        <w:t xml:space="preserve"> </w:t>
-      </w:r>
-      <m:oMath>
-        <m:r>
-          <m:rPr>
-            <m:sty m:val="p"/>
-          </m:rPr>
-          <m:t>sin</m:t>
-        </m:r>
-        <m:r>
-          <m:rPr>
-            <m:sty m:val="p"/>
-          </m:rPr>
-          <m:t>(</m:t>
-        </m:r>
-        <m:r>
-          <m:t>π</m:t>
-        </m:r>
-        <m:r>
-          <m:rPr>
-            <m:sty m:val="p"/>
-          </m:rPr>
-          <m:t>/</m:t>
-        </m:r>
-        <m:r>
-          <m:t>2</m:t>
-        </m:r>
-        <m:r>
-          <m:rPr>
-            <m:sty m:val="p"/>
-          </m:rPr>
-          <m:t>)</m:t>
-        </m:r>
-        <m:r>
-          <m:rPr>
-            <m:sty m:val="p"/>
-          </m:rPr>
-          <m:t>=</m:t>
-        </m:r>
-        <m:r>
-          <m:t>1</m:t>
-        </m:r>
-      </m:oMath>
-      <w:r>
-        <w:t xml:space="preserve">.</w:t>
-      </w:r>
-    </w:p>
-    <w:p>
-      <w:pPr>
-        <w:numPr>
-          <w:ilvl w:val="0"/>
-          <w:numId w:val="1016"/>
-        </w:numPr>
-      </w:pPr>
-      <m:oMath>
-        <m:r>
-          <m:t>θ</m:t>
-        </m:r>
-        <m:r>
-          <m:rPr>
-            <m:sty m:val="p"/>
-          </m:rPr>
-          <m:t>=</m:t>
-        </m:r>
-        <m:r>
-          <m:t>π</m:t>
-        </m:r>
-        <m:r>
-          <m:rPr>
-            <m:sty m:val="p"/>
-          </m:rPr>
-          <m:t>/</m:t>
-        </m:r>
-        <m:r>
-          <m:t>4</m:t>
-        </m:r>
-      </m:oMath>
-      <w:r>
-        <w:t xml:space="preserve"> </w:t>
-      </w:r>
-      <w:r>
-        <w:t xml:space="preserve">goes an eighth of the way round,</w:t>
-      </w:r>
-      <w:r>
-        <w:t xml:space="preserve"> </w:t>
-      </w:r>
-      <w:r>
-        <w:t xml:space="preserve">to the point of the circle with</w:t>
-      </w:r>
-      <w:r>
-        <w:t xml:space="preserve"> </w:t>
-      </w:r>
-      <m:oMath>
-        <m:sSub>
-          <m:e>
-            <m:r>
-              <m:t>x</m:t>
-            </m:r>
-          </m:e>
-          <m:sub>
-            <m:r>
-              <m:t>1</m:t>
-            </m:r>
-          </m:sub>
-        </m:sSub>
-        <m:r>
-          <m:rPr>
-            <m:sty m:val="p"/>
-          </m:rPr>
-          <m:t>=</m:t>
-        </m:r>
-        <m:sSub>
-          <m:e>
-            <m:r>
-              <m:t>x</m:t>
-            </m:r>
-          </m:e>
-          <m:sub>
-            <m:r>
-              <m:t>2</m:t>
-            </m:r>
-          </m:sub>
-        </m:sSub>
-        <m:r>
-          <m:rPr>
-            <m:sty m:val="p"/>
-          </m:rPr>
-          <m:t>&gt;</m:t>
-        </m:r>
-        <m:r>
-          <m:t>0</m:t>
-        </m:r>
-      </m:oMath>
-      <w:r>
-        <w:t xml:space="preserve">.</w:t>
-      </w:r>
-      <w:r>
-        <w:t xml:space="preserve"> </w:t>
-      </w:r>
-      <w:r>
-        <w:t xml:space="preserve">There</w:t>
-      </w:r>
-      <w:r>
-        <w:t xml:space="preserve"> </w:t>
-      </w:r>
-      <m:oMath>
-        <m:sSubSup>
-          <m:e>
-            <m:r>
-              <m:t>x</m:t>
-            </m:r>
-          </m:e>
-          <m:sub>
-            <m:r>
-              <m:t>1</m:t>
-            </m:r>
-          </m:sub>
-          <m:sup>
-            <m:r>
-              <m:t>2</m:t>
-            </m:r>
-          </m:sup>
-        </m:sSubSup>
-        <m:r>
-          <m:rPr>
-            <m:sty m:val="p"/>
-          </m:rPr>
-          <m:t>+</m:t>
-        </m:r>
-        <m:sSubSup>
-          <m:e>
-            <m:r>
-              <m:t>x</m:t>
-            </m:r>
-          </m:e>
-          <m:sub>
-            <m:r>
-              <m:t>1</m:t>
-            </m:r>
-          </m:sub>
-          <m:sup>
-            <m:r>
-              <m:t>2</m:t>
-            </m:r>
-          </m:sup>
-        </m:sSubSup>
-        <m:r>
-          <m:rPr>
-            <m:sty m:val="p"/>
-          </m:rPr>
-          <m:t>=</m:t>
-        </m:r>
-        <m:r>
-          <m:t>1</m:t>
-        </m:r>
-      </m:oMath>
-      <w:r>
-        <w:t xml:space="preserve">, so</w:t>
-      </w:r>
-      <w:r>
-        <w:t xml:space="preserve"> </w:t>
-      </w:r>
-      <m:oMath>
-        <m:sSubSup>
-          <m:e>
-            <m:r>
-              <m:t>x</m:t>
-            </m:r>
-          </m:e>
-          <m:sub>
-            <m:r>
-              <m:t>1</m:t>
-            </m:r>
-          </m:sub>
-          <m:sup>
-            <m:r>
-              <m:t>2</m:t>
-            </m:r>
-          </m:sup>
-        </m:sSubSup>
-        <m:r>
-          <m:rPr>
-            <m:sty m:val="p"/>
-          </m:rPr>
-          <m:t>=</m:t>
-        </m:r>
-        <m:f>
-          <m:fPr>
-            <m:type m:val="lin"/>
-          </m:fPr>
-          <m:num>
-            <m:r>
-              <m:t>1</m:t>
-            </m:r>
-          </m:num>
-          <m:den>
-            <m:r>
-              <m:t>2</m:t>
-            </m:r>
-          </m:den>
-        </m:f>
-      </m:oMath>
-      <w:r>
-        <w:t xml:space="preserve"> </w:t>
-      </w:r>
-      <w:r>
-        <w:t xml:space="preserve">and</w:t>
-      </w:r>
-      <w:r>
-        <w:t xml:space="preserve"> </w:t>
-      </w:r>
-      <m:oMath>
-        <m:sSub>
-          <m:e>
-            <m:r>
-              <m:t>x</m:t>
-            </m:r>
-          </m:e>
-          <m:sub>
-            <m:r>
-              <m:t>1</m:t>
-            </m:r>
-          </m:sub>
-        </m:sSub>
-        <m:r>
-          <m:rPr>
-            <m:sty m:val="p"/>
-          </m:rPr>
-          <m:t>=</m:t>
-        </m:r>
-        <m:f>
-          <m:fPr>
-            <m:type m:val="lin"/>
-          </m:fPr>
-          <m:num>
-            <m:r>
-              <m:t>1</m:t>
-            </m:r>
-          </m:num>
-          <m:den>
-            <m:rad>
-              <m:radPr>
-                <m:degHide m:val="on"/>
-              </m:radPr>
-              <m:deg/>
-              <m:e>
-                <m:r>
-                  <m:t>2</m:t>
-                </m:r>
-              </m:e>
-            </m:rad>
-          </m:den>
-        </m:f>
-        <m:r>
-          <m:rPr>
-            <m:sty m:val="p"/>
-          </m:rPr>
-          <m:t>≈</m:t>
-        </m:r>
-        <m:r>
-          <m:t>0.7071</m:t>
-        </m:r>
-      </m:oMath>
-      <w:r>
-        <w:t xml:space="preserve">:</w:t>
-      </w:r>
-    </w:p>
-    <w:p>
-      <w:pPr>
-        <w:pStyle w:val="BodyText"/>
-      </w:pPr>
-      <m:oMathPara>
-        <m:oMathParaPr>
-          <m:jc m:val="center"/>
-        </m:oMathParaPr>
-        <m:oMath>
-          <m:eqArr>
-            <m:e>
-              <m:r>
-                <m:rPr>
-                  <m:sty m:val="p"/>
-                </m:rPr>
-                <m:t>cos</m:t>
-              </m:r>
-              <m:r>
-                <m:rPr>
-                  <m:sty m:val="p"/>
-                </m:rPr>
-                <m:t>(</m:t>
-              </m:r>
-              <m:r>
-                <m:t>π</m:t>
-              </m:r>
-              <m:r>
-                <m:rPr>
-                  <m:sty m:val="p"/>
-                </m:rPr>
-                <m:t>/</m:t>
-              </m:r>
-              <m:r>
-                <m:t>4</m:t>
-              </m:r>
-              <m:r>
-                <m:rPr>
-                  <m:sty m:val="p"/>
-                </m:rPr>
-                <m:t>)</m:t>
-              </m:r>
-              <m:r>
-                <m:t>&amp;</m:t>
-              </m:r>
-              <m:r>
-                <m:rPr>
-                  <m:sty m:val="p"/>
-                </m:rPr>
-                <m:t>=</m:t>
-              </m:r>
-              <m:r>
-                <m:rPr>
-                  <m:sty m:val="p"/>
-                </m:rPr>
-                <m:t>sin</m:t>
-              </m:r>
-              <m:r>
-                <m:rPr>
-                  <m:sty m:val="p"/>
-                </m:rPr>
-                <m:t>(</m:t>
-              </m:r>
-              <m:r>
-                <m:t>π</m:t>
-              </m:r>
-              <m:r>
-                <m:rPr>
-                  <m:sty m:val="p"/>
-                </m:rPr>
-                <m:t>/</m:t>
-              </m:r>
-              <m:r>
-                <m:t>4</m:t>
-              </m:r>
-              <m:r>
-                <m:rPr>
-                  <m:sty m:val="p"/>
-                </m:rPr>
-                <m:t>)</m:t>
-              </m:r>
-            </m:e>
-            <m:e>
-              <m:r>
-                <m:t>&amp;</m:t>
-              </m:r>
-              <m:r>
-                <m:rPr>
-                  <m:sty m:val="p"/>
-                </m:rPr>
-                <m:t>=</m:t>
-              </m:r>
-              <m:f>
-                <m:fPr>
-                  <m:type m:val="lin"/>
-                </m:fPr>
-                <m:num>
-                  <m:r>
-                    <m:t>1</m:t>
-                  </m:r>
-                </m:num>
-                <m:den>
-                  <m:rad>
-                    <m:radPr>
-                      <m:degHide m:val="on"/>
-                    </m:radPr>
-                    <m:deg/>
-                    <m:e>
-                      <m:r>
-                        <m:t>2</m:t>
-                      </m:r>
-                    </m:e>
-                  </m:rad>
-                </m:den>
-              </m:f>
-              <m:r>
-                <m:rPr>
-                  <m:sty m:val="p"/>
-                </m:rPr>
-                <m:t>.</m:t>
-              </m:r>
-            </m:e>
-          </m:eqArr>
-        </m:oMath>
-      </m:oMathPara>
-    </w:p>
-    <w:p>
-      <w:pPr>
-        <w:pStyle w:val="FirstParagraph"/>
-      </w:pPr>
-      <w:r>
-        <w:t xml:space="preserve">Angles are also measured in</w:t>
-      </w:r>
-      <w:r>
-        <w:t xml:space="preserve"> </w:t>
-      </w:r>
-      <w:r>
-        <w:rPr>
-          <w:i/>
-          <w:iCs/>
-        </w:rPr>
-        <w:t xml:space="preserve">degrees</w:t>
-      </w:r>
-      <w:r>
-        <w:t xml:space="preserve">, with a full turn of</w:t>
-      </w:r>
-      <w:r>
-        <w:t xml:space="preserve"> </w:t>
-      </w:r>
-      <m:oMath>
-        <m:r>
-          <m:t>2</m:t>
-        </m:r>
-        <m:r>
-          <m:t>π</m:t>
-        </m:r>
-      </m:oMath>
-      <w:r>
-        <w:t xml:space="preserve"> </w:t>
-      </w:r>
-      <w:r>
-        <w:t xml:space="preserve">equal to</w:t>
-      </w:r>
-      <w:r>
-        <w:t xml:space="preserve"> </w:t>
-      </w:r>
-      <m:oMath>
-        <m:r>
-          <m:t>360</m:t>
-        </m:r>
-      </m:oMath>
-      <w:r>
-        <w:t xml:space="preserve"> </w:t>
-      </w:r>
-      <w:r>
-        <w:t xml:space="preserve">degrees,</w:t>
-      </w:r>
-      <w:r>
-        <w:t xml:space="preserve"> </w:t>
-      </w:r>
-      <w:r>
-        <w:t xml:space="preserve">so</w:t>
-      </w:r>
-      <w:r>
-        <w:t xml:space="preserve"> </w:t>
-      </w:r>
-      <m:oMath>
-        <m:r>
-          <m:t>π</m:t>
-        </m:r>
-        <m:r>
-          <m:rPr>
-            <m:sty m:val="p"/>
-          </m:rPr>
-          <m:t>/</m:t>
-        </m:r>
-        <m:r>
-          <m:t>2</m:t>
-        </m:r>
-      </m:oMath>
-      <w:r>
-        <w:t xml:space="preserve"> </w:t>
-      </w:r>
-      <w:r>
-        <w:t xml:space="preserve">is</w:t>
-      </w:r>
-      <w:r>
-        <w:t xml:space="preserve"> </w:t>
-      </w:r>
-      <m:oMath>
-        <m:r>
-          <m:t>90</m:t>
-        </m:r>
-      </m:oMath>
-      <w:r>
-        <w:t xml:space="preserve"> </w:t>
-      </w:r>
-      <w:r>
-        <w:t xml:space="preserve">degrees and</w:t>
-      </w:r>
-      <w:r>
-        <w:t xml:space="preserve"> </w:t>
-      </w:r>
-      <m:oMath>
-        <m:r>
-          <m:t>π</m:t>
-        </m:r>
-        <m:r>
-          <m:rPr>
-            <m:sty m:val="p"/>
-          </m:rPr>
-          <m:t>/</m:t>
-        </m:r>
-        <m:r>
-          <m:t>4</m:t>
-        </m:r>
-      </m:oMath>
-      <w:r>
-        <w:t xml:space="preserve"> </w:t>
-      </w:r>
-      <w:r>
-        <w:t xml:space="preserve">is</w:t>
-      </w:r>
-      <w:r>
-        <w:t xml:space="preserve"> </w:t>
-      </w:r>
-      <m:oMath>
-        <m:r>
-          <m:t>45</m:t>
-        </m:r>
-      </m:oMath>
-      <w:r>
-        <w:t xml:space="preserve"> </w:t>
-      </w:r>
-      <w:r>
-        <w:t xml:space="preserve">degrees.</w:t>
-      </w:r>
-    </w:p>
-    <w:bookmarkEnd w:id="51"/>
-    <w:bookmarkStart w:id="52" w:name="def-angle"/>
-    <w:p>
-      <w:pPr>
-        <w:pStyle w:val="BodyText"/>
-      </w:pPr>
-      <w:r>
-        <w:rPr>
-          <w:b/>
-          <w:bCs/>
-        </w:rPr>
-        <w:t xml:space="preserve">Definition 8 (Angle between two vectors)</w:t>
+        <w:t xml:space="preserve">Definition 7 (Angle between two vectors)</w:t>
       </w:r>
       <w:r>
         <w:t xml:space="preserve"> </w:t>
@@ -34266,12 +32887,12 @@
       <w:r>
         <w:t xml:space="preserve">whose cosine (</w:t>
       </w:r>
-      <w:hyperlink w:anchor="def-cosine-sine">
+      <w:hyperlink r:id="rId50">
         <w:r>
           <w:rPr>
             <w:rStyle w:val="Hyperlink"/>
           </w:rPr>
-          <w:t xml:space="preserve">Definition 7</w:t>
+          <w:t xml:space="preserve">Definition 1 in Trigonometry</w:t>
         </w:r>
       </w:hyperlink>
       <w:r>
@@ -34401,7 +33022,7 @@
         </m:oMath>
       </m:oMathPara>
     </w:p>
-    <w:bookmarkEnd w:id="52"/>
+    <w:bookmarkEnd w:id="51"/>
     <w:bookmarkStart w:id="53" w:name="rem-angle-well-defined"/>
     <w:p>
       <w:pPr>
@@ -34613,7 +33234,18 @@
         <w:t xml:space="preserve"> </w:t>
       </w:r>
       <w:r>
-        <w:t xml:space="preserve">exactly once,</w:t>
+        <w:t xml:space="preserve">exactly once (</w:t>
+      </w:r>
+      <w:hyperlink r:id="rId52">
+        <w:r>
+          <w:rPr>
+            <w:rStyle w:val="Hyperlink"/>
+          </w:rPr>
+          <w:t xml:space="preserve">Theorem 2 in Trigonometry</w:t>
+        </w:r>
+      </w:hyperlink>
+      <w:r>
+        <w:t xml:space="preserve">),</w:t>
       </w:r>
       <w:r>
         <w:t xml:space="preserve"> </w:t>
@@ -34632,34 +33264,25 @@
       <w:r>
         <w:t xml:space="preserve">.</w:t>
       </w:r>
-      <w:r>
-        <w:t xml:space="preserve"> </w:t>
-      </w:r>
-      <w:r>
-        <w:t xml:space="preserve">The angle is</w:t>
-      </w:r>
-      <w:r>
-        <w:t xml:space="preserve"> </w:t>
-      </w:r>
-      <m:oMath>
-        <m:r>
-          <m:t>π</m:t>
-        </m:r>
-        <m:r>
-          <m:rPr>
-            <m:sty m:val="p"/>
-          </m:rPr>
-          <m:t>/</m:t>
-        </m:r>
-        <m:r>
-          <m:t>2</m:t>
-        </m:r>
-      </m:oMath>
-      <w:r>
-        <w:t xml:space="preserve"> </w:t>
-      </w:r>
-      <w:r>
-        <w:t xml:space="preserve">exactly when</w:t>
+    </w:p>
+    <w:bookmarkEnd w:id="53"/>
+    <w:bookmarkStart w:id="54" w:name="cor-right-angle-orthogonal"/>
+    <w:p>
+      <w:pPr>
+        <w:pStyle w:val="BodyText"/>
+      </w:pPr>
+      <w:r>
+        <w:rPr>
+          <w:b/>
+          <w:bCs/>
+        </w:rPr>
+        <w:t xml:space="preserve">Corollary 1 (A right angle means orthogonal)</w:t>
+      </w:r>
+      <w:r>
+        <w:t xml:space="preserve"> </w:t>
+      </w:r>
+      <w:r>
+        <w:t xml:space="preserve">For nonzero vectors</w:t>
       </w:r>
       <w:r>
         <w:t xml:space="preserve"> </w:t>
@@ -34679,7 +33302,7 @@
           <m:rPr>
             <m:sty m:val="p"/>
           </m:rPr>
-          <m:t>⋅</m:t>
+          <m:t>,</m:t>
         </m:r>
         <m:acc>
           <m:accPr>
@@ -34695,18 +33318,150 @@
           <m:rPr>
             <m:sty m:val="p"/>
           </m:rPr>
-          <m:t>=</m:t>
-        </m:r>
-        <m:r>
-          <m:t>0</m:t>
-        </m:r>
+          <m:t>∈</m:t>
+        </m:r>
+        <m:sSup>
+          <m:e>
+            <m:r>
+              <m:rPr>
+                <m:scr m:val="double-struck"/>
+                <m:sty m:val="p"/>
+              </m:rPr>
+              <m:t>R</m:t>
+            </m:r>
+          </m:e>
+          <m:sup>
+            <m:r>
+              <m:t>p</m:t>
+            </m:r>
+          </m:sup>
+        </m:sSup>
       </m:oMath>
       <w:r>
-        <w:t xml:space="preserve">,</w:t>
-      </w:r>
-      <w:r>
-        <w:t xml:space="preserve"> </w:t>
-      </w:r>
+        <w:t xml:space="preserve"> </w:t>
+      </w:r>
+      <w:r>
+        <w:t xml:space="preserve">with angle</w:t>
+      </w:r>
+      <w:r>
+        <w:t xml:space="preserve"> </w:t>
+      </w:r>
+      <m:oMath>
+        <m:r>
+          <m:t>θ</m:t>
+        </m:r>
+      </m:oMath>
+      <w:r>
+        <w:t xml:space="preserve"> </w:t>
+      </w:r>
+      <w:r>
+        <w:t xml:space="preserve">(</w:t>
+      </w:r>
+      <w:hyperlink w:anchor="def-angle">
+        <w:r>
+          <w:rPr>
+            <w:rStyle w:val="Hyperlink"/>
+          </w:rPr>
+          <w:t xml:space="preserve">Definition 7</w:t>
+        </w:r>
+      </w:hyperlink>
+      <w:r>
+        <w:t xml:space="preserve">),</w:t>
+      </w:r>
+    </w:p>
+    <w:p>
+      <w:pPr>
+        <w:pStyle w:val="BodyText"/>
+      </w:pPr>
+      <m:oMathPara>
+        <m:oMathParaPr>
+          <m:jc m:val="center"/>
+        </m:oMathParaPr>
+        <m:oMath>
+          <m:r>
+            <m:t>θ</m:t>
+          </m:r>
+          <m:r>
+            <m:rPr>
+              <m:sty m:val="p"/>
+            </m:rPr>
+            <m:t>=</m:t>
+          </m:r>
+          <m:f>
+            <m:fPr>
+              <m:type m:val="bar"/>
+            </m:fPr>
+            <m:num>
+              <m:r>
+                <m:t>π</m:t>
+              </m:r>
+            </m:num>
+            <m:den>
+              <m:r>
+                <m:t>2</m:t>
+              </m:r>
+            </m:den>
+          </m:f>
+          <m:r>
+            <m:t> </m:t>
+          </m:r>
+          <m:r>
+            <m:rPr>
+              <m:sty m:val="p"/>
+            </m:rPr>
+            <m:t>⇔</m:t>
+          </m:r>
+          <m:r>
+            <m:t> </m:t>
+          </m:r>
+          <m:acc>
+            <m:accPr>
+              <m:chr m:val="̃"/>
+            </m:accPr>
+            <m:e>
+              <m:r>
+                <m:t>x</m:t>
+              </m:r>
+            </m:e>
+          </m:acc>
+          <m:r>
+            <m:rPr>
+              <m:sty m:val="p"/>
+            </m:rPr>
+            <m:t>⋅</m:t>
+          </m:r>
+          <m:acc>
+            <m:accPr>
+              <m:chr m:val="̃"/>
+            </m:accPr>
+            <m:e>
+              <m:r>
+                <m:t>y</m:t>
+              </m:r>
+            </m:e>
+          </m:acc>
+          <m:r>
+            <m:rPr>
+              <m:sty m:val="p"/>
+            </m:rPr>
+            <m:t>=</m:t>
+          </m:r>
+          <m:r>
+            <m:t>0</m:t>
+          </m:r>
+          <m:r>
+            <m:rPr>
+              <m:sty m:val="p"/>
+            </m:rPr>
+            <m:t>,</m:t>
+          </m:r>
+        </m:oMath>
+      </m:oMathPara>
+    </w:p>
+    <w:p>
+      <w:pPr>
+        <w:pStyle w:val="FirstParagraph"/>
+      </w:pPr>
       <w:r>
         <w:t xml:space="preserve">so for nonzero vectors, orthogonal (</w:t>
       </w:r>
@@ -34722,18 +33477,269 @@
         <w:t xml:space="preserve">) means at a right angle.</w:t>
       </w:r>
     </w:p>
-    <w:bookmarkEnd w:id="53"/>
-    <w:bookmarkStart w:id="54" w:name="exm-angle"/>
+    <w:bookmarkEnd w:id="54"/>
     <w:p>
       <w:pPr>
         <w:pStyle w:val="BodyText"/>
       </w:pPr>
       <w:r>
         <w:rPr>
+          <w:i/>
+          <w:iCs/>
+        </w:rPr>
+        <w:t xml:space="preserve">Proof</w:t>
+      </w:r>
+      <w:r>
+        <w:t xml:space="preserve">. </w:t>
+      </w:r>
+      <w:r>
+        <w:t xml:space="preserve">Since</w:t>
+      </w:r>
+      <w:r>
+        <w:t xml:space="preserve"> </w:t>
+      </w:r>
+      <m:oMath>
+        <m:r>
+          <m:t>​</m:t>
+        </m:r>
+        <m:d>
+          <m:dPr>
+            <m:begChr m:val="∥"/>
+            <m:sepChr m:val=""/>
+            <m:endChr m:val="∥"/>
+            <m:grow/>
+          </m:dPr>
+          <m:e>
+            <m:acc>
+              <m:accPr>
+                <m:chr m:val="̃"/>
+              </m:accPr>
+              <m:e>
+                <m:r>
+                  <m:t>x</m:t>
+                </m:r>
+              </m:e>
+            </m:acc>
+          </m:e>
+        </m:d>
+        <m:r>
+          <m:t>​</m:t>
+        </m:r>
+        <m:r>
+          <m:t> </m:t>
+        </m:r>
+        <m:r>
+          <m:t>​</m:t>
+        </m:r>
+        <m:d>
+          <m:dPr>
+            <m:begChr m:val="∥"/>
+            <m:sepChr m:val=""/>
+            <m:endChr m:val="∥"/>
+            <m:grow/>
+          </m:dPr>
+          <m:e>
+            <m:acc>
+              <m:accPr>
+                <m:chr m:val="̃"/>
+              </m:accPr>
+              <m:e>
+                <m:r>
+                  <m:t>y</m:t>
+                </m:r>
+              </m:e>
+            </m:acc>
+          </m:e>
+        </m:d>
+        <m:r>
+          <m:t>​</m:t>
+        </m:r>
+        <m:r>
+          <m:rPr>
+            <m:sty m:val="p"/>
+          </m:rPr>
+          <m:t>&gt;</m:t>
+        </m:r>
+        <m:r>
+          <m:t>0</m:t>
+        </m:r>
+      </m:oMath>
+      <w:r>
+        <w:t xml:space="preserve"> </w:t>
+      </w:r>
+      <w:r>
+        <w:t xml:space="preserve">(</w:t>
+      </w:r>
+      <w:hyperlink w:anchor="thm-norm-properties">
+        <w:r>
+          <w:rPr>
+            <w:rStyle w:val="Hyperlink"/>
+          </w:rPr>
+          <w:t xml:space="preserve">Theorem 1</w:t>
+        </w:r>
+      </w:hyperlink>
+      <w:r>
+        <w:t xml:space="preserve">),</w:t>
+      </w:r>
+      <w:r>
+        <w:t xml:space="preserve"> </w:t>
+      </w:r>
+      <m:oMath>
+        <m:r>
+          <m:rPr>
+            <m:sty m:val="p"/>
+          </m:rPr>
+          <m:t>cos</m:t>
+        </m:r>
+        <m:r>
+          <m:t>θ</m:t>
+        </m:r>
+        <m:r>
+          <m:rPr>
+            <m:sty m:val="p"/>
+          </m:rPr>
+          <m:t>=</m:t>
+        </m:r>
+        <m:r>
+          <m:t>0</m:t>
+        </m:r>
+      </m:oMath>
+      <w:r>
+        <w:t xml:space="preserve"> </w:t>
+      </w:r>
+      <w:r>
+        <w:t xml:space="preserve">exactly when</w:t>
+      </w:r>
+      <w:r>
+        <w:t xml:space="preserve"> </w:t>
+      </w:r>
+      <m:oMath>
+        <m:acc>
+          <m:accPr>
+            <m:chr m:val="̃"/>
+          </m:accPr>
+          <m:e>
+            <m:r>
+              <m:t>x</m:t>
+            </m:r>
+          </m:e>
+        </m:acc>
+        <m:r>
+          <m:rPr>
+            <m:sty m:val="p"/>
+          </m:rPr>
+          <m:t>⋅</m:t>
+        </m:r>
+        <m:acc>
+          <m:accPr>
+            <m:chr m:val="̃"/>
+          </m:accPr>
+          <m:e>
+            <m:r>
+              <m:t>y</m:t>
+            </m:r>
+          </m:e>
+        </m:acc>
+        <m:r>
+          <m:rPr>
+            <m:sty m:val="p"/>
+          </m:rPr>
+          <m:t>=</m:t>
+        </m:r>
+        <m:r>
+          <m:t>0</m:t>
+        </m:r>
+      </m:oMath>
+      <w:r>
+        <w:t xml:space="preserve">.</w:t>
+      </w:r>
+      <w:r>
+        <w:t xml:space="preserve"> </w:t>
+      </w:r>
+      <w:r>
+        <w:t xml:space="preserve">On</w:t>
+      </w:r>
+      <w:r>
+        <w:t xml:space="preserve"> </w:t>
+      </w:r>
+      <m:oMath>
+        <m:r>
+          <m:rPr>
+            <m:sty m:val="p"/>
+          </m:rPr>
+          <m:t>[</m:t>
+        </m:r>
+        <m:r>
+          <m:t>0</m:t>
+        </m:r>
+        <m:r>
+          <m:rPr>
+            <m:sty m:val="p"/>
+          </m:rPr>
+          <m:t>,</m:t>
+        </m:r>
+        <m:r>
+          <m:t>π</m:t>
+        </m:r>
+        <m:r>
+          <m:rPr>
+            <m:sty m:val="p"/>
+          </m:rPr>
+          <m:t>]</m:t>
+        </m:r>
+      </m:oMath>
+      <w:r>
+        <w:t xml:space="preserve">,</w:t>
+      </w:r>
+      <w:r>
+        <w:t xml:space="preserve"> </w:t>
+      </w:r>
+      <m:oMath>
+        <m:r>
+          <m:rPr>
+            <m:sty m:val="p"/>
+          </m:rPr>
+          <m:t>cos</m:t>
+        </m:r>
+      </m:oMath>
+      <w:r>
+        <w:t xml:space="preserve"> </w:t>
+      </w:r>
+      <w:r>
+        <w:t xml:space="preserve">vanishes only at</w:t>
+      </w:r>
+      <w:r>
+        <w:t xml:space="preserve"> </w:t>
+      </w:r>
+      <m:oMath>
+        <m:r>
+          <m:t>π</m:t>
+        </m:r>
+        <m:r>
+          <m:rPr>
+            <m:sty m:val="p"/>
+          </m:rPr>
+          <m:t>/</m:t>
+        </m:r>
+        <m:r>
+          <m:t>2</m:t>
+        </m:r>
+      </m:oMath>
+      <w:r>
+        <w:t xml:space="preserve">.</w:t>
+      </w:r>
+    </w:p>
+    <w:bookmarkStart w:id="55" w:name="exm-angle"/>
+    <w:p>
+      <w:pPr>
+        <w:pStyle w:val="BodyText"/>
+      </w:pPr>
+      <w:r>
+        <w:rPr>
           <w:b/>
           <w:bCs/>
         </w:rPr>
-        <w:t xml:space="preserve">Example 14 (Some angles in the plane)</w:t>
+        <w:t xml:space="preserve">Example 13 (Some angles in the plane)</w:t>
       </w:r>
       <w:r>
         <w:t xml:space="preserve"> </w:t>
@@ -34746,7 +33752,7 @@
       <w:pPr>
         <w:numPr>
           <w:ilvl w:val="0"/>
-          <w:numId w:val="1017"/>
+          <w:numId w:val="1016"/>
         </w:numPr>
       </w:pPr>
       <m:oMath>
@@ -34902,7 +33908,7 @@
       <w:pPr>
         <w:numPr>
           <w:ilvl w:val="0"/>
-          <w:numId w:val="1017"/>
+          <w:numId w:val="1016"/>
         </w:numPr>
       </w:pPr>
       <m:oMath>
@@ -35126,7 +34132,7 @@
       <w:pPr>
         <w:numPr>
           <w:ilvl w:val="0"/>
-          <w:numId w:val="1017"/>
+          <w:numId w:val="1016"/>
         </w:numPr>
       </w:pPr>
       <m:oMath>
@@ -35325,7 +34331,7 @@
       <w:pPr>
         <w:numPr>
           <w:ilvl w:val="0"/>
-          <w:numId w:val="1017"/>
+          <w:numId w:val="1016"/>
         </w:numPr>
       </w:pPr>
       <m:oMath>
@@ -35428,8 +34434,8 @@
         <w:t xml:space="preserve">.</w:t>
       </w:r>
     </w:p>
-    <w:bookmarkEnd w:id="54"/>
-    <w:bookmarkStart w:id="55" w:name="def-cosine-similarity"/>
+    <w:bookmarkEnd w:id="55"/>
+    <w:bookmarkStart w:id="56" w:name="def-cosine-similarity"/>
     <w:p>
       <w:pPr>
         <w:pStyle w:val="FirstParagraph"/>
@@ -35439,7 +34445,7 @@
           <w:b/>
           <w:bCs/>
         </w:rPr>
-        <w:t xml:space="preserve">Definition 9 (Cosine similarity)</w:t>
+        <w:t xml:space="preserve">Definition 8 (Cosine similarity)</w:t>
       </w:r>
       <w:r>
         <w:t xml:space="preserve"> </w:t>
@@ -35700,8 +34706,8 @@
         </m:oMath>
       </m:oMathPara>
     </w:p>
-    <w:bookmarkEnd w:id="55"/>
-    <w:bookmarkStart w:id="56" w:name="exm-cosine-similarity"/>
+    <w:bookmarkEnd w:id="56"/>
+    <w:bookmarkStart w:id="57" w:name="exm-cosine-similarity"/>
     <w:p>
       <w:pPr>
         <w:pStyle w:val="FirstParagraph"/>
@@ -35711,7 +34717,7 @@
           <w:b/>
           <w:bCs/>
         </w:rPr>
-        <w:t xml:space="preserve">Example 15 (Cosine similarity of parallel, orthogonal, and arbitrary vectors)</w:t>
+        <w:t xml:space="preserve">Example 14 (Cosine similarity of parallel, orthogonal, and arbitrary vectors)</w:t>
       </w:r>
       <w:r>
         <w:t xml:space="preserve"> </w:t>
@@ -35748,7 +34754,7 @@
       <w:pPr>
         <w:numPr>
           <w:ilvl w:val="0"/>
-          <w:numId w:val="1018"/>
+          <w:numId w:val="1017"/>
         </w:numPr>
       </w:pPr>
       <w:r>
@@ -36019,7 +35025,7 @@
       <w:pPr>
         <w:numPr>
           <w:ilvl w:val="0"/>
-          <w:numId w:val="1018"/>
+          <w:numId w:val="1017"/>
         </w:numPr>
       </w:pPr>
       <w:r>
@@ -36302,7 +35308,7 @@
       <w:pPr>
         <w:numPr>
           <w:ilvl w:val="0"/>
-          <w:numId w:val="1018"/>
+          <w:numId w:val="1017"/>
         </w:numPr>
       </w:pPr>
       <w:r>
@@ -36770,8 +35776,8 @@
         <w:t xml:space="preserve">.</w:t>
       </w:r>
     </w:p>
-    <w:bookmarkEnd w:id="56"/>
-    <w:bookmarkStart w:id="57" w:name="cor-cosine-similarity-angle"/>
+    <w:bookmarkEnd w:id="57"/>
+    <w:bookmarkStart w:id="58" w:name="cor-cosine-similarity-angle"/>
     <w:p>
       <w:pPr>
         <w:pStyle w:val="BodyText"/>
@@ -36781,7 +35787,7 @@
           <w:b/>
           <w:bCs/>
         </w:rPr>
-        <w:t xml:space="preserve">Corollary 1 (Cosine similarity is the cosine of the angle)</w:t>
+        <w:t xml:space="preserve">Corollary 2 (Cosine similarity is the cosine of the angle)</w:t>
       </w:r>
       <w:r>
         <w:t xml:space="preserve"> </w:t>
@@ -36867,7 +35873,7 @@
           <w:rPr>
             <w:rStyle w:val="Hyperlink"/>
           </w:rPr>
-          <w:t xml:space="preserve">Definition 8</w:t>
+          <w:t xml:space="preserve">Definition 7</w:t>
         </w:r>
       </w:hyperlink>
       <w:r>
@@ -36951,7 +35957,7 @@
         </m:oMath>
       </m:oMathPara>
     </w:p>
-    <w:bookmarkEnd w:id="57"/>
+    <w:bookmarkEnd w:id="58"/>
     <w:p>
       <w:pPr>
         <w:pStyle w:val="FirstParagraph"/>
@@ -36973,6 +35979,43 @@
         <w:t xml:space="preserve"> </w:t>
       </w:r>
       <w:hyperlink w:anchor="def-angle">
+        <w:r>
+          <w:rPr>
+            <w:rStyle w:val="Hyperlink"/>
+          </w:rPr>
+          <w:t xml:space="preserve">Definition 7</w:t>
+        </w:r>
+      </w:hyperlink>
+      <w:r>
+        <w:t xml:space="preserve"> </w:t>
+      </w:r>
+      <w:r>
+        <w:t xml:space="preserve">sets equal to</w:t>
+      </w:r>
+      <w:r>
+        <w:t xml:space="preserve"> </w:t>
+      </w:r>
+      <m:oMath>
+        <m:r>
+          <m:rPr>
+            <m:sty m:val="p"/>
+          </m:rPr>
+          <m:t>cos</m:t>
+        </m:r>
+        <m:r>
+          <m:t>θ</m:t>
+        </m:r>
+      </m:oMath>
+      <w:r>
+        <w:t xml:space="preserve"> </w:t>
+      </w:r>
+      <w:r>
+        <w:t xml:space="preserve">is the ratio that</w:t>
+      </w:r>
+      <w:r>
+        <w:t xml:space="preserve"> </w:t>
+      </w:r>
+      <w:hyperlink w:anchor="def-cosine-similarity">
         <w:r>
           <w:rPr>
             <w:rStyle w:val="Hyperlink"/>
@@ -36984,43 +36027,6 @@
         <w:t xml:space="preserve"> </w:t>
       </w:r>
       <w:r>
-        <w:t xml:space="preserve">sets equal to</w:t>
-      </w:r>
-      <w:r>
-        <w:t xml:space="preserve"> </w:t>
-      </w:r>
-      <m:oMath>
-        <m:r>
-          <m:rPr>
-            <m:sty m:val="p"/>
-          </m:rPr>
-          <m:t>cos</m:t>
-        </m:r>
-        <m:r>
-          <m:t>θ</m:t>
-        </m:r>
-      </m:oMath>
-      <w:r>
-        <w:t xml:space="preserve"> </w:t>
-      </w:r>
-      <w:r>
-        <w:t xml:space="preserve">is the ratio that</w:t>
-      </w:r>
-      <w:r>
-        <w:t xml:space="preserve"> </w:t>
-      </w:r>
-      <w:hyperlink w:anchor="def-cosine-similarity">
-        <w:r>
-          <w:rPr>
-            <w:rStyle w:val="Hyperlink"/>
-          </w:rPr>
-          <w:t xml:space="preserve">Definition 9</w:t>
-        </w:r>
-      </w:hyperlink>
-      <w:r>
-        <w:t xml:space="preserve"> </w:t>
-      </w:r>
-      <w:r>
         <w:t xml:space="preserve">defines as</w:t>
       </w:r>
       <w:r>
@@ -37076,7 +36082,7 @@
         <w:t xml:space="preserve">.</w:t>
       </w:r>
     </w:p>
-    <w:bookmarkStart w:id="58" w:name="X64c41f557e7f698c947bb0d906d626137043d1e"/>
+    <w:bookmarkStart w:id="59" w:name="X64c41f557e7f698c947bb0d906d626137043d1e"/>
     <w:p>
       <w:pPr>
         <w:pStyle w:val="BodyText"/>
@@ -37086,7 +36092,7 @@
           <w:b/>
           <w:bCs/>
         </w:rPr>
-        <w:t xml:space="preserve">Definition 10 (Cosine similarity in an inner product space)</w:t>
+        <w:t xml:space="preserve">Definition 9 (Cosine similarity in an inner product space)</w:t>
       </w:r>
       <w:r>
         <w:t xml:space="preserve"> </w:t>
@@ -37372,8 +36378,8 @@
         </m:oMath>
       </m:oMathPara>
     </w:p>
-    <w:bookmarkEnd w:id="58"/>
-    <w:bookmarkStart w:id="60" w:name="thm-pearson-cosine-centered"/>
+    <w:bookmarkEnd w:id="59"/>
+    <w:bookmarkStart w:id="61" w:name="thm-pearson-cosine-centered"/>
     <w:p>
       <w:pPr>
         <w:pStyle w:val="FirstParagraph"/>
@@ -37796,7 +36802,7 @@
       <w:r>
         <w:t xml:space="preserve"> </w:t>
       </w:r>
-      <w:hyperlink r:id="rId59">
+      <w:hyperlink r:id="rId60">
         <w:r>
           <w:rPr>
             <w:rStyle w:val="Hyperlink"/>
@@ -37890,7 +36896,7 @@
           <w:rPr>
             <w:rStyle w:val="Hyperlink"/>
           </w:rPr>
-          <w:t xml:space="preserve">Definition 9</w:t>
+          <w:t xml:space="preserve">Definition 8</w:t>
         </w:r>
       </w:hyperlink>
       <w:r>
@@ -37982,7 +36988,7 @@
         </m:oMath>
       </m:oMathPara>
     </w:p>
-    <w:bookmarkEnd w:id="60"/>
+    <w:bookmarkEnd w:id="61"/>
     <w:p>
       <w:pPr>
         <w:pStyle w:val="FirstParagraph"/>
@@ -38688,7 +37694,7 @@
         <w:t xml:space="preserve">.</w:t>
       </w:r>
     </w:p>
-    <w:bookmarkStart w:id="61" w:name="exm-pearson-cosine-centered"/>
+    <w:bookmarkStart w:id="62" w:name="exm-pearson-cosine-centered"/>
     <w:p>
       <w:pPr>
         <w:pStyle w:val="BodyText"/>
@@ -38698,7 +37704,7 @@
           <w:b/>
           <w:bCs/>
         </w:rPr>
-        <w:t xml:space="preserve">Example 16 (Centering changes the cosine similarity)</w:t>
+        <w:t xml:space="preserve">Example 15 (Centering changes the cosine similarity)</w:t>
       </w:r>
       <w:r>
         <w:t xml:space="preserve"> </w:t>
@@ -39584,9 +38590,9 @@
         <w:t xml:space="preserve">mostly because both vectors have positive entries and the same mean, not because they move together.</w:t>
       </w:r>
     </w:p>
-    <w:bookmarkEnd w:id="61"/>
     <w:bookmarkEnd w:id="62"/>
-    <w:bookmarkStart w:id="94" w:name="sec-gram-schmidt"/>
+    <w:bookmarkEnd w:id="63"/>
+    <w:bookmarkStart w:id="95" w:name="sec-gram-schmidt"/>
     <w:p>
       <w:pPr>
         <w:pStyle w:val="Heading2"/>
@@ -39636,12 +38642,12 @@
                 <wp:inline>
                   <wp:extent cx="152400" cy="152400"/>
                   <wp:effectExtent b="0" l="0" r="0" t="0"/>
-                  <wp:docPr descr="" title="" id="63" name="Picture"/>
+                  <wp:docPr descr="" title="" id="64" name="Picture"/>
                   <a:graphic>
                     <a:graphicData uri="http://schemas.openxmlformats.org/drawingml/2006/picture">
                       <pic:pic>
                         <pic:nvPicPr>
-                          <pic:cNvPr descr="/opt/quarto/share/formats/docx/note.png" id="64" name="Picture"/>
+                          <pic:cNvPr descr="/opt/quarto/share/formats/docx/note.png" id="65" name="Picture"/>
                           <pic:cNvPicPr>
                             <a:picLocks noChangeArrowheads="1" noChangeAspect="1"/>
                           </pic:cNvPicPr>
@@ -39772,7 +38778,7 @@
         </w:tc>
       </w:tr>
     </w:tbl>
-    <w:bookmarkStart w:id="65" w:name="thm-dot-linear-sum"/>
+    <w:bookmarkStart w:id="66" w:name="thm-dot-linear-sum"/>
     <w:p>
       <w:pPr>
         <w:pStyle w:val="BodyText"/>
@@ -40173,7 +39179,7 @@
         </m:oMath>
       </m:oMathPara>
     </w:p>
-    <w:bookmarkEnd w:id="65"/>
+    <w:bookmarkEnd w:id="66"/>
     <w:p>
       <w:pPr>
         <w:pStyle w:val="FirstParagraph"/>
@@ -41171,7 +40177,7 @@
         </m:oMath>
       </m:oMathPara>
     </w:p>
-    <w:bookmarkStart w:id="66" w:name="exm-dot-linear-sum"/>
+    <w:bookmarkStart w:id="67" w:name="exm-dot-linear-sum"/>
     <w:p>
       <w:pPr>
         <w:pStyle w:val="FirstParagraph"/>
@@ -41181,7 +40187,7 @@
           <w:b/>
           <w:bCs/>
         </w:rPr>
-        <w:t xml:space="preserve">Example 17 (Dotting with a combination of three vectors)</w:t>
+        <w:t xml:space="preserve">Example 16 (Dotting with a combination of three vectors)</w:t>
       </w:r>
       <w:r>
         <w:t xml:space="preserve"> </w:t>
@@ -41640,8 +40646,8 @@
         <w:t xml:space="preserve">, the same number.</w:t>
       </w:r>
     </w:p>
-    <w:bookmarkEnd w:id="66"/>
-    <w:bookmarkStart w:id="68" w:name="thm-orthonormal-independent"/>
+    <w:bookmarkEnd w:id="67"/>
+    <w:bookmarkStart w:id="69" w:name="thm-orthonormal-independent"/>
     <w:p>
       <w:pPr>
         <w:pStyle w:val="BodyText"/>
@@ -41726,7 +40732,7 @@
       <w:r>
         <w:t xml:space="preserve">are orthonormal (</w:t>
       </w:r>
-      <w:hyperlink r:id="rId67">
+      <w:hyperlink r:id="rId68">
         <w:r>
           <w:rPr>
             <w:rStyle w:val="Hyperlink"/>
@@ -41755,7 +40761,7 @@
         <w:t xml:space="preserve">).</w:t>
       </w:r>
     </w:p>
-    <w:bookmarkEnd w:id="68"/>
+    <w:bookmarkEnd w:id="69"/>
     <w:p>
       <w:pPr>
         <w:pStyle w:val="BodyText"/>
@@ -42421,7 +41427,7 @@
         <w:t xml:space="preserve">.</w:t>
       </w:r>
     </w:p>
-    <w:bookmarkStart w:id="69" w:name="exm-orthonormal-independent"/>
+    <w:bookmarkStart w:id="70" w:name="exm-orthonormal-independent"/>
     <w:p>
       <w:pPr>
         <w:pStyle w:val="BodyText"/>
@@ -42431,7 +41437,7 @@
           <w:b/>
           <w:bCs/>
         </w:rPr>
-        <w:t xml:space="preserve">Example 18 (Three orthonormal vectors in</w:t>
+        <w:t xml:space="preserve">Example 17 (Three orthonormal vectors in</w:t>
       </w:r>
       <w:r>
         <w:rPr>
@@ -43798,8 +42804,8 @@
         <w:t xml:space="preserve">.</w:t>
       </w:r>
     </w:p>
-    <w:bookmarkEnd w:id="69"/>
-    <w:bookmarkStart w:id="71" w:name="def-orthonormal-basis"/>
+    <w:bookmarkEnd w:id="70"/>
+    <w:bookmarkStart w:id="72" w:name="def-orthonormal-basis"/>
     <w:p>
       <w:pPr>
         <w:pStyle w:val="BodyText"/>
@@ -43809,7 +42815,7 @@
           <w:b/>
           <w:bCs/>
         </w:rPr>
-        <w:t xml:space="preserve">Definition 11 (Orthonormal basis)</w:t>
+        <w:t xml:space="preserve">Definition 10 (Orthonormal basis)</w:t>
       </w:r>
       <w:r>
         <w:t xml:space="preserve"> </w:t>
@@ -43896,7 +42902,7 @@
       <w:r>
         <w:t xml:space="preserve">(</w:t>
       </w:r>
-      <w:hyperlink r:id="rId70">
+      <w:hyperlink r:id="rId71">
         <w:r>
           <w:rPr>
             <w:rStyle w:val="Hyperlink"/>
@@ -43913,7 +42919,7 @@
       <w:r>
         <w:t xml:space="preserve">whose vectors are orthonormal (</w:t>
       </w:r>
-      <w:hyperlink r:id="rId67">
+      <w:hyperlink r:id="rId68">
         <w:r>
           <w:rPr>
             <w:rStyle w:val="Hyperlink"/>
@@ -43925,8 +42931,8 @@
         <w:t xml:space="preserve">).</w:t>
       </w:r>
     </w:p>
-    <w:bookmarkEnd w:id="71"/>
-    <w:bookmarkStart w:id="75" w:name="exm-orthonormal-basis"/>
+    <w:bookmarkEnd w:id="72"/>
+    <w:bookmarkStart w:id="76" w:name="exm-orthonormal-basis"/>
     <w:p>
       <w:pPr>
         <w:pStyle w:val="BodyText"/>
@@ -43936,7 +42942,7 @@
           <w:b/>
           <w:bCs/>
         </w:rPr>
-        <w:t xml:space="preserve">Example 19 (Orthonormal bases of</w:t>
+        <w:t xml:space="preserve">Example 18 (Orthonormal bases of</w:t>
       </w:r>
       <w:r>
         <w:rPr>
@@ -43982,7 +42988,7 @@
         <w:pStyle w:val="Compact"/>
         <w:numPr>
           <w:ilvl w:val="0"/>
-          <w:numId w:val="1019"/>
+          <w:numId w:val="1018"/>
         </w:numPr>
       </w:pPr>
       <w:r>
@@ -44107,7 +43113,7 @@
       <w:r>
         <w:t xml:space="preserve">(</w:t>
       </w:r>
-      <w:hyperlink r:id="rId72">
+      <w:hyperlink r:id="rId73">
         <w:r>
           <w:rPr>
             <w:rStyle w:val="Hyperlink"/>
@@ -44124,7 +43130,7 @@
         <w:pStyle w:val="Compact"/>
         <w:numPr>
           <w:ilvl w:val="0"/>
-          <w:numId w:val="1019"/>
+          <w:numId w:val="1018"/>
         </w:numPr>
       </w:pPr>
       <w:r>
@@ -44218,7 +43224,7 @@
           <w:rPr>
             <w:rStyle w:val="Hyperlink"/>
           </w:rPr>
-          <w:t xml:space="preserve">Example 18</w:t>
+          <w:t xml:space="preserve">Example 17</w:t>
         </w:r>
       </w:hyperlink>
       <w:r>
@@ -44233,7 +43239,7 @@
       <w:r>
         <w:t xml:space="preserve">so they are a basis of their span (</w:t>
       </w:r>
-      <w:hyperlink r:id="rId70">
+      <w:hyperlink r:id="rId71">
         <w:r>
           <w:rPr>
             <w:rStyle w:val="Hyperlink"/>
@@ -44264,7 +43270,7 @@
       <w:r>
         <w:t xml:space="preserve">(</w:t>
       </w:r>
-      <w:hyperlink r:id="rId73">
+      <w:hyperlink r:id="rId74">
         <w:r>
           <w:rPr>
             <w:rStyle w:val="Hyperlink"/>
@@ -44308,7 +43314,7 @@
       <w:r>
         <w:t xml:space="preserve">(</w:t>
       </w:r>
-      <w:hyperlink r:id="rId74">
+      <w:hyperlink r:id="rId75">
         <w:r>
           <w:rPr>
             <w:rStyle w:val="Hyperlink"/>
@@ -44322,7 +43328,7 @@
       <w:r>
         <w:t xml:space="preserve"> </w:t>
       </w:r>
-      <w:hyperlink r:id="rId72">
+      <w:hyperlink r:id="rId73">
         <w:r>
           <w:rPr>
             <w:rStyle w:val="Hyperlink"/>
@@ -44367,8 +43373,8 @@
         <w:t xml:space="preserve">too.</w:t>
       </w:r>
     </w:p>
-    <w:bookmarkEnd w:id="75"/>
-    <w:bookmarkStart w:id="78" w:name="exm-not-orthonormal-basis"/>
+    <w:bookmarkEnd w:id="76"/>
+    <w:bookmarkStart w:id="79" w:name="exm-not-orthonormal-basis"/>
     <w:p>
       <w:pPr>
         <w:pStyle w:val="FirstParagraph"/>
@@ -44378,7 +43384,7 @@
           <w:b/>
           <w:bCs/>
         </w:rPr>
-        <w:t xml:space="preserve">Example 20 (Bases that are not orthonormal, and orthonormal lists that are not bases)</w:t>
+        <w:t xml:space="preserve">Example 19 (Bases that are not orthonormal, and orthonormal lists that are not bases)</w:t>
       </w:r>
       <w:r>
         <w:t xml:space="preserve"> </w:t>
@@ -44392,7 +43398,7 @@
         <w:pStyle w:val="Compact"/>
         <w:numPr>
           <w:ilvl w:val="0"/>
-          <w:numId w:val="1020"/>
+          <w:numId w:val="1019"/>
         </w:numPr>
       </w:pPr>
       <m:oMath>
@@ -44484,7 +43490,7 @@
       <w:r>
         <w:t xml:space="preserve">(</w:t>
       </w:r>
-      <w:hyperlink r:id="rId76">
+      <w:hyperlink r:id="rId77">
         <w:r>
           <w:rPr>
             <w:rStyle w:val="Hyperlink"/>
@@ -44578,7 +43584,7 @@
         <w:pStyle w:val="Compact"/>
         <w:numPr>
           <w:ilvl w:val="0"/>
-          <w:numId w:val="1020"/>
+          <w:numId w:val="1019"/>
         </w:numPr>
       </w:pPr>
       <m:oMath>
@@ -44714,7 +43720,7 @@
       <w:r>
         <w:t xml:space="preserve">(</w:t>
       </w:r>
-      <w:hyperlink r:id="rId77">
+      <w:hyperlink r:id="rId78">
         <w:r>
           <w:rPr>
             <w:rStyle w:val="Hyperlink"/>
@@ -44773,8 +43779,8 @@
         <w:t xml:space="preserve">.</w:t>
       </w:r>
     </w:p>
-    <w:bookmarkEnd w:id="78"/>
-    <w:bookmarkStart w:id="79" w:name="thm-orthonormal-expansion"/>
+    <w:bookmarkEnd w:id="79"/>
+    <w:bookmarkStart w:id="80" w:name="thm-orthonormal-expansion"/>
     <w:p>
       <w:pPr>
         <w:pStyle w:val="FirstParagraph"/>
@@ -44882,7 +43888,7 @@
           <w:rPr>
             <w:rStyle w:val="Hyperlink"/>
           </w:rPr>
-          <w:t xml:space="preserve">Definition 11</w:t>
+          <w:t xml:space="preserve">Definition 10</w:t>
         </w:r>
       </w:hyperlink>
       <w:r>
@@ -45055,7 +44061,7 @@
         </m:oMath>
       </m:oMathPara>
     </w:p>
-    <w:bookmarkEnd w:id="79"/>
+    <w:bookmarkEnd w:id="80"/>
     <w:p>
       <w:pPr>
         <w:pStyle w:val="FirstParagraph"/>
@@ -45661,7 +44667,7 @@
         <w:t xml:space="preserve">.</w:t>
       </w:r>
     </w:p>
-    <w:bookmarkStart w:id="80" w:name="exm-orthonormal-expansion"/>
+    <w:bookmarkStart w:id="81" w:name="exm-orthonormal-expansion"/>
     <w:p>
       <w:pPr>
         <w:pStyle w:val="BodyText"/>
@@ -45671,7 +44677,7 @@
           <w:b/>
           <w:bCs/>
         </w:rPr>
-        <w:t xml:space="preserve">Example 21 (Expanding a vector in an orthonormal basis)</w:t>
+        <w:t xml:space="preserve">Example 20 (Expanding a vector in an orthonormal basis)</w:t>
       </w:r>
       <w:r>
         <w:t xml:space="preserve"> </w:t>
@@ -45794,7 +44800,7 @@
           <w:rPr>
             <w:rStyle w:val="Hyperlink"/>
           </w:rPr>
-          <w:t xml:space="preserve">Example 19</w:t>
+          <w:t xml:space="preserve">Example 18</w:t>
         </w:r>
       </w:hyperlink>
       <w:r>
@@ -46901,8 +45907,8 @@
         <w:t xml:space="preserve">says.</w:t>
       </w:r>
     </w:p>
-    <w:bookmarkEnd w:id="80"/>
-    <w:bookmarkStart w:id="81" w:name="def-gram-schmidt"/>
+    <w:bookmarkEnd w:id="81"/>
+    <w:bookmarkStart w:id="82" w:name="def-gram-schmidt"/>
     <w:p>
       <w:pPr>
         <w:pStyle w:val="BodyText"/>
@@ -46912,7 +45918,7 @@
           <w:b/>
           <w:bCs/>
         </w:rPr>
-        <w:t xml:space="preserve">Definition 12 (Gram-Schmidt process)</w:t>
+        <w:t xml:space="preserve">Definition 11 (Gram-Schmidt process)</w:t>
       </w:r>
       <w:r>
         <w:t xml:space="preserve"> </w:t>
@@ -47084,7 +46090,7 @@
         <w:pStyle w:val="Compact"/>
         <w:numPr>
           <w:ilvl w:val="0"/>
-          <w:numId w:val="1021"/>
+          <w:numId w:val="1020"/>
         </w:numPr>
       </w:pPr>
       <w:r>
@@ -47379,7 +46385,7 @@
         <w:pStyle w:val="Compact"/>
         <w:numPr>
           <w:ilvl w:val="0"/>
-          <w:numId w:val="1021"/>
+          <w:numId w:val="1020"/>
         </w:numPr>
       </w:pPr>
       <w:r>
@@ -47451,7 +46457,7 @@
         <w:pStyle w:val="Compact"/>
         <w:numPr>
           <w:ilvl w:val="0"/>
-          <w:numId w:val="1021"/>
+          <w:numId w:val="1020"/>
         </w:numPr>
       </w:pPr>
       <w:r>
@@ -47677,8 +46683,8 @@
         <w:t xml:space="preserve">of them if it never stops.</w:t>
       </w:r>
     </w:p>
-    <w:bookmarkEnd w:id="81"/>
-    <w:bookmarkStart w:id="82" w:name="exm-gram-schmidt"/>
+    <w:bookmarkEnd w:id="82"/>
+    <w:bookmarkStart w:id="83" w:name="exm-gram-schmidt"/>
     <w:p>
       <w:pPr>
         <w:pStyle w:val="BodyText"/>
@@ -47688,7 +46694,7 @@
           <w:b/>
           <w:bCs/>
         </w:rPr>
-        <w:t xml:space="preserve">Example 22 (Two steps of Gram-Schmidt in</w:t>
+        <w:t xml:space="preserve">Example 21 (Two steps of Gram-Schmidt in</w:t>
       </w:r>
       <w:r>
         <w:rPr>
@@ -47868,7 +46874,7 @@
       <w:pPr>
         <w:numPr>
           <w:ilvl w:val="0"/>
-          <w:numId w:val="1022"/>
+          <w:numId w:val="1021"/>
         </w:numPr>
       </w:pPr>
       <w:r>
@@ -48073,7 +47079,7 @@
       <w:pPr>
         <w:numPr>
           <w:ilvl w:val="0"/>
-          <w:numId w:val="1022"/>
+          <w:numId w:val="1021"/>
         </w:numPr>
       </w:pPr>
       <w:r>
@@ -49157,8 +48163,8 @@
         </m:oMath>
       </m:oMathPara>
     </w:p>
-    <w:bookmarkEnd w:id="82"/>
-    <w:bookmarkStart w:id="83" w:name="exm-gram-schmidt-stops"/>
+    <w:bookmarkEnd w:id="83"/>
+    <w:bookmarkStart w:id="84" w:name="exm-gram-schmidt-stops"/>
     <w:p>
       <w:pPr>
         <w:pStyle w:val="FirstParagraph"/>
@@ -49168,7 +48174,7 @@
           <w:b/>
           <w:bCs/>
         </w:rPr>
-        <w:t xml:space="preserve">Example 23 (Gram-Schmidt stops on dependent vectors)</w:t>
+        <w:t xml:space="preserve">Example 22 (Gram-Schmidt stops on dependent vectors)</w:t>
       </w:r>
       <w:r>
         <w:t xml:space="preserve"> </w:t>
@@ -49879,8 +48885,8 @@
         <w:t xml:space="preserve">.</w:t>
       </w:r>
     </w:p>
-    <w:bookmarkEnd w:id="83"/>
-    <w:bookmarkStart w:id="84" w:name="thm-gram-schmidt"/>
+    <w:bookmarkEnd w:id="84"/>
+    <w:bookmarkStart w:id="85" w:name="thm-gram-schmidt"/>
     <w:p>
       <w:pPr>
         <w:pStyle w:val="BodyText"/>
@@ -49903,7 +48909,7 @@
           <w:rPr>
             <w:rStyle w:val="Hyperlink"/>
           </w:rPr>
-          <w:t xml:space="preserve">Definition 12</w:t>
+          <w:t xml:space="preserve">Definition 11</w:t>
         </w:r>
       </w:hyperlink>
       <w:r>
@@ -50001,7 +49007,7 @@
         <w:pStyle w:val="Compact"/>
         <w:numPr>
           <w:ilvl w:val="0"/>
-          <w:numId w:val="1023"/>
+          <w:numId w:val="1022"/>
         </w:numPr>
       </w:pPr>
       <w:r>
@@ -50329,7 +49335,7 @@
         <w:pStyle w:val="Compact"/>
         <w:numPr>
           <w:ilvl w:val="0"/>
-          <w:numId w:val="1023"/>
+          <w:numId w:val="1022"/>
         </w:numPr>
       </w:pPr>
       <w:r>
@@ -50528,7 +49534,7 @@
         <w:pStyle w:val="Compact"/>
         <w:numPr>
           <w:ilvl w:val="0"/>
-          <w:numId w:val="1023"/>
+          <w:numId w:val="1022"/>
         </w:numPr>
       </w:pPr>
       <w:r>
@@ -50794,14 +49800,14 @@
           <w:rPr>
             <w:rStyle w:val="Hyperlink"/>
           </w:rPr>
-          <w:t xml:space="preserve">Definition 11</w:t>
+          <w:t xml:space="preserve">Definition 10</w:t>
         </w:r>
       </w:hyperlink>
       <w:r>
         <w:t xml:space="preserve">).</w:t>
       </w:r>
     </w:p>
-    <w:bookmarkEnd w:id="84"/>
+    <w:bookmarkEnd w:id="85"/>
     <w:p>
       <w:pPr>
         <w:pStyle w:val="FirstParagraph"/>
@@ -50830,7 +49836,7 @@
         </w:rPr>
         <w:t xml:space="preserve"> </w:t>
       </w:r>
-      <w:hyperlink r:id="rId85">
+      <w:hyperlink r:id="rId86">
         <w:r>
           <w:rPr>
             <w:rStyle w:val="Hyperlink"/>
@@ -50951,7 +49957,7 @@
       <w:r>
         <w:t xml:space="preserve">(</w:t>
       </w:r>
-      <w:hyperlink r:id="rId86">
+      <w:hyperlink r:id="rId87">
         <w:r>
           <w:rPr>
             <w:rStyle w:val="Hyperlink"/>
@@ -51762,7 +50768,7 @@
                   <m:nor/>
                   <m:sty m:val="p"/>
                 </m:rPr>
-                <m:t>Definition 12</m:t>
+                <m:t>Definition 11</m:t>
               </m:r>
               <m:r>
                 <m:rPr>
@@ -53913,7 +52919,7 @@
         <w:pStyle w:val="Compact"/>
         <w:numPr>
           <w:ilvl w:val="0"/>
-          <w:numId w:val="1024"/>
+          <w:numId w:val="1023"/>
         </w:numPr>
       </w:pPr>
       <m:oMath>
@@ -54507,7 +53513,7 @@
         <w:pStyle w:val="Compact"/>
         <w:numPr>
           <w:ilvl w:val="0"/>
-          <w:numId w:val="1024"/>
+          <w:numId w:val="1023"/>
         </w:numPr>
       </w:pPr>
       <m:oMath>
@@ -55004,7 +54010,7 @@
       <w:r>
         <w:t xml:space="preserve">A span is a subspace (</w:t>
       </w:r>
-      <w:hyperlink r:id="rId87">
+      <w:hyperlink r:id="rId88">
         <w:r>
           <w:rPr>
             <w:rStyle w:val="Hyperlink"/>
@@ -55245,7 +54251,7 @@
       <w:r>
         <w:t xml:space="preserve"> </w:t>
       </w:r>
-      <w:hyperlink r:id="rId88">
+      <w:hyperlink r:id="rId89">
         <w:r>
           <w:rPr>
             <w:rStyle w:val="Hyperlink"/>
@@ -55769,7 +54775,7 @@
         <w:t xml:space="preserve">so they are an orthonormal basis of it.</w:t>
       </w:r>
     </w:p>
-    <w:bookmarkStart w:id="89" w:name="exm-thm-gram-schmidt"/>
+    <w:bookmarkStart w:id="90" w:name="exm-thm-gram-schmidt"/>
     <w:p>
       <w:pPr>
         <w:pStyle w:val="BodyText"/>
@@ -55779,7 +54785,7 @@
           <w:b/>
           <w:bCs/>
         </w:rPr>
-        <w:t xml:space="preserve">Example 24 (Finishing an orthonormal basis of</w:t>
+        <w:t xml:space="preserve">Example 23 (Finishing an orthonormal basis of</w:t>
       </w:r>
       <w:r>
         <w:rPr>
@@ -55827,7 +54833,7 @@
           <w:rPr>
             <w:rStyle w:val="Hyperlink"/>
           </w:rPr>
-          <w:t xml:space="preserve">Example 22</w:t>
+          <w:t xml:space="preserve">Example 21</w:t>
         </w:r>
       </w:hyperlink>
       <w:r>
@@ -57310,7 +56316,7 @@
       <w:r>
         <w:t xml:space="preserve">(</w:t>
       </w:r>
-      <w:hyperlink r:id="rId73">
+      <w:hyperlink r:id="rId74">
         <w:r>
           <w:rPr>
             <w:rStyle w:val="Hyperlink"/>
@@ -57354,7 +56360,7 @@
       <w:r>
         <w:t xml:space="preserve">(</w:t>
       </w:r>
-      <w:hyperlink r:id="rId74">
+      <w:hyperlink r:id="rId75">
         <w:r>
           <w:rPr>
             <w:rStyle w:val="Hyperlink"/>
@@ -57368,7 +56374,7 @@
       <w:r>
         <w:t xml:space="preserve"> </w:t>
       </w:r>
-      <w:hyperlink r:id="rId72">
+      <w:hyperlink r:id="rId73">
         <w:r>
           <w:rPr>
             <w:rStyle w:val="Hyperlink"/>
@@ -57696,8 +56702,8 @@
         </m:oMath>
       </m:oMathPara>
     </w:p>
-    <w:bookmarkEnd w:id="89"/>
-    <w:bookmarkStart w:id="90" w:name="cor-orthonormal-basis-exists"/>
+    <w:bookmarkEnd w:id="90"/>
+    <w:bookmarkStart w:id="91" w:name="cor-orthonormal-basis-exists"/>
     <w:p>
       <w:pPr>
         <w:pStyle w:val="FirstParagraph"/>
@@ -57707,7 +56713,7 @@
           <w:b/>
           <w:bCs/>
         </w:rPr>
-        <w:t xml:space="preserve">Corollary 2 (Every subspace has an orthonormal basis)</w:t>
+        <w:t xml:space="preserve">Corollary 3 (Every subspace has an orthonormal basis)</w:t>
       </w:r>
       <w:r>
         <w:t xml:space="preserve"> </w:t>
@@ -57804,7 +56810,7 @@
           <w:rPr>
             <w:rStyle w:val="Hyperlink"/>
           </w:rPr>
-          <w:t xml:space="preserve">Definition 11</w:t>
+          <w:t xml:space="preserve">Definition 10</w:t>
         </w:r>
       </w:hyperlink>
       <w:r>
@@ -57835,7 +56841,7 @@
         <w:t xml:space="preserve">has an orthonormal basis.</w:t>
       </w:r>
     </w:p>
-    <w:bookmarkEnd w:id="90"/>
+    <w:bookmarkEnd w:id="91"/>
     <w:p>
       <w:pPr>
         <w:pStyle w:val="BodyText"/>
@@ -58112,7 +57118,7 @@
       <w:r>
         <w:t xml:space="preserve">(</w:t>
       </w:r>
-      <w:hyperlink r:id="rId91">
+      <w:hyperlink r:id="rId92">
         <w:r>
           <w:rPr>
             <w:rStyle w:val="Hyperlink"/>
@@ -58268,7 +57274,7 @@
       <w:r>
         <w:t xml:space="preserve"> </w:t>
       </w:r>
-      <w:hyperlink r:id="rId85">
+      <w:hyperlink r:id="rId86">
         <w:r>
           <w:rPr>
             <w:rStyle w:val="Hyperlink"/>
@@ -58997,7 +58003,7 @@
         <w:t xml:space="preserve">So the orthonormal basis contains the starting list.</w:t>
       </w:r>
     </w:p>
-    <w:bookmarkStart w:id="93" w:name="exm-orthonormal-basis-exists"/>
+    <w:bookmarkStart w:id="94" w:name="exm-orthonormal-basis-exists"/>
     <w:p>
       <w:pPr>
         <w:pStyle w:val="BodyText"/>
@@ -59007,7 +58013,7 @@
           <w:b/>
           <w:bCs/>
         </w:rPr>
-        <w:t xml:space="preserve">Example 25 (Extending one unit vector to an orthonormal basis of</w:t>
+        <w:t xml:space="preserve">Example 24 (Extending one unit vector to an orthonormal basis of</w:t>
       </w:r>
       <w:r>
         <w:rPr>
@@ -59175,7 +58181,7 @@
       <w:r>
         <w:t xml:space="preserve"> </w:t>
       </w:r>
-      <w:hyperlink r:id="rId92">
+      <w:hyperlink r:id="rId93">
         <w:r>
           <w:rPr>
             <w:rStyle w:val="Hyperlink"/>
@@ -59706,7 +58712,7 @@
       <w:r>
         <w:t xml:space="preserve">are linearly independent (</w:t>
       </w:r>
-      <w:hyperlink r:id="rId88">
+      <w:hyperlink r:id="rId89">
         <w:r>
           <w:rPr>
             <w:rStyle w:val="Hyperlink"/>
@@ -59770,7 +58776,7 @@
       <w:r>
         <w:t xml:space="preserve">(</w:t>
       </w:r>
-      <w:hyperlink r:id="rId73">
+      <w:hyperlink r:id="rId74">
         <w:r>
           <w:rPr>
             <w:rStyle w:val="Hyperlink"/>
@@ -59814,7 +58820,7 @@
       <w:r>
         <w:t xml:space="preserve">(</w:t>
       </w:r>
-      <w:hyperlink r:id="rId74">
+      <w:hyperlink r:id="rId75">
         <w:r>
           <w:rPr>
             <w:rStyle w:val="Hyperlink"/>
@@ -59828,7 +58834,7 @@
       <w:r>
         <w:t xml:space="preserve"> </w:t>
       </w:r>
-      <w:hyperlink r:id="rId72">
+      <w:hyperlink r:id="rId73">
         <w:r>
           <w:rPr>
             <w:rStyle w:val="Hyperlink"/>
@@ -59955,7 +58961,7 @@
       <w:pPr>
         <w:numPr>
           <w:ilvl w:val="0"/>
-          <w:numId w:val="1025"/>
+          <w:numId w:val="1024"/>
         </w:numPr>
       </w:pPr>
       <m:oMath>
@@ -60012,7 +59018,7 @@
       <w:pPr>
         <w:numPr>
           <w:ilvl w:val="0"/>
-          <w:numId w:val="1025"/>
+          <w:numId w:val="1024"/>
         </w:numPr>
       </w:pPr>
       <m:oMath>
@@ -60477,7 +59483,7 @@
       <w:pPr>
         <w:numPr>
           <w:ilvl w:val="0"/>
-          <w:numId w:val="1025"/>
+          <w:numId w:val="1024"/>
         </w:numPr>
       </w:pPr>
       <m:oMath>
@@ -60744,16 +59750,16 @@
           <w:rPr>
             <w:rStyle w:val="Hyperlink"/>
           </w:rPr>
-          <w:t xml:space="preserve">Example 19</w:t>
+          <w:t xml:space="preserve">Example 18</w:t>
         </w:r>
       </w:hyperlink>
       <w:r>
         <w:t xml:space="preserve">, in a different order.</w:t>
       </w:r>
     </w:p>
-    <w:bookmarkEnd w:id="93"/>
     <w:bookmarkEnd w:id="94"/>
-    <w:bookmarkStart w:id="110" w:name="outer-product"/>
+    <w:bookmarkEnd w:id="95"/>
+    <w:bookmarkStart w:id="111" w:name="outer-product"/>
     <w:p>
       <w:pPr>
         <w:pStyle w:val="Heading2"/>
@@ -60762,7 +59768,7 @@
         <w:t xml:space="preserve">4 Outer product</w:t>
       </w:r>
     </w:p>
-    <w:bookmarkStart w:id="96" w:name="def-outer-product"/>
+    <w:bookmarkStart w:id="97" w:name="def-outer-product"/>
     <w:p>
       <w:pPr>
         <w:pStyle w:val="FirstParagraph"/>
@@ -60772,7 +59778,7 @@
           <w:b/>
           <w:bCs/>
         </w:rPr>
-        <w:t xml:space="preserve">Definition 13 (Outer product)</w:t>
+        <w:t xml:space="preserve">Definition 12 (Outer product)</w:t>
       </w:r>
       <w:r>
         <w:t xml:space="preserve"> </w:t>
@@ -60889,7 +59895,7 @@
       <w:r>
         <w:t xml:space="preserve">matrix product (</w:t>
       </w:r>
-      <w:hyperlink r:id="rId95">
+      <w:hyperlink r:id="rId96">
         <w:r>
           <w:rPr>
             <w:rStyle w:val="Hyperlink"/>
@@ -61179,8 +60185,8 @@
         </m:oMath>
       </m:oMathPara>
     </w:p>
-    <w:bookmarkEnd w:id="96"/>
-    <w:bookmarkStart w:id="97" w:name="exm-outer-product"/>
+    <w:bookmarkEnd w:id="97"/>
+    <w:bookmarkStart w:id="98" w:name="exm-outer-product"/>
     <w:p>
       <w:pPr>
         <w:pStyle w:val="FirstParagraph"/>
@@ -61190,7 +60196,7 @@
           <w:b/>
           <w:bCs/>
         </w:rPr>
-        <w:t xml:space="preserve">Example 26 (An outer product)</w:t>
+        <w:t xml:space="preserve">Example 25 (An outer product)</w:t>
       </w:r>
       <w:r>
         <w:t xml:space="preserve"> </w:t>
@@ -61763,8 +60769,8 @@
         </m:oMath>
       </m:oMathPara>
     </w:p>
-    <w:bookmarkEnd w:id="97"/>
-    <w:bookmarkStart w:id="99" w:name="rem-outer-vs-dot-product"/>
+    <w:bookmarkEnd w:id="98"/>
+    <w:bookmarkStart w:id="100" w:name="rem-outer-vs-dot-product"/>
     <w:p>
       <w:pPr>
         <w:pStyle w:val="FirstParagraph"/>
@@ -61825,7 +60831,7 @@
       <w:r>
         <w:t xml:space="preserve">(</w:t>
       </w:r>
-      <w:hyperlink r:id="rId98">
+      <w:hyperlink r:id="rId99">
         <w:r>
           <w:rPr>
             <w:rStyle w:val="Hyperlink"/>
@@ -62030,7 +61036,7 @@
           <w:rPr>
             <w:rStyle w:val="Hyperlink"/>
           </w:rPr>
-          <w:t xml:space="preserve">Example 26</w:t>
+          <w:t xml:space="preserve">Example 25</w:t>
         </w:r>
       </w:hyperlink>
       <w:r>
@@ -62488,8 +61494,8 @@
         </m:oMath>
       </m:oMathPara>
     </w:p>
-    <w:bookmarkEnd w:id="99"/>
-    <w:bookmarkStart w:id="101" w:name="thm-outer-product-rank"/>
+    <w:bookmarkEnd w:id="100"/>
+    <w:bookmarkStart w:id="102" w:name="thm-outer-product-rank"/>
     <w:p>
       <w:pPr>
         <w:pStyle w:val="FirstParagraph"/>
@@ -62653,7 +61659,7 @@
       <w:r>
         <w:t xml:space="preserve">(</w:t>
       </w:r>
-      <w:hyperlink r:id="rId100">
+      <w:hyperlink r:id="rId101">
         <w:r>
           <w:rPr>
             <w:rStyle w:val="Hyperlink"/>
@@ -62665,7 +61671,7 @@
         <w:t xml:space="preserve">).</w:t>
       </w:r>
     </w:p>
-    <w:bookmarkEnd w:id="101"/>
+    <w:bookmarkEnd w:id="102"/>
     <w:p>
       <w:pPr>
         <w:pStyle w:val="BodyText"/>
@@ -63938,7 +62944,7 @@
         <w:t xml:space="preserve">The largest linearly independent set of columns therefore has one column.</w:t>
       </w:r>
     </w:p>
-    <w:bookmarkStart w:id="102" w:name="exm-outer-product-rank"/>
+    <w:bookmarkStart w:id="103" w:name="exm-outer-product-rank"/>
     <w:p>
       <w:pPr>
         <w:pStyle w:val="BodyText"/>
@@ -63948,7 +62954,7 @@
           <w:b/>
           <w:bCs/>
         </w:rPr>
-        <w:t xml:space="preserve">Example 27 (The rank of an outer product)</w:t>
+        <w:t xml:space="preserve">Example 26 (The rank of an outer product)</w:t>
       </w:r>
       <w:r>
         <w:t xml:space="preserve"> </w:t>
@@ -63964,7 +62970,7 @@
           <w:rPr>
             <w:rStyle w:val="Hyperlink"/>
           </w:rPr>
-          <w:t xml:space="preserve">Example 26</w:t>
+          <w:t xml:space="preserve">Example 25</w:t>
         </w:r>
       </w:hyperlink>
       <w:r>
@@ -64287,9 +63293,9 @@
         <w:t xml:space="preserve">.</w:t>
       </w:r>
     </w:p>
-    <w:bookmarkEnd w:id="102"/>
-    <w:bookmarkStart w:id="109" w:name="refs"/>
-    <w:bookmarkStart w:id="104" w:name="ref-axler2024linear"/>
+    <w:bookmarkEnd w:id="103"/>
+    <w:bookmarkStart w:id="110" w:name="refs"/>
+    <w:bookmarkStart w:id="105" w:name="ref-axler2024linear"/>
     <w:p>
       <w:pPr>
         <w:pStyle w:val="Bibliography"/>
@@ -64313,7 +63319,7 @@
       <w:r>
         <w:t xml:space="preserve"> </w:t>
       </w:r>
-      <w:hyperlink r:id="rId103">
+      <w:hyperlink r:id="rId104">
         <w:r>
           <w:rPr>
             <w:rStyle w:val="Hyperlink"/>
@@ -64325,8 +63331,8 @@
         <w:t xml:space="preserve">.</w:t>
       </w:r>
     </w:p>
-    <w:bookmarkEnd w:id="104"/>
-    <w:bookmarkStart w:id="106" w:name="ref-banerjee2014linear"/>
+    <w:bookmarkEnd w:id="105"/>
+    <w:bookmarkStart w:id="107" w:name="ref-banerjee2014linear"/>
     <w:p>
       <w:pPr>
         <w:pStyle w:val="Bibliography"/>
@@ -64350,7 +63356,7 @@
       <w:r>
         <w:t xml:space="preserve"> </w:t>
       </w:r>
-      <w:hyperlink r:id="rId105">
+      <w:hyperlink r:id="rId106">
         <w:r>
           <w:rPr>
             <w:rStyle w:val="Hyperlink"/>
@@ -64362,8 +63368,8 @@
         <w:t xml:space="preserve">.</w:t>
       </w:r>
     </w:p>
-    <w:bookmarkEnd w:id="106"/>
-    <w:bookmarkStart w:id="108" w:name="ref-zhou2024vector"/>
+    <w:bookmarkEnd w:id="107"/>
+    <w:bookmarkStart w:id="109" w:name="ref-zhou2024vector"/>
     <w:p>
       <w:pPr>
         <w:pStyle w:val="Bibliography"/>
@@ -64387,7 +63393,7 @@
       <w:r>
         <w:t xml:space="preserve"> </w:t>
       </w:r>
-      <w:hyperlink r:id="rId107">
+      <w:hyperlink r:id="rId108">
         <w:r>
           <w:rPr>
             <w:rStyle w:val="Hyperlink"/>
@@ -64399,9 +63405,9 @@
         <w:t xml:space="preserve">.</w:t>
       </w:r>
     </w:p>
-    <w:bookmarkEnd w:id="108"/>
     <w:bookmarkEnd w:id="109"/>
     <w:bookmarkEnd w:id="110"/>
+    <w:bookmarkEnd w:id="111"/>
     <w:sectPr>
       <w:footnotePr>
         <w:numRestart w:val="eachSect"/>
@@ -64954,9 +63960,6 @@
     <w:abstractNumId w:val="991"/>
   </w:num>
   <w:num w:numId="1020">
-    <w:abstractNumId w:val="991"/>
-  </w:num>
-  <w:num w:numId="1021">
     <w:abstractNumId w:val="99411"/>
     <w:lvlOverride w:ilvl="0">
       <w:startOverride w:val="1"/>
@@ -64986,10 +63989,10 @@
       <w:startOverride w:val="1"/>
     </w:lvlOverride>
   </w:num>
-  <w:num w:numId="1022">
+  <w:num w:numId="1021">
     <w:abstractNumId w:val="991"/>
   </w:num>
-  <w:num w:numId="1023">
+  <w:num w:numId="1022">
     <w:abstractNumId w:val="99411"/>
     <w:lvlOverride w:ilvl="0">
       <w:startOverride w:val="1"/>
@@ -65019,10 +64022,10 @@
       <w:startOverride w:val="1"/>
     </w:lvlOverride>
   </w:num>
-  <w:num w:numId="1024">
+  <w:num w:numId="1023">
     <w:abstractNumId w:val="991"/>
   </w:num>
-  <w:num w:numId="1025">
+  <w:num w:numId="1024">
     <w:abstractNumId w:val="99411"/>
     <w:lvlOverride w:ilvl="0">
       <w:startOverride w:val="1"/>

</xml_diff>

<commit_message>
Deploying to gh-pages from @ Morrison-Lab/mds@7dd78d5442f4845f6bdb70d6900cbfefcf7b1869 🚀
</commit_message>
<xml_diff>
--- a/linear-algebra-inner-products.docx
+++ b/linear-algebra-inner-products.docx
@@ -15,7 +15,7 @@
         <w:pStyle w:val="Date"/>
       </w:pPr>
       <w:r>
-        <w:t xml:space="preserve">Last modified: 2026-10-15 07:39:11 (PDT)</w:t>
+        <w:t xml:space="preserve">Last modified: 2026-10-15 08:28:32 (PDT)</w:t>
       </w:r>
     </w:p>
     <w:bookmarkStart w:id="24" w:name="sec-inner-products"/>
@@ -1750,7 +1750,7 @@
         <w:t xml:space="preserve"> </w:t>
       </w:r>
       <w:r>
-        <w:t xml:space="preserve">An</w:t>
+        <w:t xml:space="preserve">A</w:t>
       </w:r>
       <w:r>
         <w:t xml:space="preserve"> </w:t>
@@ -1760,13 +1760,135 @@
           <w:b/>
           <w:bCs/>
         </w:rPr>
-        <w:t xml:space="preserve">inner product space</w:t>
-      </w:r>
-      <w:r>
-        <w:t xml:space="preserve"> </w:t>
-      </w:r>
-      <w:r>
-        <w:t xml:space="preserve">is a vector space equipped with an inner product (</w:t>
+        <w:t xml:space="preserve">real inner product space</w:t>
+      </w:r>
+      <w:r>
+        <w:t xml:space="preserve"> </w:t>
+      </w:r>
+      <w:r>
+        <w:t xml:space="preserve">is a pair</w:t>
+      </w:r>
+      <w:r>
+        <w:t xml:space="preserve"> </w:t>
+      </w:r>
+      <m:oMath>
+        <m:r>
+          <m:rPr>
+            <m:sty m:val="p"/>
+          </m:rPr>
+          <m:t>(</m:t>
+        </m:r>
+        <m:r>
+          <m:t>V</m:t>
+        </m:r>
+        <m:r>
+          <m:rPr>
+            <m:sty m:val="p"/>
+          </m:rPr>
+          <m:t>,</m:t>
+        </m:r>
+        <m:d>
+          <m:dPr>
+            <m:begChr m:val="⟨"/>
+            <m:sepChr m:val=""/>
+            <m:endChr m:val="⟩"/>
+            <m:grow/>
+          </m:dPr>
+          <m:e>
+            <m:r>
+              <m:rPr>
+                <m:sty m:val="p"/>
+              </m:rPr>
+              <m:t>⋅</m:t>
+            </m:r>
+            <m:r>
+              <m:rPr>
+                <m:sty m:val="p"/>
+              </m:rPr>
+              <m:t>,</m:t>
+            </m:r>
+            <m:r>
+              <m:rPr>
+                <m:sty m:val="p"/>
+              </m:rPr>
+              <m:t>⋅</m:t>
+            </m:r>
+          </m:e>
+        </m:d>
+        <m:r>
+          <m:rPr>
+            <m:sty m:val="p"/>
+          </m:rPr>
+          <m:t>)</m:t>
+        </m:r>
+      </m:oMath>
+      <w:r>
+        <w:t xml:space="preserve"> </w:t>
+      </w:r>
+      <w:r>
+        <w:t xml:space="preserve">of a real vector space</w:t>
+      </w:r>
+      <w:r>
+        <w:t xml:space="preserve"> </w:t>
+      </w:r>
+      <m:oMath>
+        <m:r>
+          <m:t>V</m:t>
+        </m:r>
+      </m:oMath>
+      <w:r>
+        <w:t xml:space="preserve"> </w:t>
+      </w:r>
+      <w:r>
+        <w:t xml:space="preserve">and an inner product</w:t>
+      </w:r>
+      <w:r>
+        <w:t xml:space="preserve"> </w:t>
+      </w:r>
+      <m:oMath>
+        <m:d>
+          <m:dPr>
+            <m:begChr m:val="⟨"/>
+            <m:sepChr m:val=""/>
+            <m:endChr m:val="⟩"/>
+            <m:grow/>
+          </m:dPr>
+          <m:e>
+            <m:r>
+              <m:rPr>
+                <m:sty m:val="p"/>
+              </m:rPr>
+              <m:t>⋅</m:t>
+            </m:r>
+            <m:r>
+              <m:rPr>
+                <m:sty m:val="p"/>
+              </m:rPr>
+              <m:t>,</m:t>
+            </m:r>
+            <m:r>
+              <m:rPr>
+                <m:sty m:val="p"/>
+              </m:rPr>
+              <m:t>⋅</m:t>
+            </m:r>
+          </m:e>
+        </m:d>
+      </m:oMath>
+      <w:r>
+        <w:t xml:space="preserve"> </w:t>
+      </w:r>
+      <w:r>
+        <w:t xml:space="preserve">on it,</w:t>
+      </w:r>
+      <w:r>
+        <w:t xml:space="preserve"> </w:t>
+      </w:r>
+      <w:r>
+        <w:t xml:space="preserve">a function with the four properties of</w:t>
+      </w:r>
+      <w:r>
+        <w:t xml:space="preserve"> </w:t>
       </w:r>
       <w:hyperlink w:anchor="def-inner-product">
         <w:r>
@@ -1777,18 +1899,86 @@
         </w:r>
       </w:hyperlink>
       <w:r>
-        <w:t xml:space="preserve">).</w:t>
-      </w:r>
-      <w:r>
-        <w:t xml:space="preserve"> </w:t>
-      </w:r>
-      <w:r>
-        <w:t xml:space="preserve">For vectors in</w:t>
+        <w:t xml:space="preserve">.</w:t>
+      </w:r>
+      <w:r>
+        <w:t xml:space="preserve"> </w:t>
+      </w:r>
+      <w:r>
+        <w:t xml:space="preserve">We say that</w:t>
       </w:r>
       <w:r>
         <w:t xml:space="preserve"> </w:t>
       </w:r>
       <m:oMath>
+        <m:r>
+          <m:t>V</m:t>
+        </m:r>
+      </m:oMath>
+      <w:r>
+        <w:t xml:space="preserve"> </w:t>
+      </w:r>
+      <w:r>
+        <w:t xml:space="preserve">is</w:t>
+      </w:r>
+      <w:r>
+        <w:t xml:space="preserve"> </w:t>
+      </w:r>
+      <w:r>
+        <w:rPr>
+          <w:b/>
+          <w:bCs/>
+        </w:rPr>
+        <w:t xml:space="preserve">equipped with</w:t>
+      </w:r>
+      <w:r>
+        <w:t xml:space="preserve"> </w:t>
+      </w:r>
+      <w:r>
+        <w:t xml:space="preserve">that inner product:</w:t>
+      </w:r>
+      <w:r>
+        <w:t xml:space="preserve"> </w:t>
+      </w:r>
+      <w:r>
+        <w:t xml:space="preserve">the inner product is part of the data of the space,</w:t>
+      </w:r>
+      <w:r>
+        <w:t xml:space="preserve"> </w:t>
+      </w:r>
+      <w:r>
+        <w:t xml:space="preserve">so the same set of vectors with a different inner product is a different inner product space.</w:t>
+      </w:r>
+      <w:r>
+        <w:t xml:space="preserve"> </w:t>
+      </w:r>
+      <w:hyperlink w:anchor="def-inner-product">
+        <w:r>
+          <w:rPr>
+            <w:rStyle w:val="Hyperlink"/>
+          </w:rPr>
+          <w:t xml:space="preserve">Definition 1</w:t>
+        </w:r>
+      </w:hyperlink>
+      <w:r>
+        <w:t xml:space="preserve"> </w:t>
+      </w:r>
+      <w:r>
+        <w:t xml:space="preserve">states the properties for</w:t>
+      </w:r>
+      <w:r>
+        <w:t xml:space="preserve"> </w:t>
+      </w:r>
+      <m:oMath>
+        <m:r>
+          <m:t>V</m:t>
+        </m:r>
+        <m:r>
+          <m:rPr>
+            <m:sty m:val="p"/>
+          </m:rPr>
+          <m:t>=</m:t>
+        </m:r>
         <m:sSup>
           <m:e>
             <m:r>
@@ -1827,7 +2017,66 @@
         <w:t xml:space="preserve"> </w:t>
       </w:r>
       <w:r>
-        <w:t xml:space="preserve">the pair</w:t>
+        <w:t xml:space="preserve">and the same four properties define an inner product on other real vector spaces,</w:t>
+      </w:r>
+      <w:r>
+        <w:t xml:space="preserve"> </w:t>
+      </w:r>
+      <w:r>
+        <w:t xml:space="preserve">such as spaces of matrices or functions.</w:t>
+      </w:r>
+    </w:p>
+    <w:bookmarkEnd w:id="15"/>
+    <w:bookmarkStart w:id="16" w:name="exm-inner-product-space"/>
+    <w:p>
+      <w:pPr>
+        <w:pStyle w:val="BodyText"/>
+      </w:pPr>
+      <w:r>
+        <w:rPr>
+          <w:b/>
+          <w:bCs/>
+        </w:rPr>
+        <w:t xml:space="preserve">Example 2 (Real coordinate space as an inner product space)</w:t>
+      </w:r>
+      <w:r>
+        <w:t xml:space="preserve"> </w:t>
+      </w:r>
+      <w:r>
+        <w:t xml:space="preserve">The Euclidean space</w:t>
+      </w:r>
+      <w:r>
+        <w:t xml:space="preserve"> </w:t>
+      </w:r>
+      <m:oMath>
+        <m:sSup>
+          <m:e>
+            <m:r>
+              <m:rPr>
+                <m:scr m:val="double-struck"/>
+                <m:sty m:val="p"/>
+              </m:rPr>
+              <m:t>R</m:t>
+            </m:r>
+          </m:e>
+          <m:sup>
+            <m:r>
+              <m:t>p</m:t>
+            </m:r>
+          </m:sup>
+        </m:sSup>
+      </m:oMath>
+      <w:r>
+        <w:t xml:space="preserve"> </w:t>
+      </w:r>
+      <w:r>
+        <w:t xml:space="preserve">equipped with the standard dot product (1),</w:t>
+      </w:r>
+      <w:r>
+        <w:t xml:space="preserve"> </w:t>
+      </w:r>
+      <w:r>
+        <w:t xml:space="preserve">that is, the pair</w:t>
       </w:r>
       <w:r>
         <w:t xml:space="preserve"> </w:t>
@@ -1900,54 +2149,83 @@
         <w:t xml:space="preserve"> </w:t>
       </w:r>
       <w:r>
-        <w:t xml:space="preserve">is a real inner product space.</w:t>
-      </w:r>
-    </w:p>
-    <w:bookmarkEnd w:id="15"/>
-    <w:bookmarkStart w:id="16" w:name="exm-inner-product-space"/>
-    <w:p>
-      <w:pPr>
-        <w:pStyle w:val="BodyText"/>
-      </w:pPr>
-      <w:r>
-        <w:rPr>
-          <w:b/>
-          <w:bCs/>
-        </w:rPr>
-        <w:t xml:space="preserve">Example 2 (Real coordinate space as an inner product space)</w:t>
-      </w:r>
-      <w:r>
-        <w:t xml:space="preserve"> </w:t>
-      </w:r>
-      <w:r>
-        <w:t xml:space="preserve">The Euclidean space</w:t>
+        <w:t xml:space="preserve">with</w:t>
       </w:r>
       <w:r>
         <w:t xml:space="preserve"> </w:t>
       </w:r>
       <m:oMath>
-        <m:sSup>
-          <m:e>
+        <m:d>
+          <m:dPr>
+            <m:begChr m:val="⟨"/>
+            <m:sepChr m:val=""/>
+            <m:endChr m:val="⟩"/>
+            <m:grow/>
+          </m:dPr>
+          <m:e>
+            <m:acc>
+              <m:accPr>
+                <m:chr m:val="̃"/>
+              </m:accPr>
+              <m:e>
+                <m:r>
+                  <m:t>x</m:t>
+                </m:r>
+              </m:e>
+            </m:acc>
             <m:r>
               <m:rPr>
-                <m:scr m:val="double-struck"/>
                 <m:sty m:val="p"/>
               </m:rPr>
-              <m:t>R</m:t>
-            </m:r>
-          </m:e>
-          <m:sup>
-            <m:r>
-              <m:t>p</m:t>
-            </m:r>
-          </m:sup>
-        </m:sSup>
+              <m:t>,</m:t>
+            </m:r>
+            <m:acc>
+              <m:accPr>
+                <m:chr m:val="̃"/>
+              </m:accPr>
+              <m:e>
+                <m:r>
+                  <m:t>y</m:t>
+                </m:r>
+              </m:e>
+            </m:acc>
+          </m:e>
+        </m:d>
+        <m:r>
+          <m:rPr>
+            <m:sty m:val="p"/>
+          </m:rPr>
+          <m:t>=</m:t>
+        </m:r>
+        <m:acc>
+          <m:accPr>
+            <m:chr m:val="̃"/>
+          </m:accPr>
+          <m:e>
+            <m:r>
+              <m:t>x</m:t>
+            </m:r>
+          </m:e>
+        </m:acc>
+        <m:r>
+          <m:rPr>
+            <m:sty m:val="p"/>
+          </m:rPr>
+          <m:t>⋅</m:t>
+        </m:r>
+        <m:acc>
+          <m:accPr>
+            <m:chr m:val="̃"/>
+          </m:accPr>
+          <m:e>
+            <m:r>
+              <m:t>y</m:t>
+            </m:r>
+          </m:e>
+        </m:acc>
       </m:oMath>
       <w:r>
-        <w:t xml:space="preserve"> </w:t>
-      </w:r>
-      <w:r>
-        <w:t xml:space="preserve">equipped with the standard dot product (1)</w:t>
+        <w:t xml:space="preserve">,</w:t>
       </w:r>
       <w:r>
         <w:t xml:space="preserve"> </w:t>
@@ -8495,7 +8773,7 @@
     </w:p>
     <w:bookmarkEnd w:id="23"/>
     <w:bookmarkEnd w:id="24"/>
-    <w:bookmarkStart w:id="63" w:name="sec-cauchy-schwarz"/>
+    <w:bookmarkStart w:id="64" w:name="sec-cauchy-schwarz"/>
     <w:p>
       <w:pPr>
         <w:pStyle w:val="Heading2"/>
@@ -36379,7 +36657,478 @@
       </m:oMathPara>
     </w:p>
     <w:bookmarkEnd w:id="59"/>
-    <w:bookmarkStart w:id="61" w:name="thm-pearson-cosine-centered"/>
+    <w:bookmarkStart w:id="60" w:name="cor-cosine-similarity-unit-vectors"/>
+    <w:p>
+      <w:pPr>
+        <w:pStyle w:val="FirstParagraph"/>
+      </w:pPr>
+      <w:r>
+        <w:rPr>
+          <w:b/>
+          <w:bCs/>
+        </w:rPr>
+        <w:t xml:space="preserve">Corollary 3 (Cosine similarity of unit vectors is their inner product)</w:t>
+      </w:r>
+      <w:r>
+        <w:t xml:space="preserve"> </w:t>
+      </w:r>
+      <w:r>
+        <w:t xml:space="preserve">In a real inner product space (</w:t>
+      </w:r>
+      <w:hyperlink w:anchor="def-inner-product-space">
+        <w:r>
+          <w:rPr>
+            <w:rStyle w:val="Hyperlink"/>
+          </w:rPr>
+          <w:t xml:space="preserve">Definition 2</w:t>
+        </w:r>
+      </w:hyperlink>
+      <w:r>
+        <w:t xml:space="preserve">),</w:t>
+      </w:r>
+      <w:r>
+        <w:t xml:space="preserve"> </w:t>
+      </w:r>
+      <w:r>
+        <w:t xml:space="preserve">for all vectors</w:t>
+      </w:r>
+      <w:r>
+        <w:t xml:space="preserve"> </w:t>
+      </w:r>
+      <m:oMath>
+        <m:acc>
+          <m:accPr>
+            <m:chr m:val="̃"/>
+          </m:accPr>
+          <m:e>
+            <m:r>
+              <m:t>x</m:t>
+            </m:r>
+          </m:e>
+        </m:acc>
+      </m:oMath>
+      <w:r>
+        <w:t xml:space="preserve"> </w:t>
+      </w:r>
+      <w:r>
+        <w:t xml:space="preserve">and</w:t>
+      </w:r>
+      <w:r>
+        <w:t xml:space="preserve"> </w:t>
+      </w:r>
+      <m:oMath>
+        <m:acc>
+          <m:accPr>
+            <m:chr m:val="̃"/>
+          </m:accPr>
+          <m:e>
+            <m:r>
+              <m:t>y</m:t>
+            </m:r>
+          </m:e>
+        </m:acc>
+      </m:oMath>
+      <w:r>
+        <w:t xml:space="preserve"> </w:t>
+      </w:r>
+      <w:r>
+        <w:t xml:space="preserve">with</w:t>
+      </w:r>
+      <w:r>
+        <w:t xml:space="preserve"> </w:t>
+      </w:r>
+      <m:oMath>
+        <m:r>
+          <m:t>​</m:t>
+        </m:r>
+        <m:d>
+          <m:dPr>
+            <m:begChr m:val="∥"/>
+            <m:sepChr m:val=""/>
+            <m:endChr m:val="∥"/>
+            <m:grow/>
+          </m:dPr>
+          <m:e>
+            <m:acc>
+              <m:accPr>
+                <m:chr m:val="̃"/>
+              </m:accPr>
+              <m:e>
+                <m:r>
+                  <m:t>x</m:t>
+                </m:r>
+              </m:e>
+            </m:acc>
+          </m:e>
+        </m:d>
+        <m:r>
+          <m:t>​</m:t>
+        </m:r>
+        <m:r>
+          <m:rPr>
+            <m:sty m:val="p"/>
+          </m:rPr>
+          <m:t>=</m:t>
+        </m:r>
+        <m:r>
+          <m:t>​</m:t>
+        </m:r>
+        <m:d>
+          <m:dPr>
+            <m:begChr m:val="∥"/>
+            <m:sepChr m:val=""/>
+            <m:endChr m:val="∥"/>
+            <m:grow/>
+          </m:dPr>
+          <m:e>
+            <m:acc>
+              <m:accPr>
+                <m:chr m:val="̃"/>
+              </m:accPr>
+              <m:e>
+                <m:r>
+                  <m:t>y</m:t>
+                </m:r>
+              </m:e>
+            </m:acc>
+          </m:e>
+        </m:d>
+        <m:r>
+          <m:t>​</m:t>
+        </m:r>
+        <m:r>
+          <m:rPr>
+            <m:sty m:val="p"/>
+          </m:rPr>
+          <m:t>=</m:t>
+        </m:r>
+        <m:r>
+          <m:t>1</m:t>
+        </m:r>
+      </m:oMath>
+      <w:r>
+        <w:t xml:space="preserve">,</w:t>
+      </w:r>
+    </w:p>
+    <w:p>
+      <w:pPr>
+        <w:pStyle w:val="BodyText"/>
+      </w:pPr>
+      <m:oMathPara>
+        <m:oMathParaPr>
+          <m:jc m:val="center"/>
+        </m:oMathParaPr>
+        <m:oMath>
+          <m:r>
+            <m:rPr>
+              <m:sty m:val="p"/>
+            </m:rPr>
+            <m:t>cossim</m:t>
+          </m:r>
+          <m:r>
+            <m:rPr>
+              <m:sty m:val="p"/>
+            </m:rPr>
+            <m:t>(</m:t>
+          </m:r>
+          <m:acc>
+            <m:accPr>
+              <m:chr m:val="̃"/>
+            </m:accPr>
+            <m:e>
+              <m:r>
+                <m:t>x</m:t>
+              </m:r>
+            </m:e>
+          </m:acc>
+          <m:r>
+            <m:rPr>
+              <m:sty m:val="p"/>
+            </m:rPr>
+            <m:t>,</m:t>
+          </m:r>
+          <m:acc>
+            <m:accPr>
+              <m:chr m:val="̃"/>
+            </m:accPr>
+            <m:e>
+              <m:r>
+                <m:t>y</m:t>
+              </m:r>
+            </m:e>
+          </m:acc>
+          <m:r>
+            <m:rPr>
+              <m:sty m:val="p"/>
+            </m:rPr>
+            <m:t>)</m:t>
+          </m:r>
+          <m:r>
+            <m:rPr>
+              <m:sty m:val="p"/>
+            </m:rPr>
+            <m:t>=</m:t>
+          </m:r>
+          <m:d>
+            <m:dPr>
+              <m:begChr m:val="⟨"/>
+              <m:sepChr m:val=""/>
+              <m:endChr m:val="⟩"/>
+              <m:grow/>
+            </m:dPr>
+            <m:e>
+              <m:acc>
+                <m:accPr>
+                  <m:chr m:val="̃"/>
+                </m:accPr>
+                <m:e>
+                  <m:r>
+                    <m:t>x</m:t>
+                  </m:r>
+                </m:e>
+              </m:acc>
+              <m:r>
+                <m:rPr>
+                  <m:sty m:val="p"/>
+                </m:rPr>
+                <m:t>,</m:t>
+              </m:r>
+              <m:acc>
+                <m:accPr>
+                  <m:chr m:val="̃"/>
+                </m:accPr>
+                <m:e>
+                  <m:r>
+                    <m:t>y</m:t>
+                  </m:r>
+                </m:e>
+              </m:acc>
+            </m:e>
+          </m:d>
+          <m:r>
+            <m:rPr>
+              <m:sty m:val="p"/>
+            </m:rPr>
+            <m:t>.</m:t>
+          </m:r>
+        </m:oMath>
+      </m:oMathPara>
+    </w:p>
+    <w:bookmarkEnd w:id="60"/>
+    <w:p>
+      <w:pPr>
+        <w:pStyle w:val="FirstParagraph"/>
+      </w:pPr>
+      <w:r>
+        <w:rPr>
+          <w:i/>
+          <w:iCs/>
+        </w:rPr>
+        <w:t xml:space="preserve">Proof</w:t>
+      </w:r>
+      <w:r>
+        <w:t xml:space="preserve">. </w:t>
+      </w:r>
+      <w:r>
+        <w:t xml:space="preserve">Both norms in the denominator of</w:t>
+      </w:r>
+      <w:r>
+        <w:t xml:space="preserve"> </w:t>
+      </w:r>
+      <w:hyperlink w:anchor="X64c41f557e7f698c947bb0d906d626137043d1e">
+        <w:r>
+          <w:rPr>
+            <w:rStyle w:val="Hyperlink"/>
+          </w:rPr>
+          <w:t xml:space="preserve">Definition 9</w:t>
+        </w:r>
+      </w:hyperlink>
+      <w:r>
+        <w:t xml:space="preserve"> </w:t>
+      </w:r>
+      <w:r>
+        <w:t xml:space="preserve">equal</w:t>
+      </w:r>
+      <w:r>
+        <w:t xml:space="preserve"> </w:t>
+      </w:r>
+      <m:oMath>
+        <m:r>
+          <m:t>1</m:t>
+        </m:r>
+      </m:oMath>
+      <w:r>
+        <w:t xml:space="preserve">, so</w:t>
+      </w:r>
+    </w:p>
+    <w:p>
+      <w:pPr>
+        <w:pStyle w:val="BodyText"/>
+      </w:pPr>
+      <m:oMathPara>
+        <m:oMathParaPr>
+          <m:jc m:val="center"/>
+        </m:oMathParaPr>
+        <m:oMath>
+          <m:r>
+            <m:rPr>
+              <m:sty m:val="p"/>
+            </m:rPr>
+            <m:t>cossim</m:t>
+          </m:r>
+          <m:r>
+            <m:rPr>
+              <m:sty m:val="p"/>
+            </m:rPr>
+            <m:t>(</m:t>
+          </m:r>
+          <m:acc>
+            <m:accPr>
+              <m:chr m:val="̃"/>
+            </m:accPr>
+            <m:e>
+              <m:r>
+                <m:t>x</m:t>
+              </m:r>
+            </m:e>
+          </m:acc>
+          <m:r>
+            <m:rPr>
+              <m:sty m:val="p"/>
+            </m:rPr>
+            <m:t>,</m:t>
+          </m:r>
+          <m:acc>
+            <m:accPr>
+              <m:chr m:val="̃"/>
+            </m:accPr>
+            <m:e>
+              <m:r>
+                <m:t>y</m:t>
+              </m:r>
+            </m:e>
+          </m:acc>
+          <m:r>
+            <m:rPr>
+              <m:sty m:val="p"/>
+            </m:rPr>
+            <m:t>)</m:t>
+          </m:r>
+          <m:r>
+            <m:rPr>
+              <m:sty m:val="p"/>
+            </m:rPr>
+            <m:t>=</m:t>
+          </m:r>
+          <m:f>
+            <m:fPr>
+              <m:type m:val="bar"/>
+            </m:fPr>
+            <m:num>
+              <m:d>
+                <m:dPr>
+                  <m:begChr m:val="⟨"/>
+                  <m:sepChr m:val=""/>
+                  <m:endChr m:val="⟩"/>
+                  <m:grow/>
+                </m:dPr>
+                <m:e>
+                  <m:acc>
+                    <m:accPr>
+                      <m:chr m:val="̃"/>
+                    </m:accPr>
+                    <m:e>
+                      <m:r>
+                        <m:t>x</m:t>
+                      </m:r>
+                    </m:e>
+                  </m:acc>
+                  <m:r>
+                    <m:rPr>
+                      <m:sty m:val="p"/>
+                    </m:rPr>
+                    <m:t>,</m:t>
+                  </m:r>
+                  <m:acc>
+                    <m:accPr>
+                      <m:chr m:val="̃"/>
+                    </m:accPr>
+                    <m:e>
+                      <m:r>
+                        <m:t>y</m:t>
+                      </m:r>
+                    </m:e>
+                  </m:acc>
+                </m:e>
+              </m:d>
+            </m:num>
+            <m:den>
+              <m:r>
+                <m:t>1</m:t>
+              </m:r>
+              <m:r>
+                <m:rPr>
+                  <m:sty m:val="p"/>
+                </m:rPr>
+                <m:t>⋅</m:t>
+              </m:r>
+              <m:r>
+                <m:t>1</m:t>
+              </m:r>
+            </m:den>
+          </m:f>
+          <m:r>
+            <m:rPr>
+              <m:sty m:val="p"/>
+            </m:rPr>
+            <m:t>=</m:t>
+          </m:r>
+          <m:d>
+            <m:dPr>
+              <m:begChr m:val="⟨"/>
+              <m:sepChr m:val=""/>
+              <m:endChr m:val="⟩"/>
+              <m:grow/>
+            </m:dPr>
+            <m:e>
+              <m:acc>
+                <m:accPr>
+                  <m:chr m:val="̃"/>
+                </m:accPr>
+                <m:e>
+                  <m:r>
+                    <m:t>x</m:t>
+                  </m:r>
+                </m:e>
+              </m:acc>
+              <m:r>
+                <m:rPr>
+                  <m:sty m:val="p"/>
+                </m:rPr>
+                <m:t>,</m:t>
+              </m:r>
+              <m:acc>
+                <m:accPr>
+                  <m:chr m:val="̃"/>
+                </m:accPr>
+                <m:e>
+                  <m:r>
+                    <m:t>y</m:t>
+                  </m:r>
+                </m:e>
+              </m:acc>
+            </m:e>
+          </m:d>
+          <m:r>
+            <m:rPr>
+              <m:sty m:val="p"/>
+            </m:rPr>
+            <m:t>.</m:t>
+          </m:r>
+        </m:oMath>
+      </m:oMathPara>
+    </w:p>
+    <w:bookmarkStart w:id="62" w:name="thm-pearson-cosine-centered"/>
     <w:p>
       <w:pPr>
         <w:pStyle w:val="FirstParagraph"/>
@@ -36802,7 +37551,7 @@
       <w:r>
         <w:t xml:space="preserve"> </w:t>
       </w:r>
-      <w:hyperlink r:id="rId60">
+      <w:hyperlink r:id="rId61">
         <w:r>
           <w:rPr>
             <w:rStyle w:val="Hyperlink"/>
@@ -36988,7 +37737,7 @@
         </m:oMath>
       </m:oMathPara>
     </w:p>
-    <w:bookmarkEnd w:id="61"/>
+    <w:bookmarkEnd w:id="62"/>
     <w:p>
       <w:pPr>
         <w:pStyle w:val="FirstParagraph"/>
@@ -37694,7 +38443,7 @@
         <w:t xml:space="preserve">.</w:t>
       </w:r>
     </w:p>
-    <w:bookmarkStart w:id="62" w:name="exm-pearson-cosine-centered"/>
+    <w:bookmarkStart w:id="63" w:name="exm-pearson-cosine-centered"/>
     <w:p>
       <w:pPr>
         <w:pStyle w:val="BodyText"/>
@@ -38590,9 +39339,9 @@
         <w:t xml:space="preserve">mostly because both vectors have positive entries and the same mean, not because they move together.</w:t>
       </w:r>
     </w:p>
-    <w:bookmarkEnd w:id="62"/>
     <w:bookmarkEnd w:id="63"/>
-    <w:bookmarkStart w:id="95" w:name="sec-gram-schmidt"/>
+    <w:bookmarkEnd w:id="64"/>
+    <w:bookmarkStart w:id="96" w:name="sec-gram-schmidt"/>
     <w:p>
       <w:pPr>
         <w:pStyle w:val="Heading2"/>
@@ -38642,12 +39391,12 @@
                 <wp:inline>
                   <wp:extent cx="152400" cy="152400"/>
                   <wp:effectExtent b="0" l="0" r="0" t="0"/>
-                  <wp:docPr descr="" title="" id="64" name="Picture"/>
+                  <wp:docPr descr="" title="" id="65" name="Picture"/>
                   <a:graphic>
                     <a:graphicData uri="http://schemas.openxmlformats.org/drawingml/2006/picture">
                       <pic:pic>
                         <pic:nvPicPr>
-                          <pic:cNvPr descr="/opt/quarto/share/formats/docx/note.png" id="65" name="Picture"/>
+                          <pic:cNvPr descr="/opt/quarto/share/formats/docx/note.png" id="66" name="Picture"/>
                           <pic:cNvPicPr>
                             <a:picLocks noChangeArrowheads="1" noChangeAspect="1"/>
                           </pic:cNvPicPr>
@@ -38778,7 +39527,7 @@
         </w:tc>
       </w:tr>
     </w:tbl>
-    <w:bookmarkStart w:id="66" w:name="thm-dot-linear-sum"/>
+    <w:bookmarkStart w:id="67" w:name="thm-dot-linear-sum"/>
     <w:p>
       <w:pPr>
         <w:pStyle w:val="BodyText"/>
@@ -39179,7 +39928,7 @@
         </m:oMath>
       </m:oMathPara>
     </w:p>
-    <w:bookmarkEnd w:id="66"/>
+    <w:bookmarkEnd w:id="67"/>
     <w:p>
       <w:pPr>
         <w:pStyle w:val="FirstParagraph"/>
@@ -40177,7 +40926,7 @@
         </m:oMath>
       </m:oMathPara>
     </w:p>
-    <w:bookmarkStart w:id="67" w:name="exm-dot-linear-sum"/>
+    <w:bookmarkStart w:id="68" w:name="exm-dot-linear-sum"/>
     <w:p>
       <w:pPr>
         <w:pStyle w:val="FirstParagraph"/>
@@ -40646,8 +41395,8 @@
         <w:t xml:space="preserve">, the same number.</w:t>
       </w:r>
     </w:p>
-    <w:bookmarkEnd w:id="67"/>
-    <w:bookmarkStart w:id="69" w:name="thm-orthonormal-independent"/>
+    <w:bookmarkEnd w:id="68"/>
+    <w:bookmarkStart w:id="70" w:name="thm-orthonormal-independent"/>
     <w:p>
       <w:pPr>
         <w:pStyle w:val="BodyText"/>
@@ -40732,7 +41481,7 @@
       <w:r>
         <w:t xml:space="preserve">are orthonormal (</w:t>
       </w:r>
-      <w:hyperlink r:id="rId68">
+      <w:hyperlink r:id="rId69">
         <w:r>
           <w:rPr>
             <w:rStyle w:val="Hyperlink"/>
@@ -40761,7 +41510,7 @@
         <w:t xml:space="preserve">).</w:t>
       </w:r>
     </w:p>
-    <w:bookmarkEnd w:id="69"/>
+    <w:bookmarkEnd w:id="70"/>
     <w:p>
       <w:pPr>
         <w:pStyle w:val="BodyText"/>
@@ -41427,7 +42176,7 @@
         <w:t xml:space="preserve">.</w:t>
       </w:r>
     </w:p>
-    <w:bookmarkStart w:id="70" w:name="exm-orthonormal-independent"/>
+    <w:bookmarkStart w:id="71" w:name="exm-orthonormal-independent"/>
     <w:p>
       <w:pPr>
         <w:pStyle w:val="BodyText"/>
@@ -42804,8 +43553,8 @@
         <w:t xml:space="preserve">.</w:t>
       </w:r>
     </w:p>
-    <w:bookmarkEnd w:id="70"/>
-    <w:bookmarkStart w:id="72" w:name="def-orthonormal-basis"/>
+    <w:bookmarkEnd w:id="71"/>
+    <w:bookmarkStart w:id="73" w:name="def-orthonormal-basis"/>
     <w:p>
       <w:pPr>
         <w:pStyle w:val="BodyText"/>
@@ -42902,7 +43651,7 @@
       <w:r>
         <w:t xml:space="preserve">(</w:t>
       </w:r>
-      <w:hyperlink r:id="rId71">
+      <w:hyperlink r:id="rId72">
         <w:r>
           <w:rPr>
             <w:rStyle w:val="Hyperlink"/>
@@ -42919,7 +43668,7 @@
       <w:r>
         <w:t xml:space="preserve">whose vectors are orthonormal (</w:t>
       </w:r>
-      <w:hyperlink r:id="rId68">
+      <w:hyperlink r:id="rId69">
         <w:r>
           <w:rPr>
             <w:rStyle w:val="Hyperlink"/>
@@ -42931,8 +43680,8 @@
         <w:t xml:space="preserve">).</w:t>
       </w:r>
     </w:p>
-    <w:bookmarkEnd w:id="72"/>
-    <w:bookmarkStart w:id="76" w:name="exm-orthonormal-basis"/>
+    <w:bookmarkEnd w:id="73"/>
+    <w:bookmarkStart w:id="77" w:name="exm-orthonormal-basis"/>
     <w:p>
       <w:pPr>
         <w:pStyle w:val="BodyText"/>
@@ -43113,7 +43862,7 @@
       <w:r>
         <w:t xml:space="preserve">(</w:t>
       </w:r>
-      <w:hyperlink r:id="rId73">
+      <w:hyperlink r:id="rId74">
         <w:r>
           <w:rPr>
             <w:rStyle w:val="Hyperlink"/>
@@ -43239,7 +43988,7 @@
       <w:r>
         <w:t xml:space="preserve">so they are a basis of their span (</w:t>
       </w:r>
-      <w:hyperlink r:id="rId71">
+      <w:hyperlink r:id="rId72">
         <w:r>
           <w:rPr>
             <w:rStyle w:val="Hyperlink"/>
@@ -43270,7 +44019,7 @@
       <w:r>
         <w:t xml:space="preserve">(</w:t>
       </w:r>
-      <w:hyperlink r:id="rId74">
+      <w:hyperlink r:id="rId75">
         <w:r>
           <w:rPr>
             <w:rStyle w:val="Hyperlink"/>
@@ -43314,7 +44063,7 @@
       <w:r>
         <w:t xml:space="preserve">(</w:t>
       </w:r>
-      <w:hyperlink r:id="rId75">
+      <w:hyperlink r:id="rId76">
         <w:r>
           <w:rPr>
             <w:rStyle w:val="Hyperlink"/>
@@ -43328,7 +44077,7 @@
       <w:r>
         <w:t xml:space="preserve"> </w:t>
       </w:r>
-      <w:hyperlink r:id="rId73">
+      <w:hyperlink r:id="rId74">
         <w:r>
           <w:rPr>
             <w:rStyle w:val="Hyperlink"/>
@@ -43373,8 +44122,8 @@
         <w:t xml:space="preserve">too.</w:t>
       </w:r>
     </w:p>
-    <w:bookmarkEnd w:id="76"/>
-    <w:bookmarkStart w:id="79" w:name="exm-not-orthonormal-basis"/>
+    <w:bookmarkEnd w:id="77"/>
+    <w:bookmarkStart w:id="80" w:name="exm-not-orthonormal-basis"/>
     <w:p>
       <w:pPr>
         <w:pStyle w:val="FirstParagraph"/>
@@ -43490,7 +44239,7 @@
       <w:r>
         <w:t xml:space="preserve">(</w:t>
       </w:r>
-      <w:hyperlink r:id="rId77">
+      <w:hyperlink r:id="rId78">
         <w:r>
           <w:rPr>
             <w:rStyle w:val="Hyperlink"/>
@@ -43720,7 +44469,7 @@
       <w:r>
         <w:t xml:space="preserve">(</w:t>
       </w:r>
-      <w:hyperlink r:id="rId78">
+      <w:hyperlink r:id="rId79">
         <w:r>
           <w:rPr>
             <w:rStyle w:val="Hyperlink"/>
@@ -43779,8 +44528,8 @@
         <w:t xml:space="preserve">.</w:t>
       </w:r>
     </w:p>
-    <w:bookmarkEnd w:id="79"/>
-    <w:bookmarkStart w:id="80" w:name="thm-orthonormal-expansion"/>
+    <w:bookmarkEnd w:id="80"/>
+    <w:bookmarkStart w:id="81" w:name="thm-orthonormal-expansion"/>
     <w:p>
       <w:pPr>
         <w:pStyle w:val="FirstParagraph"/>
@@ -44061,7 +44810,7 @@
         </m:oMath>
       </m:oMathPara>
     </w:p>
-    <w:bookmarkEnd w:id="80"/>
+    <w:bookmarkEnd w:id="81"/>
     <w:p>
       <w:pPr>
         <w:pStyle w:val="FirstParagraph"/>
@@ -44667,7 +45416,7 @@
         <w:t xml:space="preserve">.</w:t>
       </w:r>
     </w:p>
-    <w:bookmarkStart w:id="81" w:name="exm-orthonormal-expansion"/>
+    <w:bookmarkStart w:id="82" w:name="exm-orthonormal-expansion"/>
     <w:p>
       <w:pPr>
         <w:pStyle w:val="BodyText"/>
@@ -45907,8 +46656,8 @@
         <w:t xml:space="preserve">says.</w:t>
       </w:r>
     </w:p>
-    <w:bookmarkEnd w:id="81"/>
-    <w:bookmarkStart w:id="82" w:name="def-gram-schmidt"/>
+    <w:bookmarkEnd w:id="82"/>
+    <w:bookmarkStart w:id="83" w:name="def-gram-schmidt"/>
     <w:p>
       <w:pPr>
         <w:pStyle w:val="BodyText"/>
@@ -46683,8 +47432,8 @@
         <w:t xml:space="preserve">of them if it never stops.</w:t>
       </w:r>
     </w:p>
-    <w:bookmarkEnd w:id="82"/>
-    <w:bookmarkStart w:id="83" w:name="exm-gram-schmidt"/>
+    <w:bookmarkEnd w:id="83"/>
+    <w:bookmarkStart w:id="84" w:name="exm-gram-schmidt"/>
     <w:p>
       <w:pPr>
         <w:pStyle w:val="BodyText"/>
@@ -48163,8 +48912,8 @@
         </m:oMath>
       </m:oMathPara>
     </w:p>
-    <w:bookmarkEnd w:id="83"/>
-    <w:bookmarkStart w:id="84" w:name="exm-gram-schmidt-stops"/>
+    <w:bookmarkEnd w:id="84"/>
+    <w:bookmarkStart w:id="85" w:name="exm-gram-schmidt-stops"/>
     <w:p>
       <w:pPr>
         <w:pStyle w:val="FirstParagraph"/>
@@ -48885,8 +49634,8 @@
         <w:t xml:space="preserve">.</w:t>
       </w:r>
     </w:p>
-    <w:bookmarkEnd w:id="84"/>
-    <w:bookmarkStart w:id="85" w:name="thm-gram-schmidt"/>
+    <w:bookmarkEnd w:id="85"/>
+    <w:bookmarkStart w:id="86" w:name="thm-gram-schmidt"/>
     <w:p>
       <w:pPr>
         <w:pStyle w:val="BodyText"/>
@@ -49807,7 +50556,7 @@
         <w:t xml:space="preserve">).</w:t>
       </w:r>
     </w:p>
-    <w:bookmarkEnd w:id="85"/>
+    <w:bookmarkEnd w:id="86"/>
     <w:p>
       <w:pPr>
         <w:pStyle w:val="FirstParagraph"/>
@@ -49836,7 +50585,7 @@
         </w:rPr>
         <w:t xml:space="preserve"> </w:t>
       </w:r>
-      <w:hyperlink r:id="rId86">
+      <w:hyperlink r:id="rId87">
         <w:r>
           <w:rPr>
             <w:rStyle w:val="Hyperlink"/>
@@ -49957,7 +50706,7 @@
       <w:r>
         <w:t xml:space="preserve">(</w:t>
       </w:r>
-      <w:hyperlink r:id="rId87">
+      <w:hyperlink r:id="rId88">
         <w:r>
           <w:rPr>
             <w:rStyle w:val="Hyperlink"/>
@@ -54010,7 +54759,7 @@
       <w:r>
         <w:t xml:space="preserve">A span is a subspace (</w:t>
       </w:r>
-      <w:hyperlink r:id="rId88">
+      <w:hyperlink r:id="rId89">
         <w:r>
           <w:rPr>
             <w:rStyle w:val="Hyperlink"/>
@@ -54251,7 +55000,7 @@
       <w:r>
         <w:t xml:space="preserve"> </w:t>
       </w:r>
-      <w:hyperlink r:id="rId89">
+      <w:hyperlink r:id="rId90">
         <w:r>
           <w:rPr>
             <w:rStyle w:val="Hyperlink"/>
@@ -54775,7 +55524,7 @@
         <w:t xml:space="preserve">so they are an orthonormal basis of it.</w:t>
       </w:r>
     </w:p>
-    <w:bookmarkStart w:id="90" w:name="exm-thm-gram-schmidt"/>
+    <w:bookmarkStart w:id="91" w:name="exm-thm-gram-schmidt"/>
     <w:p>
       <w:pPr>
         <w:pStyle w:val="BodyText"/>
@@ -56316,7 +57065,7 @@
       <w:r>
         <w:t xml:space="preserve">(</w:t>
       </w:r>
-      <w:hyperlink r:id="rId74">
+      <w:hyperlink r:id="rId75">
         <w:r>
           <w:rPr>
             <w:rStyle w:val="Hyperlink"/>
@@ -56360,7 +57109,7 @@
       <w:r>
         <w:t xml:space="preserve">(</w:t>
       </w:r>
-      <w:hyperlink r:id="rId75">
+      <w:hyperlink r:id="rId76">
         <w:r>
           <w:rPr>
             <w:rStyle w:val="Hyperlink"/>
@@ -56374,7 +57123,7 @@
       <w:r>
         <w:t xml:space="preserve"> </w:t>
       </w:r>
-      <w:hyperlink r:id="rId73">
+      <w:hyperlink r:id="rId74">
         <w:r>
           <w:rPr>
             <w:rStyle w:val="Hyperlink"/>
@@ -56702,8 +57451,8 @@
         </m:oMath>
       </m:oMathPara>
     </w:p>
-    <w:bookmarkEnd w:id="90"/>
-    <w:bookmarkStart w:id="91" w:name="cor-orthonormal-basis-exists"/>
+    <w:bookmarkEnd w:id="91"/>
+    <w:bookmarkStart w:id="92" w:name="cor-orthonormal-basis-exists"/>
     <w:p>
       <w:pPr>
         <w:pStyle w:val="FirstParagraph"/>
@@ -56713,7 +57462,7 @@
           <w:b/>
           <w:bCs/>
         </w:rPr>
-        <w:t xml:space="preserve">Corollary 3 (Every subspace has an orthonormal basis)</w:t>
+        <w:t xml:space="preserve">Corollary 4 (Every subspace has an orthonormal basis)</w:t>
       </w:r>
       <w:r>
         <w:t xml:space="preserve"> </w:t>
@@ -56841,7 +57590,7 @@
         <w:t xml:space="preserve">has an orthonormal basis.</w:t>
       </w:r>
     </w:p>
-    <w:bookmarkEnd w:id="91"/>
+    <w:bookmarkEnd w:id="92"/>
     <w:p>
       <w:pPr>
         <w:pStyle w:val="BodyText"/>
@@ -57118,7 +57867,7 @@
       <w:r>
         <w:t xml:space="preserve">(</w:t>
       </w:r>
-      <w:hyperlink r:id="rId92">
+      <w:hyperlink r:id="rId93">
         <w:r>
           <w:rPr>
             <w:rStyle w:val="Hyperlink"/>
@@ -57274,7 +58023,7 @@
       <w:r>
         <w:t xml:space="preserve"> </w:t>
       </w:r>
-      <w:hyperlink r:id="rId86">
+      <w:hyperlink r:id="rId87">
         <w:r>
           <w:rPr>
             <w:rStyle w:val="Hyperlink"/>
@@ -58003,7 +58752,7 @@
         <w:t xml:space="preserve">So the orthonormal basis contains the starting list.</w:t>
       </w:r>
     </w:p>
-    <w:bookmarkStart w:id="94" w:name="exm-orthonormal-basis-exists"/>
+    <w:bookmarkStart w:id="95" w:name="exm-orthonormal-basis-exists"/>
     <w:p>
       <w:pPr>
         <w:pStyle w:val="BodyText"/>
@@ -58181,7 +58930,7 @@
       <w:r>
         <w:t xml:space="preserve"> </w:t>
       </w:r>
-      <w:hyperlink r:id="rId93">
+      <w:hyperlink r:id="rId94">
         <w:r>
           <w:rPr>
             <w:rStyle w:val="Hyperlink"/>
@@ -58712,7 +59461,7 @@
       <w:r>
         <w:t xml:space="preserve">are linearly independent (</w:t>
       </w:r>
-      <w:hyperlink r:id="rId89">
+      <w:hyperlink r:id="rId90">
         <w:r>
           <w:rPr>
             <w:rStyle w:val="Hyperlink"/>
@@ -58776,7 +59525,7 @@
       <w:r>
         <w:t xml:space="preserve">(</w:t>
       </w:r>
-      <w:hyperlink r:id="rId74">
+      <w:hyperlink r:id="rId75">
         <w:r>
           <w:rPr>
             <w:rStyle w:val="Hyperlink"/>
@@ -58820,7 +59569,7 @@
       <w:r>
         <w:t xml:space="preserve">(</w:t>
       </w:r>
-      <w:hyperlink r:id="rId75">
+      <w:hyperlink r:id="rId76">
         <w:r>
           <w:rPr>
             <w:rStyle w:val="Hyperlink"/>
@@ -58834,7 +59583,7 @@
       <w:r>
         <w:t xml:space="preserve"> </w:t>
       </w:r>
-      <w:hyperlink r:id="rId73">
+      <w:hyperlink r:id="rId74">
         <w:r>
           <w:rPr>
             <w:rStyle w:val="Hyperlink"/>
@@ -59757,9 +60506,9 @@
         <w:t xml:space="preserve">, in a different order.</w:t>
       </w:r>
     </w:p>
-    <w:bookmarkEnd w:id="94"/>
     <w:bookmarkEnd w:id="95"/>
-    <w:bookmarkStart w:id="111" w:name="outer-product"/>
+    <w:bookmarkEnd w:id="96"/>
+    <w:bookmarkStart w:id="112" w:name="outer-product"/>
     <w:p>
       <w:pPr>
         <w:pStyle w:val="Heading2"/>
@@ -59768,7 +60517,7 @@
         <w:t xml:space="preserve">4 Outer product</w:t>
       </w:r>
     </w:p>
-    <w:bookmarkStart w:id="97" w:name="def-outer-product"/>
+    <w:bookmarkStart w:id="98" w:name="def-outer-product"/>
     <w:p>
       <w:pPr>
         <w:pStyle w:val="FirstParagraph"/>
@@ -59895,7 +60644,7 @@
       <w:r>
         <w:t xml:space="preserve">matrix product (</w:t>
       </w:r>
-      <w:hyperlink r:id="rId96">
+      <w:hyperlink r:id="rId97">
         <w:r>
           <w:rPr>
             <w:rStyle w:val="Hyperlink"/>
@@ -60185,8 +60934,8 @@
         </m:oMath>
       </m:oMathPara>
     </w:p>
-    <w:bookmarkEnd w:id="97"/>
-    <w:bookmarkStart w:id="98" w:name="exm-outer-product"/>
+    <w:bookmarkEnd w:id="98"/>
+    <w:bookmarkStart w:id="99" w:name="exm-outer-product"/>
     <w:p>
       <w:pPr>
         <w:pStyle w:val="FirstParagraph"/>
@@ -60769,8 +61518,8 @@
         </m:oMath>
       </m:oMathPara>
     </w:p>
-    <w:bookmarkEnd w:id="98"/>
-    <w:bookmarkStart w:id="100" w:name="rem-outer-vs-dot-product"/>
+    <w:bookmarkEnd w:id="99"/>
+    <w:bookmarkStart w:id="101" w:name="rem-outer-vs-dot-product"/>
     <w:p>
       <w:pPr>
         <w:pStyle w:val="FirstParagraph"/>
@@ -60831,7 +61580,7 @@
       <w:r>
         <w:t xml:space="preserve">(</w:t>
       </w:r>
-      <w:hyperlink r:id="rId99">
+      <w:hyperlink r:id="rId100">
         <w:r>
           <w:rPr>
             <w:rStyle w:val="Hyperlink"/>
@@ -61494,8 +62243,8 @@
         </m:oMath>
       </m:oMathPara>
     </w:p>
-    <w:bookmarkEnd w:id="100"/>
-    <w:bookmarkStart w:id="102" w:name="thm-outer-product-rank"/>
+    <w:bookmarkEnd w:id="101"/>
+    <w:bookmarkStart w:id="103" w:name="thm-outer-product-rank"/>
     <w:p>
       <w:pPr>
         <w:pStyle w:val="FirstParagraph"/>
@@ -61659,7 +62408,7 @@
       <w:r>
         <w:t xml:space="preserve">(</w:t>
       </w:r>
-      <w:hyperlink r:id="rId101">
+      <w:hyperlink r:id="rId102">
         <w:r>
           <w:rPr>
             <w:rStyle w:val="Hyperlink"/>
@@ -61671,7 +62420,7 @@
         <w:t xml:space="preserve">).</w:t>
       </w:r>
     </w:p>
-    <w:bookmarkEnd w:id="102"/>
+    <w:bookmarkEnd w:id="103"/>
     <w:p>
       <w:pPr>
         <w:pStyle w:val="BodyText"/>
@@ -62944,7 +63693,7 @@
         <w:t xml:space="preserve">The largest linearly independent set of columns therefore has one column.</w:t>
       </w:r>
     </w:p>
-    <w:bookmarkStart w:id="103" w:name="exm-outer-product-rank"/>
+    <w:bookmarkStart w:id="104" w:name="exm-outer-product-rank"/>
     <w:p>
       <w:pPr>
         <w:pStyle w:val="BodyText"/>
@@ -63293,9 +64042,9 @@
         <w:t xml:space="preserve">.</w:t>
       </w:r>
     </w:p>
-    <w:bookmarkEnd w:id="103"/>
-    <w:bookmarkStart w:id="110" w:name="refs"/>
-    <w:bookmarkStart w:id="105" w:name="ref-axler2024linear"/>
+    <w:bookmarkEnd w:id="104"/>
+    <w:bookmarkStart w:id="111" w:name="refs"/>
+    <w:bookmarkStart w:id="106" w:name="ref-axler2024linear"/>
     <w:p>
       <w:pPr>
         <w:pStyle w:val="Bibliography"/>
@@ -63319,7 +64068,7 @@
       <w:r>
         <w:t xml:space="preserve"> </w:t>
       </w:r>
-      <w:hyperlink r:id="rId104">
+      <w:hyperlink r:id="rId105">
         <w:r>
           <w:rPr>
             <w:rStyle w:val="Hyperlink"/>
@@ -63331,8 +64080,8 @@
         <w:t xml:space="preserve">.</w:t>
       </w:r>
     </w:p>
-    <w:bookmarkEnd w:id="105"/>
-    <w:bookmarkStart w:id="107" w:name="ref-banerjee2014linear"/>
+    <w:bookmarkEnd w:id="106"/>
+    <w:bookmarkStart w:id="108" w:name="ref-banerjee2014linear"/>
     <w:p>
       <w:pPr>
         <w:pStyle w:val="Bibliography"/>
@@ -63356,7 +64105,7 @@
       <w:r>
         <w:t xml:space="preserve"> </w:t>
       </w:r>
-      <w:hyperlink r:id="rId106">
+      <w:hyperlink r:id="rId107">
         <w:r>
           <w:rPr>
             <w:rStyle w:val="Hyperlink"/>
@@ -63368,8 +64117,8 @@
         <w:t xml:space="preserve">.</w:t>
       </w:r>
     </w:p>
-    <w:bookmarkEnd w:id="107"/>
-    <w:bookmarkStart w:id="109" w:name="ref-zhou2024vector"/>
+    <w:bookmarkEnd w:id="108"/>
+    <w:bookmarkStart w:id="110" w:name="ref-zhou2024vector"/>
     <w:p>
       <w:pPr>
         <w:pStyle w:val="Bibliography"/>
@@ -63393,7 +64142,7 @@
       <w:r>
         <w:t xml:space="preserve"> </w:t>
       </w:r>
-      <w:hyperlink r:id="rId108">
+      <w:hyperlink r:id="rId109">
         <w:r>
           <w:rPr>
             <w:rStyle w:val="Hyperlink"/>
@@ -63405,9 +64154,9 @@
         <w:t xml:space="preserve">.</w:t>
       </w:r>
     </w:p>
-    <w:bookmarkEnd w:id="109"/>
     <w:bookmarkEnd w:id="110"/>
     <w:bookmarkEnd w:id="111"/>
+    <w:bookmarkEnd w:id="112"/>
     <w:sectPr>
       <w:footnotePr>
         <w:numRestart w:val="eachSect"/>

</xml_diff>

<commit_message>
Deploying to gh-pages from @ Morrison-Lab/mds@d530aa594e6add989765ef4f1c17283630293933 🚀
</commit_message>
<xml_diff>
--- a/linear-algebra-inner-products.docx
+++ b/linear-algebra-inner-products.docx
@@ -15,7 +15,7 @@
         <w:pStyle w:val="Date"/>
       </w:pPr>
       <w:r>
-        <w:t xml:space="preserve">Last modified: 2026-10-28 20:07:26 (PDT)</w:t>
+        <w:t xml:space="preserve">Last modified: 2026-10-28 21:37:44 (PDT)</w:t>
       </w:r>
     </w:p>
     <w:bookmarkStart w:id="24" w:name="sec-inner-products"/>
@@ -3230,7 +3230,7 @@
     </w:p>
     <w:bookmarkEnd w:id="23"/>
     <w:bookmarkEnd w:id="24"/>
-    <w:bookmarkStart w:id="69" w:name="sec-cauchy-schwarz"/>
+    <w:bookmarkStart w:id="74" w:name="sec-cauchy-schwarz"/>
     <w:p>
       <w:pPr>
         <w:pStyle w:val="Heading2"/>
@@ -13947,10 +13947,1032 @@
       </w:r>
     </w:p>
     <w:bookmarkEnd w:id="58"/>
-    <w:bookmarkStart w:id="61" w:name="rem-angle-unit-circle-angle"/>
+    <w:bookmarkStart w:id="61" w:name="thm-inner-product-sign"/>
     <w:p>
       <w:pPr>
         <w:pStyle w:val="FirstParagraph"/>
+      </w:pPr>
+      <w:r>
+        <w:rPr>
+          <w:b/>
+          <w:bCs/>
+        </w:rPr>
+        <w:t xml:space="preserve">Theorem 6 (The sign of the inner product)</w:t>
+      </w:r>
+      <w:r>
+        <w:t xml:space="preserve"> </w:t>
+      </w:r>
+      <w:r>
+        <w:t xml:space="preserve">For nonzero</w:t>
+      </w:r>
+      <w:r>
+        <w:t xml:space="preserve"> </w:t>
+      </w:r>
+      <w:r>
+        <w:t xml:space="preserve">$\mathord{\smash[b]{\underset{\raise.3ex\hbox{$\scriptstyle\sim$}}{x}}\vphantom{x}}, \mathord{\smash[b]{\underset{\raise.3ex\hbox{$\scriptstyle\sim$}}{y}}\vphantom{y}}\in \mathbb{R}^p$</w:t>
+      </w:r>
+      <w:r>
+        <w:t xml:space="preserve"> </w:t>
+      </w:r>
+      <w:r>
+        <w:t xml:space="preserve">with</w:t>
+      </w:r>
+      <w:r>
+        <w:t xml:space="preserve"> </w:t>
+      </w:r>
+      <w:hyperlink w:anchor="def-angle">
+        <w:r>
+          <w:rPr>
+            <w:rStyle w:val="Hyperlink"/>
+          </w:rPr>
+          <w:t xml:space="preserve">angle</w:t>
+        </w:r>
+      </w:hyperlink>
+      <w:r>
+        <w:t xml:space="preserve"> </w:t>
+      </w:r>
+      <m:oMath>
+        <m:r>
+          <m:t>θ</m:t>
+        </m:r>
+        <m:r>
+          <m:rPr>
+            <m:sty m:val="p"/>
+          </m:rPr>
+          <m:t>∈</m:t>
+        </m:r>
+        <m:r>
+          <m:rPr>
+            <m:sty m:val="p"/>
+          </m:rPr>
+          <m:t>[</m:t>
+        </m:r>
+        <m:r>
+          <m:t>0</m:t>
+        </m:r>
+        <m:r>
+          <m:rPr>
+            <m:sty m:val="p"/>
+          </m:rPr>
+          <m:t>,</m:t>
+        </m:r>
+        <m:r>
+          <m:t>π</m:t>
+        </m:r>
+        <m:r>
+          <m:rPr>
+            <m:sty m:val="p"/>
+          </m:rPr>
+          <m:t>]</m:t>
+        </m:r>
+      </m:oMath>
+      <w:r>
+        <w:t xml:space="preserve"> </w:t>
+      </w:r>
+      <w:r>
+        <w:t xml:space="preserve">between them,</w:t>
+      </w:r>
+    </w:p>
+    <w:p>
+      <w:pPr>
+        <w:pStyle w:val="BodyText"/>
+      </w:pPr>
+      <w:r>
+        <w:t xml:space="preserve">$$\mathord{\smash[b]{\underset{\raise.3ex\hbox{$\scriptstyle\sim$}}{x}}\vphantom{x}} \cdot \mathord{\smash[b]{\underset{\raise.3ex\hbox{$\scriptstyle\sim$}}{y}}\vphantom{y}} = \mathopen{}\left\lVert\mathord{\smash[b]{\underset{\raise.3ex\hbox{$\scriptstyle\sim$}}{x}}\vphantom{x}}\right\rVert\mathclose{}_2 \mathopen{}\left\lVert\mathord{\smash[b]{\underset{\raise.3ex\hbox{$\scriptstyle\sim$}}{y}}\vphantom{y}}\right\rVert\mathclose{}_2 \cos\theta,$$</w:t>
+      </w:r>
+    </w:p>
+    <w:p>
+      <w:pPr>
+        <w:pStyle w:val="FirstParagraph"/>
+      </w:pPr>
+      <w:r>
+        <w:t xml:space="preserve">so:</w:t>
+      </w:r>
+    </w:p>
+    <w:p>
+      <w:pPr>
+        <w:pStyle w:val="Compact"/>
+        <w:numPr>
+          <w:ilvl w:val="0"/>
+          <w:numId w:val="1019"/>
+        </w:numPr>
+      </w:pPr>
+      <w:r>
+        <w:t xml:space="preserve">$\mathord{\smash[b]{\underset{\raise.3ex\hbox{$\scriptstyle\sim$}}{x}}\vphantom{x}} \cdot \mathord{\smash[b]{\underset{\raise.3ex\hbox{$\scriptstyle\sim$}}{y}}\vphantom{y}} &gt; 0$</w:t>
+      </w:r>
+      <w:r>
+        <w:t xml:space="preserve"> </w:t>
+      </w:r>
+      <w:r>
+        <w:t xml:space="preserve">when the vectors point broadly in the same</w:t>
+      </w:r>
+      <w:r>
+        <w:t xml:space="preserve"> </w:t>
+      </w:r>
+      <w:hyperlink r:id="rId59">
+        <w:r>
+          <w:rPr>
+            <w:rStyle w:val="Hyperlink"/>
+          </w:rPr>
+          <w:t xml:space="preserve">direction</w:t>
+        </w:r>
+      </w:hyperlink>
+      <w:r>
+        <w:t xml:space="preserve"> </w:t>
+      </w:r>
+      <w:r>
+        <w:t xml:space="preserve">(</w:t>
+      </w:r>
+      <m:oMath>
+        <m:r>
+          <m:t>θ</m:t>
+        </m:r>
+        <m:r>
+          <m:rPr>
+            <m:sty m:val="p"/>
+          </m:rPr>
+          <m:t>&lt;</m:t>
+        </m:r>
+        <m:r>
+          <m:t>π</m:t>
+        </m:r>
+        <m:r>
+          <m:rPr>
+            <m:sty m:val="p"/>
+          </m:rPr>
+          <m:t>/</m:t>
+        </m:r>
+        <m:r>
+          <m:t>2</m:t>
+        </m:r>
+      </m:oMath>
+      <w:r>
+        <w:t xml:space="preserve">).</w:t>
+      </w:r>
+    </w:p>
+    <w:p>
+      <w:pPr>
+        <w:pStyle w:val="Compact"/>
+        <w:numPr>
+          <w:ilvl w:val="0"/>
+          <w:numId w:val="1019"/>
+        </w:numPr>
+      </w:pPr>
+      <w:r>
+        <w:t xml:space="preserve">$\mathord{\smash[b]{\underset{\raise.3ex\hbox{$\scriptstyle\sim$}}{x}}\vphantom{x}} \cdot \mathord{\smash[b]{\underset{\raise.3ex\hbox{$\scriptstyle\sim$}}{y}}\vphantom{y}} = 0$</w:t>
+      </w:r>
+      <w:r>
+        <w:t xml:space="preserve"> </w:t>
+      </w:r>
+      <w:r>
+        <w:t xml:space="preserve">exactly when the vectors are</w:t>
+      </w:r>
+      <w:r>
+        <w:t xml:space="preserve"> </w:t>
+      </w:r>
+      <w:hyperlink r:id="rId60">
+        <w:r>
+          <w:rPr>
+            <w:rStyle w:val="Hyperlink"/>
+          </w:rPr>
+          <w:t xml:space="preserve">orthogonal</w:t>
+        </w:r>
+      </w:hyperlink>
+      <w:r>
+        <w:t xml:space="preserve"> </w:t>
+      </w:r>
+      <w:r>
+        <w:t xml:space="preserve">(</w:t>
+      </w:r>
+      <m:oMath>
+        <m:r>
+          <m:t>θ</m:t>
+        </m:r>
+        <m:r>
+          <m:rPr>
+            <m:sty m:val="p"/>
+          </m:rPr>
+          <m:t>=</m:t>
+        </m:r>
+        <m:r>
+          <m:t>π</m:t>
+        </m:r>
+        <m:r>
+          <m:rPr>
+            <m:sty m:val="p"/>
+          </m:rPr>
+          <m:t>/</m:t>
+        </m:r>
+        <m:r>
+          <m:t>2</m:t>
+        </m:r>
+      </m:oMath>
+      <w:r>
+        <w:t xml:space="preserve">).</w:t>
+      </w:r>
+    </w:p>
+    <w:p>
+      <w:pPr>
+        <w:pStyle w:val="Compact"/>
+        <w:numPr>
+          <w:ilvl w:val="0"/>
+          <w:numId w:val="1019"/>
+        </w:numPr>
+      </w:pPr>
+      <w:r>
+        <w:t xml:space="preserve">$\mathord{\smash[b]{\underset{\raise.3ex\hbox{$\scriptstyle\sim$}}{x}}\vphantom{x}} \cdot \mathord{\smash[b]{\underset{\raise.3ex\hbox{$\scriptstyle\sim$}}{y}}\vphantom{y}} &lt; 0$</w:t>
+      </w:r>
+      <w:r>
+        <w:t xml:space="preserve"> </w:t>
+      </w:r>
+      <w:r>
+        <w:t xml:space="preserve">when the vectors point broadly in opposing directions (</w:t>
+      </w:r>
+      <m:oMath>
+        <m:r>
+          <m:t>θ</m:t>
+        </m:r>
+        <m:r>
+          <m:rPr>
+            <m:sty m:val="p"/>
+          </m:rPr>
+          <m:t>&gt;</m:t>
+        </m:r>
+        <m:r>
+          <m:t>π</m:t>
+        </m:r>
+        <m:r>
+          <m:rPr>
+            <m:sty m:val="p"/>
+          </m:rPr>
+          <m:t>/</m:t>
+        </m:r>
+        <m:r>
+          <m:t>2</m:t>
+        </m:r>
+      </m:oMath>
+      <w:r>
+        <w:t xml:space="preserve">).</w:t>
+      </w:r>
+    </w:p>
+    <w:bookmarkEnd w:id="61"/>
+    <w:p>
+      <w:pPr>
+        <w:pStyle w:val="FirstParagraph"/>
+      </w:pPr>
+      <w:r>
+        <w:rPr>
+          <w:i/>
+          <w:iCs/>
+        </w:rPr>
+        <w:t xml:space="preserve">Proof</w:t>
+      </w:r>
+      <w:r>
+        <w:t xml:space="preserve">. </w:t>
+      </w:r>
+      <w:r>
+        <w:t xml:space="preserve">By the definition of the</w:t>
+      </w:r>
+      <w:r>
+        <w:t xml:space="preserve"> </w:t>
+      </w:r>
+      <w:hyperlink w:anchor="def-angle">
+        <w:r>
+          <w:rPr>
+            <w:rStyle w:val="Hyperlink"/>
+          </w:rPr>
+          <w:t xml:space="preserve">angle</w:t>
+        </w:r>
+      </w:hyperlink>
+      <w:r>
+        <w:t xml:space="preserve">,</w:t>
+      </w:r>
+      <w:r>
+        <w:t xml:space="preserve"> </w:t>
+      </w:r>
+      <m:oMath>
+        <m:r>
+          <m:rPr>
+            <m:sty m:val="p"/>
+          </m:rPr>
+          <m:t>cos</m:t>
+        </m:r>
+        <m:r>
+          <m:t>θ</m:t>
+        </m:r>
+      </m:oMath>
+      <w:r>
+        <w:t xml:space="preserve"> </w:t>
+      </w:r>
+      <w:r>
+        <w:t xml:space="preserve">is the</w:t>
+      </w:r>
+      <w:r>
+        <w:t xml:space="preserve"> </w:t>
+      </w:r>
+      <w:hyperlink w:anchor="def-cosine-similarity">
+        <w:r>
+          <w:rPr>
+            <w:rStyle w:val="Hyperlink"/>
+          </w:rPr>
+          <w:t xml:space="preserve">cosine similarity</w:t>
+        </w:r>
+      </w:hyperlink>
+      <w:r>
+        <w:t xml:space="preserve"> </w:t>
+      </w:r>
+      <w:r>
+        <w:t xml:space="preserve">$\mathord{\smash[b]{\underset{\raise.3ex\hbox{$\scriptstyle\sim$}}{x}}\vphantom{x}} \cdot \mathord{\smash[b]{\underset{\raise.3ex\hbox{$\scriptstyle\sim$}}{y}}\vphantom{y}} / (\mathopen{}\left\lVert\mathord{\smash[b]{\underset{\raise.3ex\hbox{$\scriptstyle\sim$}}{x}}\vphantom{x}}\right\rVert\mathclose{}_2 \mathopen{}\left\lVert\mathord{\smash[b]{\underset{\raise.3ex\hbox{$\scriptstyle\sim$}}{y}}\vphantom{y}}\right\rVert\mathclose{}_2)$</w:t>
+      </w:r>
+      <w:r>
+        <w:t xml:space="preserve">,</w:t>
+      </w:r>
+      <w:r>
+        <w:t xml:space="preserve"> </w:t>
+      </w:r>
+      <w:r>
+        <w:t xml:space="preserve">which gives the displayed equation.</w:t>
+      </w:r>
+      <w:r>
+        <w:t xml:space="preserve"> </w:t>
+      </w:r>
+      <w:r>
+        <w:t xml:space="preserve">Both vectors are nonzero, so their</w:t>
+      </w:r>
+      <w:r>
+        <w:t xml:space="preserve"> </w:t>
+      </w:r>
+      <w:hyperlink r:id="rId62">
+        <w:r>
+          <w:rPr>
+            <w:rStyle w:val="Hyperlink"/>
+          </w:rPr>
+          <w:t xml:space="preserve">norms</w:t>
+        </w:r>
+      </w:hyperlink>
+      <w:r>
+        <w:t xml:space="preserve"> </w:t>
+      </w:r>
+      <w:r>
+        <w:t xml:space="preserve">are positive,</w:t>
+      </w:r>
+      <w:r>
+        <w:t xml:space="preserve"> </w:t>
+      </w:r>
+      <w:r>
+        <w:t xml:space="preserve">and</w:t>
+      </w:r>
+      <w:r>
+        <w:t xml:space="preserve"> </w:t>
+      </w:r>
+      <w:r>
+        <w:t xml:space="preserve">$\mathord{\smash[b]{\underset{\raise.3ex\hbox{$\scriptstyle\sim$}}{x}}\vphantom{x}} \cdot \mathord{\smash[b]{\underset{\raise.3ex\hbox{$\scriptstyle\sim$}}{y}}\vphantom{y}}$</w:t>
+      </w:r>
+      <w:r>
+        <w:t xml:space="preserve"> </w:t>
+      </w:r>
+      <w:r>
+        <w:t xml:space="preserve">has the sign of</w:t>
+      </w:r>
+      <w:r>
+        <w:t xml:space="preserve"> </w:t>
+      </w:r>
+      <m:oMath>
+        <m:r>
+          <m:rPr>
+            <m:sty m:val="p"/>
+          </m:rPr>
+          <m:t>cos</m:t>
+        </m:r>
+        <m:r>
+          <m:t>θ</m:t>
+        </m:r>
+      </m:oMath>
+      <w:r>
+        <w:t xml:space="preserve">.</w:t>
+      </w:r>
+      <w:r>
+        <w:t xml:space="preserve"> </w:t>
+      </w:r>
+      <w:r>
+        <w:t xml:space="preserve">On</w:t>
+      </w:r>
+      <w:r>
+        <w:t xml:space="preserve"> </w:t>
+      </w:r>
+      <m:oMath>
+        <m:r>
+          <m:rPr>
+            <m:sty m:val="p"/>
+          </m:rPr>
+          <m:t>[</m:t>
+        </m:r>
+        <m:r>
+          <m:t>0</m:t>
+        </m:r>
+        <m:r>
+          <m:rPr>
+            <m:sty m:val="p"/>
+          </m:rPr>
+          <m:t>,</m:t>
+        </m:r>
+        <m:r>
+          <m:t>π</m:t>
+        </m:r>
+        <m:r>
+          <m:rPr>
+            <m:sty m:val="p"/>
+          </m:rPr>
+          <m:t>]</m:t>
+        </m:r>
+      </m:oMath>
+      <w:r>
+        <w:t xml:space="preserve">, the</w:t>
+      </w:r>
+      <w:r>
+        <w:t xml:space="preserve"> </w:t>
+      </w:r>
+      <w:hyperlink r:id="rId55">
+        <w:r>
+          <w:rPr>
+            <w:rStyle w:val="Hyperlink"/>
+          </w:rPr>
+          <w:t xml:space="preserve">cosine</w:t>
+        </w:r>
+      </w:hyperlink>
+      <w:r>
+        <w:t xml:space="preserve"> </w:t>
+      </w:r>
+      <w:r>
+        <w:t xml:space="preserve">is positive for</w:t>
+      </w:r>
+      <w:r>
+        <w:t xml:space="preserve"> </w:t>
+      </w:r>
+      <m:oMath>
+        <m:r>
+          <m:t>θ</m:t>
+        </m:r>
+        <m:r>
+          <m:rPr>
+            <m:sty m:val="p"/>
+          </m:rPr>
+          <m:t>&lt;</m:t>
+        </m:r>
+        <m:r>
+          <m:t>π</m:t>
+        </m:r>
+        <m:r>
+          <m:rPr>
+            <m:sty m:val="p"/>
+          </m:rPr>
+          <m:t>/</m:t>
+        </m:r>
+        <m:r>
+          <m:t>2</m:t>
+        </m:r>
+      </m:oMath>
+      <w:r>
+        <w:t xml:space="preserve">, zero at</w:t>
+      </w:r>
+      <w:r>
+        <w:t xml:space="preserve"> </w:t>
+      </w:r>
+      <m:oMath>
+        <m:r>
+          <m:t>π</m:t>
+        </m:r>
+        <m:r>
+          <m:rPr>
+            <m:sty m:val="p"/>
+          </m:rPr>
+          <m:t>/</m:t>
+        </m:r>
+        <m:r>
+          <m:t>2</m:t>
+        </m:r>
+      </m:oMath>
+      <w:r>
+        <w:t xml:space="preserve"> </w:t>
+      </w:r>
+      <w:r>
+        <w:t xml:space="preserve">and negative for</w:t>
+      </w:r>
+      <w:r>
+        <w:t xml:space="preserve"> </w:t>
+      </w:r>
+      <m:oMath>
+        <m:r>
+          <m:t>θ</m:t>
+        </m:r>
+        <m:r>
+          <m:rPr>
+            <m:sty m:val="p"/>
+          </m:rPr>
+          <m:t>&gt;</m:t>
+        </m:r>
+        <m:r>
+          <m:t>π</m:t>
+        </m:r>
+        <m:r>
+          <m:rPr>
+            <m:sty m:val="p"/>
+          </m:rPr>
+          <m:t>/</m:t>
+        </m:r>
+        <m:r>
+          <m:t>2</m:t>
+        </m:r>
+      </m:oMath>
+      <w:r>
+        <w:t xml:space="preserve">.</w:t>
+      </w:r>
+    </w:p>
+    <w:bookmarkStart w:id="63" w:name="exm-inner-product-sign"/>
+    <w:p>
+      <w:pPr>
+        <w:pStyle w:val="BodyText"/>
+      </w:pPr>
+      <w:r>
+        <w:rPr>
+          <w:b/>
+          <w:bCs/>
+        </w:rPr>
+        <w:t xml:space="preserve">Example 15 (The sign of the inner product in the plane)</w:t>
+      </w:r>
+      <w:r>
+        <w:t xml:space="preserve"> </w:t>
+      </w:r>
+      <w:r>
+        <w:t xml:space="preserve"> </w:t>
+      </w:r>
+    </w:p>
+    <w:p>
+      <w:pPr>
+        <w:pStyle w:val="Compact"/>
+        <w:numPr>
+          <w:ilvl w:val="0"/>
+          <w:numId w:val="1020"/>
+        </w:numPr>
+      </w:pPr>
+      <m:oMath>
+        <m:r>
+          <m:rPr>
+            <m:sty m:val="p"/>
+          </m:rPr>
+          <m:t>(</m:t>
+        </m:r>
+        <m:r>
+          <m:t>1</m:t>
+        </m:r>
+        <m:r>
+          <m:rPr>
+            <m:sty m:val="p"/>
+          </m:rPr>
+          <m:t>,</m:t>
+        </m:r>
+        <m:r>
+          <m:t>0</m:t>
+        </m:r>
+        <m:r>
+          <m:rPr>
+            <m:sty m:val="p"/>
+          </m:rPr>
+          <m:t>)</m:t>
+        </m:r>
+      </m:oMath>
+      <w:r>
+        <w:t xml:space="preserve"> </w:t>
+      </w:r>
+      <w:r>
+        <w:t xml:space="preserve">and</w:t>
+      </w:r>
+      <w:r>
+        <w:t xml:space="preserve"> </w:t>
+      </w:r>
+      <m:oMath>
+        <m:r>
+          <m:rPr>
+            <m:sty m:val="p"/>
+          </m:rPr>
+          <m:t>(</m:t>
+        </m:r>
+        <m:r>
+          <m:t>1</m:t>
+        </m:r>
+        <m:r>
+          <m:rPr>
+            <m:sty m:val="p"/>
+          </m:rPr>
+          <m:t>,</m:t>
+        </m:r>
+        <m:r>
+          <m:t>1</m:t>
+        </m:r>
+        <m:r>
+          <m:rPr>
+            <m:sty m:val="p"/>
+          </m:rPr>
+          <m:t>)</m:t>
+        </m:r>
+      </m:oMath>
+      <w:r>
+        <w:t xml:space="preserve"> </w:t>
+      </w:r>
+      <w:r>
+        <w:t xml:space="preserve">have</w:t>
+      </w:r>
+      <w:r>
+        <w:t xml:space="preserve"> </w:t>
+      </w:r>
+      <w:hyperlink w:anchor="def-inner-product">
+        <w:r>
+          <w:rPr>
+            <w:rStyle w:val="Hyperlink"/>
+          </w:rPr>
+          <w:t xml:space="preserve">inner product</w:t>
+        </w:r>
+      </w:hyperlink>
+      <w:r>
+        <w:t xml:space="preserve"> </w:t>
+      </w:r>
+      <m:oMath>
+        <m:r>
+          <m:t>1</m:t>
+        </m:r>
+        <m:r>
+          <m:rPr>
+            <m:sty m:val="p"/>
+          </m:rPr>
+          <m:t>&gt;</m:t>
+        </m:r>
+        <m:r>
+          <m:t>0</m:t>
+        </m:r>
+      </m:oMath>
+      <w:r>
+        <w:t xml:space="preserve"> </w:t>
+      </w:r>
+      <w:r>
+        <w:t xml:space="preserve">and</w:t>
+      </w:r>
+      <w:r>
+        <w:t xml:space="preserve"> </w:t>
+      </w:r>
+      <w:hyperlink w:anchor="def-angle">
+        <w:r>
+          <w:rPr>
+            <w:rStyle w:val="Hyperlink"/>
+          </w:rPr>
+          <w:t xml:space="preserve">angle</w:t>
+        </w:r>
+      </w:hyperlink>
+      <w:r>
+        <w:t xml:space="preserve"> </w:t>
+      </w:r>
+      <m:oMath>
+        <m:r>
+          <m:t>π</m:t>
+        </m:r>
+        <m:r>
+          <m:rPr>
+            <m:sty m:val="p"/>
+          </m:rPr>
+          <m:t>/</m:t>
+        </m:r>
+        <m:r>
+          <m:t>4</m:t>
+        </m:r>
+        <m:r>
+          <m:rPr>
+            <m:sty m:val="p"/>
+          </m:rPr>
+          <m:t>&lt;</m:t>
+        </m:r>
+        <m:r>
+          <m:t>π</m:t>
+        </m:r>
+        <m:r>
+          <m:rPr>
+            <m:sty m:val="p"/>
+          </m:rPr>
+          <m:t>/</m:t>
+        </m:r>
+        <m:r>
+          <m:t>2</m:t>
+        </m:r>
+      </m:oMath>
+      <w:r>
+        <w:t xml:space="preserve">.</w:t>
+      </w:r>
+    </w:p>
+    <w:p>
+      <w:pPr>
+        <w:pStyle w:val="Compact"/>
+        <w:numPr>
+          <w:ilvl w:val="0"/>
+          <w:numId w:val="1020"/>
+        </w:numPr>
+      </w:pPr>
+      <m:oMath>
+        <m:r>
+          <m:rPr>
+            <m:sty m:val="p"/>
+          </m:rPr>
+          <m:t>(</m:t>
+        </m:r>
+        <m:r>
+          <m:t>1</m:t>
+        </m:r>
+        <m:r>
+          <m:rPr>
+            <m:sty m:val="p"/>
+          </m:rPr>
+          <m:t>,</m:t>
+        </m:r>
+        <m:r>
+          <m:t>2</m:t>
+        </m:r>
+        <m:r>
+          <m:rPr>
+            <m:sty m:val="p"/>
+          </m:rPr>
+          <m:t>)</m:t>
+        </m:r>
+      </m:oMath>
+      <w:r>
+        <w:t xml:space="preserve"> </w:t>
+      </w:r>
+      <w:r>
+        <w:t xml:space="preserve">and</w:t>
+      </w:r>
+      <w:r>
+        <w:t xml:space="preserve"> </w:t>
+      </w:r>
+      <m:oMath>
+        <m:r>
+          <m:rPr>
+            <m:sty m:val="p"/>
+          </m:rPr>
+          <m:t>(</m:t>
+        </m:r>
+        <m:r>
+          <m:rPr>
+            <m:sty m:val="p"/>
+          </m:rPr>
+          <m:t>−</m:t>
+        </m:r>
+        <m:r>
+          <m:t>2</m:t>
+        </m:r>
+        <m:r>
+          <m:rPr>
+            <m:sty m:val="p"/>
+          </m:rPr>
+          <m:t>,</m:t>
+        </m:r>
+        <m:r>
+          <m:t>1</m:t>
+        </m:r>
+        <m:r>
+          <m:rPr>
+            <m:sty m:val="p"/>
+          </m:rPr>
+          <m:t>)</m:t>
+        </m:r>
+      </m:oMath>
+      <w:r>
+        <w:t xml:space="preserve"> </w:t>
+      </w:r>
+      <w:r>
+        <w:t xml:space="preserve">have inner product</w:t>
+      </w:r>
+      <w:r>
+        <w:t xml:space="preserve"> </w:t>
+      </w:r>
+      <m:oMath>
+        <m:r>
+          <m:rPr>
+            <m:sty m:val="p"/>
+          </m:rPr>
+          <m:t>−</m:t>
+        </m:r>
+        <m:r>
+          <m:t>2</m:t>
+        </m:r>
+        <m:r>
+          <m:rPr>
+            <m:sty m:val="p"/>
+          </m:rPr>
+          <m:t>+</m:t>
+        </m:r>
+        <m:r>
+          <m:t>2</m:t>
+        </m:r>
+        <m:r>
+          <m:rPr>
+            <m:sty m:val="p"/>
+          </m:rPr>
+          <m:t>=</m:t>
+        </m:r>
+        <m:r>
+          <m:t>0</m:t>
+        </m:r>
+      </m:oMath>
+      <w:r>
+        <w:t xml:space="preserve"> </w:t>
+      </w:r>
+      <w:r>
+        <w:t xml:space="preserve">and angle</w:t>
+      </w:r>
+      <w:r>
+        <w:t xml:space="preserve"> </w:t>
+      </w:r>
+      <m:oMath>
+        <m:r>
+          <m:t>π</m:t>
+        </m:r>
+        <m:r>
+          <m:rPr>
+            <m:sty m:val="p"/>
+          </m:rPr>
+          <m:t>/</m:t>
+        </m:r>
+        <m:r>
+          <m:t>2</m:t>
+        </m:r>
+      </m:oMath>
+      <w:r>
+        <w:t xml:space="preserve">.</w:t>
+      </w:r>
+    </w:p>
+    <w:p>
+      <w:pPr>
+        <w:pStyle w:val="Compact"/>
+        <w:numPr>
+          <w:ilvl w:val="0"/>
+          <w:numId w:val="1020"/>
+        </w:numPr>
+      </w:pPr>
+      <m:oMath>
+        <m:r>
+          <m:rPr>
+            <m:sty m:val="p"/>
+          </m:rPr>
+          <m:t>(</m:t>
+        </m:r>
+        <m:r>
+          <m:t>1</m:t>
+        </m:r>
+        <m:r>
+          <m:rPr>
+            <m:sty m:val="p"/>
+          </m:rPr>
+          <m:t>,</m:t>
+        </m:r>
+        <m:r>
+          <m:t>0</m:t>
+        </m:r>
+        <m:r>
+          <m:rPr>
+            <m:sty m:val="p"/>
+          </m:rPr>
+          <m:t>)</m:t>
+        </m:r>
+      </m:oMath>
+      <w:r>
+        <w:t xml:space="preserve"> </w:t>
+      </w:r>
+      <w:r>
+        <w:t xml:space="preserve">and</w:t>
+      </w:r>
+      <w:r>
+        <w:t xml:space="preserve"> </w:t>
+      </w:r>
+      <m:oMath>
+        <m:r>
+          <m:rPr>
+            <m:sty m:val="p"/>
+          </m:rPr>
+          <m:t>(</m:t>
+        </m:r>
+        <m:r>
+          <m:rPr>
+            <m:sty m:val="p"/>
+          </m:rPr>
+          <m:t>−</m:t>
+        </m:r>
+        <m:r>
+          <m:t>3</m:t>
+        </m:r>
+        <m:r>
+          <m:rPr>
+            <m:sty m:val="p"/>
+          </m:rPr>
+          <m:t>,</m:t>
+        </m:r>
+        <m:r>
+          <m:t>0</m:t>
+        </m:r>
+        <m:r>
+          <m:rPr>
+            <m:sty m:val="p"/>
+          </m:rPr>
+          <m:t>)</m:t>
+        </m:r>
+      </m:oMath>
+      <w:r>
+        <w:t xml:space="preserve"> </w:t>
+      </w:r>
+      <w:r>
+        <w:t xml:space="preserve">have inner product</w:t>
+      </w:r>
+      <w:r>
+        <w:t xml:space="preserve"> </w:t>
+      </w:r>
+      <m:oMath>
+        <m:r>
+          <m:rPr>
+            <m:sty m:val="p"/>
+          </m:rPr>
+          <m:t>−</m:t>
+        </m:r>
+        <m:r>
+          <m:t>3</m:t>
+        </m:r>
+        <m:r>
+          <m:rPr>
+            <m:sty m:val="p"/>
+          </m:rPr>
+          <m:t>&lt;</m:t>
+        </m:r>
+        <m:r>
+          <m:t>0</m:t>
+        </m:r>
+      </m:oMath>
+      <w:r>
+        <w:t xml:space="preserve"> </w:t>
+      </w:r>
+      <w:r>
+        <w:t xml:space="preserve">and angle</w:t>
+      </w:r>
+      <w:r>
+        <w:t xml:space="preserve"> </w:t>
+      </w:r>
+      <m:oMath>
+        <m:r>
+          <m:t>π</m:t>
+        </m:r>
+        <m:r>
+          <m:rPr>
+            <m:sty m:val="p"/>
+          </m:rPr>
+          <m:t>&gt;</m:t>
+        </m:r>
+        <m:r>
+          <m:t>π</m:t>
+        </m:r>
+        <m:r>
+          <m:rPr>
+            <m:sty m:val="p"/>
+          </m:rPr>
+          <m:t>/</m:t>
+        </m:r>
+        <m:r>
+          <m:t>2</m:t>
+        </m:r>
+      </m:oMath>
+      <w:r>
+        <w:t xml:space="preserve">.</w:t>
+      </w:r>
+    </w:p>
+    <w:p>
+      <w:pPr>
+        <w:pStyle w:val="FirstParagraph"/>
+      </w:pPr>
+      <w:r>
+        <w:t xml:space="preserve">These are the pairs of</w:t>
+      </w:r>
+      <w:r>
+        <w:t xml:space="preserve"> </w:t>
+      </w:r>
+      <w:hyperlink w:anchor="exm-angle">
+        <w:r>
+          <w:rPr>
+            <w:rStyle w:val="Hyperlink"/>
+          </w:rPr>
+          <w:t xml:space="preserve">Example 14</w:t>
+        </w:r>
+      </w:hyperlink>
+      <w:r>
+        <w:t xml:space="preserve">.</w:t>
+      </w:r>
+    </w:p>
+    <w:bookmarkEnd w:id="63"/>
+    <w:bookmarkStart w:id="66" w:name="rem-angle-unit-circle-angle"/>
+    <w:p>
+      <w:pPr>
+        <w:pStyle w:val="BodyText"/>
       </w:pPr>
       <w:r>
         <w:rPr>
@@ -14000,7 +15022,7 @@
       <w:r>
         <w:t xml:space="preserve"> </w:t>
       </w:r>
-      <w:hyperlink r:id="rId59">
+      <w:hyperlink r:id="rId64">
         <w:r>
           <w:rPr>
             <w:rStyle w:val="Hyperlink"/>
@@ -14064,7 +15086,7 @@
       <w:r>
         <w:t xml:space="preserve"> </w:t>
       </w:r>
-      <w:hyperlink r:id="rId60">
+      <w:hyperlink r:id="rId65">
         <w:r>
           <w:rPr>
             <w:rStyle w:val="Hyperlink"/>
@@ -14279,8 +15301,8 @@
         <w:t xml:space="preserve">.</w:t>
       </w:r>
     </w:p>
-    <w:bookmarkEnd w:id="61"/>
-    <w:bookmarkStart w:id="62" w:name="X64c41f557e7f698c947bb0d906d626137043d1e"/>
+    <w:bookmarkEnd w:id="66"/>
+    <w:bookmarkStart w:id="67" w:name="X64c41f557e7f698c947bb0d906d626137043d1e"/>
     <w:p>
       <w:pPr>
         <w:pStyle w:val="BodyText"/>
@@ -14411,8 +15433,8 @@
     $$</w:t>
       </w:r>
     </w:p>
-    <w:bookmarkEnd w:id="62"/>
-    <w:bookmarkStart w:id="63" w:name="cor-cosine-similarity-unit-vectors"/>
+    <w:bookmarkEnd w:id="67"/>
+    <w:bookmarkStart w:id="68" w:name="cor-cosine-similarity-unit-vectors"/>
     <w:p>
       <w:pPr>
         <w:pStyle w:val="FirstParagraph"/>
@@ -14491,7 +15513,7 @@
     $$</w:t>
       </w:r>
     </w:p>
-    <w:bookmarkEnd w:id="63"/>
+    <w:bookmarkEnd w:id="68"/>
     <w:p>
       <w:pPr>
         <w:pStyle w:val="FirstParagraph"/>
@@ -14548,7 +15570,7 @@
     $$</w:t>
       </w:r>
     </w:p>
-    <w:bookmarkStart w:id="65" w:name="thm-pearson-cosine-centered"/>
+    <w:bookmarkStart w:id="70" w:name="thm-pearson-cosine-centered"/>
     <w:p>
       <w:pPr>
         <w:pStyle w:val="FirstParagraph"/>
@@ -14558,7 +15580,7 @@
           <w:b/>
           <w:bCs/>
         </w:rPr>
-        <w:t xml:space="preserve">Theorem 6 (Pearson correlation is the cosine similarity of the centered vectors)</w:t>
+        <w:t xml:space="preserve">Theorem 7 (Pearson correlation is the cosine similarity of the centered vectors)</w:t>
       </w:r>
       <w:r>
         <w:t xml:space="preserve"> </w:t>
@@ -14802,7 +15824,7 @@
       <w:r>
         <w:t xml:space="preserve"> </w:t>
       </w:r>
-      <w:hyperlink r:id="rId64">
+      <w:hyperlink r:id="rId69">
         <w:r>
           <w:rPr>
             <w:rStyle w:val="Hyperlink"/>
@@ -14913,7 +15935,7 @@
     $$</w:t>
       </w:r>
     </w:p>
-    <w:bookmarkEnd w:id="65"/>
+    <w:bookmarkEnd w:id="70"/>
     <w:p>
       <w:pPr>
         <w:pStyle w:val="FirstParagraph"/>
@@ -15131,7 +16153,7 @@
         <w:t xml:space="preserve">.</w:t>
       </w:r>
     </w:p>
-    <w:bookmarkStart w:id="66" w:name="exm-pearson-cosine-centered"/>
+    <w:bookmarkStart w:id="71" w:name="exm-pearson-cosine-centered"/>
     <w:p>
       <w:pPr>
         <w:pStyle w:val="BodyText"/>
@@ -15141,7 +16163,7 @@
           <w:b/>
           <w:bCs/>
         </w:rPr>
-        <w:t xml:space="preserve">Example 15 (Centering changes the cosine similarity)</w:t>
+        <w:t xml:space="preserve">Example 16 (Centering changes the cosine similarity)</w:t>
       </w:r>
       <w:r>
         <w:t xml:space="preserve"> </w:t>
@@ -15341,8 +16363,8 @@
         <w:t xml:space="preserve">mostly because both vectors have positive entries and the same mean, not because they move together.</w:t>
       </w:r>
     </w:p>
-    <w:bookmarkEnd w:id="66"/>
-    <w:bookmarkStart w:id="67" w:name="cor-pearson-angle"/>
+    <w:bookmarkEnd w:id="71"/>
+    <w:bookmarkStart w:id="72" w:name="cor-pearson-angle"/>
     <w:p>
       <w:pPr>
         <w:pStyle w:val="BodyText"/>
@@ -15380,7 +16402,7 @@
           <w:rPr>
             <w:rStyle w:val="Hyperlink"/>
           </w:rPr>
-          <w:t xml:space="preserve">Theorem 6</w:t>
+          <w:t xml:space="preserve">Theorem 7</w:t>
         </w:r>
       </w:hyperlink>
       <w:r>
@@ -15450,7 +16472,7 @@
       <w:r>
         <w:t xml:space="preserve"> </w:t>
       </w:r>
-      <w:hyperlink r:id="rId64">
+      <w:hyperlink r:id="rId69">
         <w:r>
           <w:rPr>
             <w:rStyle w:val="Hyperlink"/>
@@ -15509,7 +16531,7 @@
         </m:oMath>
       </m:oMathPara>
     </w:p>
-    <w:bookmarkEnd w:id="67"/>
+    <w:bookmarkEnd w:id="72"/>
     <w:p>
       <w:pPr>
         <w:pStyle w:val="FirstParagraph"/>
@@ -15535,7 +16557,7 @@
           <w:rPr>
             <w:rStyle w:val="Hyperlink"/>
           </w:rPr>
-          <w:t xml:space="preserve">Theorem 6</w:t>
+          <w:t xml:space="preserve">Theorem 7</w:t>
         </w:r>
       </w:hyperlink>
       <w:r>
@@ -15609,7 +16631,7 @@
         <w:t xml:space="preserve">).</w:t>
       </w:r>
     </w:p>
-    <w:bookmarkStart w:id="68" w:name="exm-pearson-angle"/>
+    <w:bookmarkStart w:id="73" w:name="exm-pearson-angle"/>
     <w:p>
       <w:pPr>
         <w:pStyle w:val="BodyText"/>
@@ -15619,7 +16641,7 @@
           <w:b/>
           <w:bCs/>
         </w:rPr>
-        <w:t xml:space="preserve">Example 16 (A correlation of one half is an angle of sixty degrees)</w:t>
+        <w:t xml:space="preserve">Example 17 (A correlation of one half is an angle of sixty degrees)</w:t>
       </w:r>
       <w:r>
         <w:t xml:space="preserve"> </w:t>
@@ -15635,7 +16657,7 @@
           <w:rPr>
             <w:rStyle w:val="Hyperlink"/>
           </w:rPr>
-          <w:t xml:space="preserve">Example 15</w:t>
+          <w:t xml:space="preserve">Example 16</w:t>
         </w:r>
       </w:hyperlink>
       <w:r>
@@ -15840,9 +16862,9 @@
         <w:t xml:space="preserve">.</w:t>
       </w:r>
     </w:p>
-    <w:bookmarkEnd w:id="68"/>
-    <w:bookmarkEnd w:id="69"/>
-    <w:bookmarkStart w:id="101" w:name="sec-gram-schmidt"/>
+    <w:bookmarkEnd w:id="73"/>
+    <w:bookmarkEnd w:id="74"/>
+    <w:bookmarkStart w:id="106" w:name="sec-gram-schmidt"/>
     <w:p>
       <w:pPr>
         <w:pStyle w:val="Heading2"/>
@@ -15892,12 +16914,12 @@
                 <wp:inline>
                   <wp:extent cx="152400" cy="152400"/>
                   <wp:effectExtent b="0" l="0" r="0" t="0"/>
-                  <wp:docPr descr="" title="" id="70" name="Picture"/>
+                  <wp:docPr descr="" title="" id="75" name="Picture"/>
                   <a:graphic>
                     <a:graphicData uri="http://schemas.openxmlformats.org/drawingml/2006/picture">
                       <pic:pic>
                         <pic:nvPicPr>
-                          <pic:cNvPr descr="/opt/quarto/share/formats/docx/note.png" id="71" name="Picture"/>
+                          <pic:cNvPr descr="/opt/quarto/share/formats/docx/note.png" id="76" name="Picture"/>
                           <pic:cNvPicPr>
                             <a:picLocks noChangeArrowheads="1" noChangeAspect="1"/>
                           </pic:cNvPicPr>
@@ -16028,7 +17050,7 @@
         </w:tc>
       </w:tr>
     </w:tbl>
-    <w:bookmarkStart w:id="72" w:name="thm-dot-linear-sum"/>
+    <w:bookmarkStart w:id="77" w:name="thm-dot-linear-sum"/>
     <w:p>
       <w:pPr>
         <w:pStyle w:val="BodyText"/>
@@ -16038,7 +17060,7 @@
           <w:b/>
           <w:bCs/>
         </w:rPr>
-        <w:t xml:space="preserve">Theorem 7 (The dot product of a vector with a linear combination)</w:t>
+        <w:t xml:space="preserve">Theorem 8 (The dot product of a vector with a linear combination)</w:t>
       </w:r>
       <w:r>
         <w:t xml:space="preserve"> </w:t>
@@ -16140,7 +17162,7 @@
     $$</w:t>
       </w:r>
     </w:p>
-    <w:bookmarkEnd w:id="72"/>
+    <w:bookmarkEnd w:id="77"/>
     <w:p>
       <w:pPr>
         <w:pStyle w:val="FirstParagraph"/>
@@ -16237,7 +17259,7 @@
     $$</w:t>
       </w:r>
     </w:p>
-    <w:bookmarkStart w:id="73" w:name="exm-dot-linear-sum"/>
+    <w:bookmarkStart w:id="78" w:name="exm-dot-linear-sum"/>
     <w:p>
       <w:pPr>
         <w:pStyle w:val="FirstParagraph"/>
@@ -16247,7 +17269,7 @@
           <w:b/>
           <w:bCs/>
         </w:rPr>
-        <w:t xml:space="preserve">Example 17 (Dotting with a combination of three vectors)</w:t>
+        <w:t xml:space="preserve">Example 18 (Dotting with a combination of three vectors)</w:t>
       </w:r>
       <w:r>
         <w:t xml:space="preserve"> </w:t>
@@ -16478,7 +17500,7 @@
           <w:rPr>
             <w:rStyle w:val="Hyperlink"/>
           </w:rPr>
-          <w:t xml:space="preserve">Theorem 7</w:t>
+          <w:t xml:space="preserve">Theorem 8</w:t>
         </w:r>
       </w:hyperlink>
       <w:r>
@@ -16550,8 +17572,8 @@
         <w:t xml:space="preserve">, the same number.</w:t>
       </w:r>
     </w:p>
-    <w:bookmarkEnd w:id="73"/>
-    <w:bookmarkStart w:id="75" w:name="thm-orthonormal-independent"/>
+    <w:bookmarkEnd w:id="78"/>
+    <w:bookmarkStart w:id="80" w:name="thm-orthonormal-independent"/>
     <w:p>
       <w:pPr>
         <w:pStyle w:val="BodyText"/>
@@ -16561,7 +17583,7 @@
           <w:b/>
           <w:bCs/>
         </w:rPr>
-        <w:t xml:space="preserve">Theorem 8 (Orthonormal vectors are linearly independent)</w:t>
+        <w:t xml:space="preserve">Theorem 9 (Orthonormal vectors are linearly independent)</w:t>
       </w:r>
       <w:r>
         <w:t xml:space="preserve"> </w:t>
@@ -16581,7 +17603,7 @@
       <w:r>
         <w:t xml:space="preserve">are orthonormal (</w:t>
       </w:r>
-      <w:hyperlink r:id="rId74">
+      <w:hyperlink r:id="rId79">
         <w:r>
           <w:rPr>
             <w:rStyle w:val="Hyperlink"/>
@@ -16610,7 +17632,7 @@
         <w:t xml:space="preserve">).</w:t>
       </w:r>
     </w:p>
-    <w:bookmarkEnd w:id="75"/>
+    <w:bookmarkEnd w:id="80"/>
     <w:p>
       <w:pPr>
         <w:pStyle w:val="BodyText"/>
@@ -16722,7 +17744,7 @@
     &amp;&amp; \text{(substitute the supposed equation)}
     \\
     &amp;= \sum_{j=1}^{k} c_j\,(\mathord{\smash[b]{\underset{\raise.3ex\hbox{$\scriptstyle\sim$}}{q}}\vphantom{q}}_i \cdot \mathord{\smash[b]{\underset{\raise.3ex\hbox{$\scriptstyle\sim$}}{q}}\vphantom{q}}_j)
-    &amp;&amp; \text{(}\text{Theorem~7}\text{)}
+    &amp;&amp; \text{(}\text{Theorem~8}\text{)}
     \\
     &amp;= c_i.
     &amp;&amp; \text{(} \mathord{\smash[b]{\underset{\raise.3ex\hbox{$\scriptstyle\sim$}}{q}}\vphantom{q}}_i \cdot \mathord{\smash[b]{\underset{\raise.3ex\hbox{$\scriptstyle\sim$}}{q}}\vphantom{q}}_j \text{ is } 1 \text{ if } j = i \text{ and } 0 \text{ otherwise)}
@@ -16767,7 +17789,7 @@
         <w:t xml:space="preserve">.</w:t>
       </w:r>
     </w:p>
-    <w:bookmarkStart w:id="76" w:name="exm-orthonormal-independent"/>
+    <w:bookmarkStart w:id="81" w:name="exm-orthonormal-independent"/>
     <w:p>
       <w:pPr>
         <w:pStyle w:val="BodyText"/>
@@ -16777,7 +17799,7 @@
           <w:b/>
           <w:bCs/>
         </w:rPr>
-        <w:t xml:space="preserve">Example 18 (Three orthonormal vectors in</w:t>
+        <w:t xml:space="preserve">Example 19 (Three orthonormal vectors in</w:t>
       </w:r>
       <w:r>
         <w:rPr>
@@ -16960,7 +17982,7 @@
           <w:rPr>
             <w:rStyle w:val="Hyperlink"/>
           </w:rPr>
-          <w:t xml:space="preserve">Theorem 8</w:t>
+          <w:t xml:space="preserve">Theorem 9</w:t>
         </w:r>
       </w:hyperlink>
       <w:r>
@@ -17383,8 +18405,8 @@
         <w:t xml:space="preserve">.</w:t>
       </w:r>
     </w:p>
-    <w:bookmarkEnd w:id="76"/>
-    <w:bookmarkStart w:id="78" w:name="def-orthonormal-basis"/>
+    <w:bookmarkEnd w:id="81"/>
+    <w:bookmarkStart w:id="83" w:name="def-orthonormal-basis"/>
     <w:p>
       <w:pPr>
         <w:pStyle w:val="BodyText"/>
@@ -17487,7 +18509,7 @@
       <w:r>
         <w:t xml:space="preserve">(</w:t>
       </w:r>
-      <w:hyperlink r:id="rId77">
+      <w:hyperlink r:id="rId82">
         <w:r>
           <w:rPr>
             <w:rStyle w:val="Hyperlink"/>
@@ -17504,7 +18526,7 @@
       <w:r>
         <w:t xml:space="preserve">whose vectors are orthonormal (</w:t>
       </w:r>
-      <w:hyperlink r:id="rId74">
+      <w:hyperlink r:id="rId79">
         <w:r>
           <w:rPr>
             <w:rStyle w:val="Hyperlink"/>
@@ -17516,8 +18538,8 @@
         <w:t xml:space="preserve">).</w:t>
       </w:r>
     </w:p>
-    <w:bookmarkEnd w:id="78"/>
-    <w:bookmarkStart w:id="82" w:name="exm-orthonormal-basis"/>
+    <w:bookmarkEnd w:id="83"/>
+    <w:bookmarkStart w:id="87" w:name="exm-orthonormal-basis"/>
     <w:p>
       <w:pPr>
         <w:pStyle w:val="BodyText"/>
@@ -17527,7 +18549,7 @@
           <w:b/>
           <w:bCs/>
         </w:rPr>
-        <w:t xml:space="preserve">Example 19 (Orthonormal bases of</w:t>
+        <w:t xml:space="preserve">Example 20 (Orthonormal bases of</w:t>
       </w:r>
       <w:r>
         <w:rPr>
@@ -17573,7 +18595,7 @@
         <w:pStyle w:val="Compact"/>
         <w:numPr>
           <w:ilvl w:val="0"/>
-          <w:numId w:val="1019"/>
+          <w:numId w:val="1021"/>
         </w:numPr>
       </w:pPr>
       <w:r>
@@ -17630,7 +18652,7 @@
       <w:r>
         <w:t xml:space="preserve">(</w:t>
       </w:r>
-      <w:hyperlink r:id="rId79">
+      <w:hyperlink r:id="rId84">
         <w:r>
           <w:rPr>
             <w:rStyle w:val="Hyperlink"/>
@@ -17647,7 +18669,7 @@
         <w:pStyle w:val="Compact"/>
         <w:numPr>
           <w:ilvl w:val="0"/>
-          <w:numId w:val="1019"/>
+          <w:numId w:val="1021"/>
         </w:numPr>
       </w:pPr>
       <w:r>
@@ -17673,7 +18695,7 @@
           <w:rPr>
             <w:rStyle w:val="Hyperlink"/>
           </w:rPr>
-          <w:t xml:space="preserve">Example 18</w:t>
+          <w:t xml:space="preserve">Example 19</w:t>
         </w:r>
       </w:hyperlink>
       <w:r>
@@ -17688,7 +18710,7 @@
       <w:r>
         <w:t xml:space="preserve">so they are a basis of their span (</w:t>
       </w:r>
-      <w:hyperlink r:id="rId77">
+      <w:hyperlink r:id="rId82">
         <w:r>
           <w:rPr>
             <w:rStyle w:val="Hyperlink"/>
@@ -17719,7 +18741,7 @@
       <w:r>
         <w:t xml:space="preserve">(</w:t>
       </w:r>
-      <w:hyperlink r:id="rId80">
+      <w:hyperlink r:id="rId85">
         <w:r>
           <w:rPr>
             <w:rStyle w:val="Hyperlink"/>
@@ -17763,7 +18785,7 @@
       <w:r>
         <w:t xml:space="preserve">(</w:t>
       </w:r>
-      <w:hyperlink r:id="rId81">
+      <w:hyperlink r:id="rId86">
         <w:r>
           <w:rPr>
             <w:rStyle w:val="Hyperlink"/>
@@ -17777,7 +18799,7 @@
       <w:r>
         <w:t xml:space="preserve"> </w:t>
       </w:r>
-      <w:hyperlink r:id="rId79">
+      <w:hyperlink r:id="rId84">
         <w:r>
           <w:rPr>
             <w:rStyle w:val="Hyperlink"/>
@@ -17822,8 +18844,8 @@
         <w:t xml:space="preserve">too.</w:t>
       </w:r>
     </w:p>
-    <w:bookmarkEnd w:id="82"/>
-    <w:bookmarkStart w:id="85" w:name="exm-not-orthonormal-basis"/>
+    <w:bookmarkEnd w:id="87"/>
+    <w:bookmarkStart w:id="90" w:name="exm-not-orthonormal-basis"/>
     <w:p>
       <w:pPr>
         <w:pStyle w:val="FirstParagraph"/>
@@ -17833,7 +18855,7 @@
           <w:b/>
           <w:bCs/>
         </w:rPr>
-        <w:t xml:space="preserve">Example 20 (Bases that are not orthonormal, and orthonormal lists that are not bases)</w:t>
+        <w:t xml:space="preserve">Example 21 (Bases that are not orthonormal, and orthonormal lists that are not bases)</w:t>
       </w:r>
       <w:r>
         <w:t xml:space="preserve"> </w:t>
@@ -17847,7 +18869,7 @@
         <w:pStyle w:val="Compact"/>
         <w:numPr>
           <w:ilvl w:val="0"/>
-          <w:numId w:val="1020"/>
+          <w:numId w:val="1022"/>
         </w:numPr>
       </w:pPr>
       <m:oMath>
@@ -17939,7 +18961,7 @@
       <w:r>
         <w:t xml:space="preserve">(</w:t>
       </w:r>
-      <w:hyperlink r:id="rId83">
+      <w:hyperlink r:id="rId88">
         <w:r>
           <w:rPr>
             <w:rStyle w:val="Hyperlink"/>
@@ -18033,7 +19055,7 @@
         <w:pStyle w:val="Compact"/>
         <w:numPr>
           <w:ilvl w:val="0"/>
-          <w:numId w:val="1020"/>
+          <w:numId w:val="1022"/>
         </w:numPr>
       </w:pPr>
       <m:oMath>
@@ -18169,7 +19191,7 @@
       <w:r>
         <w:t xml:space="preserve">(</w:t>
       </w:r>
-      <w:hyperlink r:id="rId84">
+      <w:hyperlink r:id="rId89">
         <w:r>
           <w:rPr>
             <w:rStyle w:val="Hyperlink"/>
@@ -18228,8 +19250,8 @@
         <w:t xml:space="preserve">.</w:t>
       </w:r>
     </w:p>
-    <w:bookmarkEnd w:id="85"/>
-    <w:bookmarkStart w:id="86" w:name="thm-orthonormal-expansion"/>
+    <w:bookmarkEnd w:id="90"/>
+    <w:bookmarkStart w:id="91" w:name="thm-orthonormal-expansion"/>
     <w:p>
       <w:pPr>
         <w:pStyle w:val="FirstParagraph"/>
@@ -18239,7 +19261,7 @@
           <w:b/>
           <w:bCs/>
         </w:rPr>
-        <w:t xml:space="preserve">Theorem 9 (Coordinates in an orthonormal basis are dot products)</w:t>
+        <w:t xml:space="preserve">Theorem 10 (Coordinates in an orthonormal basis are dot products)</w:t>
       </w:r>
       <w:r>
         <w:t xml:space="preserve"> </w:t>
@@ -18311,7 +19333,7 @@
     $$</w:t>
       </w:r>
     </w:p>
-    <w:bookmarkEnd w:id="86"/>
+    <w:bookmarkEnd w:id="91"/>
     <w:p>
       <w:pPr>
         <w:pStyle w:val="FirstParagraph"/>
@@ -18412,7 +19434,7 @@
     &amp;&amp; \text{(substitute)}
     \\
     &amp;= \sum_{j=1}^{k} c_j\,(\mathord{\smash[b]{\underset{\raise.3ex\hbox{$\scriptstyle\sim$}}{q}}\vphantom{q}}_i \cdot \mathord{\smash[b]{\underset{\raise.3ex\hbox{$\scriptstyle\sim$}}{q}}\vphantom{q}}_j)
-    &amp;&amp; \text{(}\text{Theorem~7}\text{)}
+    &amp;&amp; \text{(}\text{Theorem~8}\text{)}
     \\
     &amp;= c_i,
     &amp;&amp; \text{(}\text{Definition~23 in Vectors}\text{)}
@@ -18460,7 +19482,7 @@
         <w:t xml:space="preserve">.</w:t>
       </w:r>
     </w:p>
-    <w:bookmarkStart w:id="87" w:name="exm-orthonormal-expansion"/>
+    <w:bookmarkStart w:id="92" w:name="exm-orthonormal-expansion"/>
     <w:p>
       <w:pPr>
         <w:pStyle w:val="BodyText"/>
@@ -18470,7 +19492,7 @@
           <w:b/>
           <w:bCs/>
         </w:rPr>
-        <w:t xml:space="preserve">Example 21 (Expanding a vector in an orthonormal basis)</w:t>
+        <w:t xml:space="preserve">Example 22 (Expanding a vector in an orthonormal basis)</w:t>
       </w:r>
       <w:r>
         <w:t xml:space="preserve"> </w:t>
@@ -18525,7 +19547,7 @@
           <w:rPr>
             <w:rStyle w:val="Hyperlink"/>
           </w:rPr>
-          <w:t xml:space="preserve">Example 19</w:t>
+          <w:t xml:space="preserve">Example 20</w:t>
         </w:r>
       </w:hyperlink>
       <w:r>
@@ -18640,7 +19662,7 @@
           <w:rPr>
             <w:rStyle w:val="Hyperlink"/>
           </w:rPr>
-          <w:t xml:space="preserve">Theorem 9</w:t>
+          <w:t xml:space="preserve">Theorem 10</w:t>
         </w:r>
       </w:hyperlink>
       <w:r>
@@ -18650,8 +19672,8 @@
         <w:t xml:space="preserve">says.</w:t>
       </w:r>
     </w:p>
-    <w:bookmarkEnd w:id="87"/>
-    <w:bookmarkStart w:id="88" w:name="def-gram-schmidt"/>
+    <w:bookmarkEnd w:id="92"/>
+    <w:bookmarkStart w:id="93" w:name="def-gram-schmidt"/>
     <w:p>
       <w:pPr>
         <w:pStyle w:val="BodyText"/>
@@ -18762,7 +19784,7 @@
         <w:pStyle w:val="Compact"/>
         <w:numPr>
           <w:ilvl w:val="0"/>
-          <w:numId w:val="1021"/>
+          <w:numId w:val="1023"/>
         </w:numPr>
       </w:pPr>
       <w:r>
@@ -18822,7 +19844,7 @@
         <w:pStyle w:val="Compact"/>
         <w:numPr>
           <w:ilvl w:val="0"/>
-          <w:numId w:val="1021"/>
+          <w:numId w:val="1023"/>
         </w:numPr>
       </w:pPr>
       <w:r>
@@ -18853,7 +19875,7 @@
         <w:pStyle w:val="Compact"/>
         <w:numPr>
           <w:ilvl w:val="0"/>
-          <w:numId w:val="1021"/>
+          <w:numId w:val="1023"/>
         </w:numPr>
       </w:pPr>
       <w:r>
@@ -18913,8 +19935,8 @@
         <w:t xml:space="preserve">of them if it never stops.</w:t>
       </w:r>
     </w:p>
-    <w:bookmarkEnd w:id="88"/>
-    <w:bookmarkStart w:id="89" w:name="exm-gram-schmidt"/>
+    <w:bookmarkEnd w:id="93"/>
+    <w:bookmarkStart w:id="94" w:name="exm-gram-schmidt"/>
     <w:p>
       <w:pPr>
         <w:pStyle w:val="BodyText"/>
@@ -18924,7 +19946,7 @@
           <w:b/>
           <w:bCs/>
         </w:rPr>
-        <w:t xml:space="preserve">Example 22 (Two steps of Gram-Schmidt in</w:t>
+        <w:t xml:space="preserve">Example 23 (Two steps of Gram-Schmidt in</w:t>
       </w:r>
       <w:r>
         <w:rPr>
@@ -18990,7 +20012,7 @@
       <w:pPr>
         <w:numPr>
           <w:ilvl w:val="0"/>
-          <w:numId w:val="1022"/>
+          <w:numId w:val="1024"/>
         </w:numPr>
       </w:pPr>
       <w:r>
@@ -19048,7 +20070,7 @@
       <w:pPr>
         <w:numPr>
           <w:ilvl w:val="0"/>
-          <w:numId w:val="1022"/>
+          <w:numId w:val="1024"/>
         </w:numPr>
       </w:pPr>
       <w:r>
@@ -19244,8 +20266,8 @@
     $$</w:t>
       </w:r>
     </w:p>
-    <w:bookmarkEnd w:id="89"/>
-    <w:bookmarkStart w:id="90" w:name="exm-gram-schmidt-stops"/>
+    <w:bookmarkEnd w:id="94"/>
+    <w:bookmarkStart w:id="95" w:name="exm-gram-schmidt-stops"/>
     <w:p>
       <w:pPr>
         <w:pStyle w:val="FirstParagraph"/>
@@ -19255,7 +20277,7 @@
           <w:b/>
           <w:bCs/>
         </w:rPr>
-        <w:t xml:space="preserve">Example 23 (Gram-Schmidt stops on dependent vectors)</w:t>
+        <w:t xml:space="preserve">Example 24 (Gram-Schmidt stops on dependent vectors)</w:t>
       </w:r>
       <w:r>
         <w:t xml:space="preserve"> </w:t>
@@ -19371,8 +20393,8 @@
         <w:t xml:space="preserve">.</w:t>
       </w:r>
     </w:p>
-    <w:bookmarkEnd w:id="90"/>
-    <w:bookmarkStart w:id="91" w:name="thm-gram-schmidt"/>
+    <w:bookmarkEnd w:id="95"/>
+    <w:bookmarkStart w:id="96" w:name="thm-gram-schmidt"/>
     <w:p>
       <w:pPr>
         <w:pStyle w:val="BodyText"/>
@@ -19382,7 +20404,7 @@
           <w:b/>
           <w:bCs/>
         </w:rPr>
-        <w:t xml:space="preserve">Theorem 10 (What Gram-Schmidt produces)</w:t>
+        <w:t xml:space="preserve">Theorem 11 (What Gram-Schmidt produces)</w:t>
       </w:r>
       <w:r>
         <w:t xml:space="preserve"> </w:t>
@@ -19416,7 +20438,7 @@
         <w:pStyle w:val="Compact"/>
         <w:numPr>
           <w:ilvl w:val="0"/>
-          <w:numId w:val="1023"/>
+          <w:numId w:val="1025"/>
         </w:numPr>
       </w:pPr>
       <w:r>
@@ -19474,7 +20496,7 @@
         <w:pStyle w:val="Compact"/>
         <w:numPr>
           <w:ilvl w:val="0"/>
-          <w:numId w:val="1023"/>
+          <w:numId w:val="1025"/>
         </w:numPr>
       </w:pPr>
       <w:r>
@@ -19562,7 +20584,7 @@
         <w:pStyle w:val="Compact"/>
         <w:numPr>
           <w:ilvl w:val="0"/>
-          <w:numId w:val="1023"/>
+          <w:numId w:val="1025"/>
         </w:numPr>
       </w:pPr>
       <w:r>
@@ -19648,7 +20670,7 @@
         <w:t xml:space="preserve">).</w:t>
       </w:r>
     </w:p>
-    <w:bookmarkEnd w:id="91"/>
+    <w:bookmarkEnd w:id="96"/>
     <w:p>
       <w:pPr>
         <w:pStyle w:val="FirstParagraph"/>
@@ -19677,7 +20699,7 @@
         </w:rPr>
         <w:t xml:space="preserve"> </w:t>
       </w:r>
-      <w:hyperlink r:id="rId92">
+      <w:hyperlink r:id="rId97">
         <w:r>
           <w:rPr>
             <w:rStyle w:val="Hyperlink"/>
@@ -19764,7 +20786,7 @@
       <w:r>
         <w:t xml:space="preserve">(</w:t>
       </w:r>
-      <w:hyperlink r:id="rId93">
+      <w:hyperlink r:id="rId98">
         <w:r>
           <w:rPr>
             <w:rStyle w:val="Hyperlink"/>
@@ -19851,7 +20873,7 @@
           <w:rPr>
             <w:rStyle w:val="Hyperlink"/>
           </w:rPr>
-          <w:t xml:space="preserve">Theorem 8</w:t>
+          <w:t xml:space="preserve">Theorem 9</w:t>
         </w:r>
       </w:hyperlink>
       <w:r>
@@ -19982,7 +21004,7 @@
     &amp;&amp; \text{(}\text{Definition~11}\text{, as a linear combination)}
     \\
     &amp;= 1\,(\mathord{\smash[b]{\underset{\raise.3ex\hbox{$\scriptstyle\sim$}}{q}}\vphantom{q}}_l \cdot \mathord{\smash[b]{\underset{\raise.3ex\hbox{$\scriptstyle\sim$}}{a}}\vphantom{a}}_i) + \sum_{j=1}^{i-1} \mathopen{}\left(-\mathord{\smash[b]{\underset{\raise.3ex\hbox{$\scriptstyle\sim$}}{q}}\vphantom{q}}_j \cdot \mathord{\smash[b]{\underset{\raise.3ex\hbox{$\scriptstyle\sim$}}{a}}\vphantom{a}}_i\right)\mathclose{}\,(\mathord{\smash[b]{\underset{\raise.3ex\hbox{$\scriptstyle\sim$}}{q}}\vphantom{q}}_l \cdot \mathord{\smash[b]{\underset{\raise.3ex\hbox{$\scriptstyle\sim$}}{q}}\vphantom{q}}_j)
-    &amp;&amp; \text{(}\text{Theorem~7}\text{)}
+    &amp;&amp; \text{(}\text{Theorem~8}\text{)}
     \\
     &amp;= \mathord{\smash[b]{\underset{\raise.3ex\hbox{$\scriptstyle\sim$}}{q}}\vphantom{q}}_l \cdot \mathord{\smash[b]{\underset{\raise.3ex\hbox{$\scriptstyle\sim$}}{a}}\vphantom{a}}_i - \sum_{j=1}^{i-1} (\mathord{\smash[b]{\underset{\raise.3ex\hbox{$\scriptstyle\sim$}}{q}}\vphantom{q}}_j \cdot \mathord{\smash[b]{\underset{\raise.3ex\hbox{$\scriptstyle\sim$}}{a}}\vphantom{a}}_i)\,(\mathord{\smash[b]{\underset{\raise.3ex\hbox{$\scriptstyle\sim$}}{q}}\vphantom{q}}_l \cdot \mathord{\smash[b]{\underset{\raise.3ex\hbox{$\scriptstyle\sim$}}{q}}\vphantom{q}}_j)
     &amp;&amp; \text{(} 1\,z = z \text{, and pull the minus signs out of the sum)}
@@ -20082,7 +21104,7 @@
           <w:rPr>
             <w:rStyle w:val="Hyperlink"/>
           </w:rPr>
-          <w:t xml:space="preserve">Theorem 9</w:t>
+          <w:t xml:space="preserve">Theorem 10</w:t>
         </w:r>
       </w:hyperlink>
       <w:r>
@@ -20300,7 +21322,7 @@
         <w:pStyle w:val="Compact"/>
         <w:numPr>
           <w:ilvl w:val="0"/>
-          <w:numId w:val="1024"/>
+          <w:numId w:val="1026"/>
         </w:numPr>
       </w:pPr>
       <w:r>
@@ -20352,7 +21374,7 @@
         <w:pStyle w:val="Compact"/>
         <w:numPr>
           <w:ilvl w:val="0"/>
-          <w:numId w:val="1024"/>
+          <w:numId w:val="1026"/>
         </w:numPr>
       </w:pPr>
       <w:r>
@@ -20470,7 +21492,7 @@
       <w:r>
         <w:t xml:space="preserve">A span is a subspace (</w:t>
       </w:r>
-      <w:hyperlink r:id="rId94">
+      <w:hyperlink r:id="rId99">
         <w:r>
           <w:rPr>
             <w:rStyle w:val="Hyperlink"/>
@@ -20570,7 +21592,7 @@
       <w:r>
         <w:t xml:space="preserve"> </w:t>
       </w:r>
-      <w:hyperlink r:id="rId95">
+      <w:hyperlink r:id="rId100">
         <w:r>
           <w:rPr>
             <w:rStyle w:val="Hyperlink"/>
@@ -20699,7 +21721,7 @@
           <w:rPr>
             <w:rStyle w:val="Hyperlink"/>
           </w:rPr>
-          <w:t xml:space="preserve">Theorem 8</w:t>
+          <w:t xml:space="preserve">Theorem 9</w:t>
         </w:r>
       </w:hyperlink>
       <w:r>
@@ -20730,7 +21752,7 @@
         <w:t xml:space="preserve">so they are an orthonormal basis of it.</w:t>
       </w:r>
     </w:p>
-    <w:bookmarkStart w:id="96" w:name="exm-thm-gram-schmidt"/>
+    <w:bookmarkStart w:id="101" w:name="exm-thm-gram-schmidt"/>
     <w:p>
       <w:pPr>
         <w:pStyle w:val="BodyText"/>
@@ -20740,7 +21762,7 @@
           <w:b/>
           <w:bCs/>
         </w:rPr>
-        <w:t xml:space="preserve">Example 24 (Finishing an orthonormal basis of</w:t>
+        <w:t xml:space="preserve">Example 25 (Finishing an orthonormal basis of</w:t>
       </w:r>
       <w:r>
         <w:rPr>
@@ -20788,7 +21810,7 @@
           <w:rPr>
             <w:rStyle w:val="Hyperlink"/>
           </w:rPr>
-          <w:t xml:space="preserve">Example 22</w:t>
+          <w:t xml:space="preserve">Example 23</w:t>
         </w:r>
       </w:hyperlink>
       <w:r>
@@ -20974,7 +21996,7 @@
           <w:rPr>
             <w:rStyle w:val="Hyperlink"/>
           </w:rPr>
-          <w:t xml:space="preserve">Theorem 10</w:t>
+          <w:t xml:space="preserve">Theorem 11</w:t>
         </w:r>
       </w:hyperlink>
       <w:r>
@@ -21027,7 +22049,7 @@
       <w:r>
         <w:t xml:space="preserve">(</w:t>
       </w:r>
-      <w:hyperlink r:id="rId80">
+      <w:hyperlink r:id="rId85">
         <w:r>
           <w:rPr>
             <w:rStyle w:val="Hyperlink"/>
@@ -21071,7 +22093,7 @@
       <w:r>
         <w:t xml:space="preserve">(</w:t>
       </w:r>
-      <w:hyperlink r:id="rId81">
+      <w:hyperlink r:id="rId86">
         <w:r>
           <w:rPr>
             <w:rStyle w:val="Hyperlink"/>
@@ -21085,7 +22107,7 @@
       <w:r>
         <w:t xml:space="preserve"> </w:t>
       </w:r>
-      <w:hyperlink r:id="rId79">
+      <w:hyperlink r:id="rId84">
         <w:r>
           <w:rPr>
             <w:rStyle w:val="Hyperlink"/>
@@ -21137,8 +22159,8 @@
     $$</w:t>
       </w:r>
     </w:p>
-    <w:bookmarkEnd w:id="96"/>
-    <w:bookmarkStart w:id="97" w:name="cor-orthonormal-basis-exists"/>
+    <w:bookmarkEnd w:id="101"/>
+    <w:bookmarkStart w:id="102" w:name="cor-orthonormal-basis-exists"/>
     <w:p>
       <w:pPr>
         <w:pStyle w:val="FirstParagraph"/>
@@ -21276,7 +22298,7 @@
         <w:t xml:space="preserve">has an orthonormal basis.</w:t>
       </w:r>
     </w:p>
-    <w:bookmarkEnd w:id="97"/>
+    <w:bookmarkEnd w:id="102"/>
     <w:p>
       <w:pPr>
         <w:pStyle w:val="BodyText"/>
@@ -21317,7 +22339,7 @@
           <w:rPr>
             <w:rStyle w:val="Hyperlink"/>
           </w:rPr>
-          <w:t xml:space="preserve">Theorem 8</w:t>
+          <w:t xml:space="preserve">Theorem 9</w:t>
         </w:r>
       </w:hyperlink>
       <w:r>
@@ -21359,7 +22381,7 @@
       <w:r>
         <w:t xml:space="preserve">(</w:t>
       </w:r>
-      <w:hyperlink r:id="rId98">
+      <w:hyperlink r:id="rId103">
         <w:r>
           <w:rPr>
             <w:rStyle w:val="Hyperlink"/>
@@ -21411,7 +22433,7 @@
           <w:rPr>
             <w:rStyle w:val="Hyperlink"/>
           </w:rPr>
-          <w:t xml:space="preserve">Theorem 10</w:t>
+          <w:t xml:space="preserve">Theorem 11</w:t>
         </w:r>
       </w:hyperlink>
       <w:r>
@@ -21460,7 +22482,7 @@
       <w:r>
         <w:t xml:space="preserve"> </w:t>
       </w:r>
-      <w:hyperlink r:id="rId92">
+      <w:hyperlink r:id="rId97">
         <w:r>
           <w:rPr>
             <w:rStyle w:val="Hyperlink"/>
@@ -21631,7 +22653,7 @@
         <w:t xml:space="preserve">So the orthonormal basis contains the starting list.</w:t>
       </w:r>
     </w:p>
-    <w:bookmarkStart w:id="100" w:name="exm-orthonormal-basis-exists"/>
+    <w:bookmarkStart w:id="105" w:name="exm-orthonormal-basis-exists"/>
     <w:p>
       <w:pPr>
         <w:pStyle w:val="BodyText"/>
@@ -21641,7 +22663,7 @@
           <w:b/>
           <w:bCs/>
         </w:rPr>
-        <w:t xml:space="preserve">Example 25 (Extending one unit vector to an orthonormal basis of</w:t>
+        <w:t xml:space="preserve">Example 26 (Extending one unit vector to an orthonormal basis of</w:t>
       </w:r>
       <w:r>
         <w:rPr>
@@ -21726,7 +22748,7 @@
       <w:r>
         <w:t xml:space="preserve"> </w:t>
       </w:r>
-      <w:hyperlink r:id="rId99">
+      <w:hyperlink r:id="rId104">
         <w:r>
           <w:rPr>
             <w:rStyle w:val="Hyperlink"/>
@@ -21938,7 +22960,7 @@
       <w:r>
         <w:t xml:space="preserve">are linearly independent (</w:t>
       </w:r>
-      <w:hyperlink r:id="rId95">
+      <w:hyperlink r:id="rId100">
         <w:r>
           <w:rPr>
             <w:rStyle w:val="Hyperlink"/>
@@ -22002,7 +23024,7 @@
       <w:r>
         <w:t xml:space="preserve">(</w:t>
       </w:r>
-      <w:hyperlink r:id="rId80">
+      <w:hyperlink r:id="rId85">
         <w:r>
           <w:rPr>
             <w:rStyle w:val="Hyperlink"/>
@@ -22046,7 +23068,7 @@
       <w:r>
         <w:t xml:space="preserve">(</w:t>
       </w:r>
-      <w:hyperlink r:id="rId81">
+      <w:hyperlink r:id="rId86">
         <w:r>
           <w:rPr>
             <w:rStyle w:val="Hyperlink"/>
@@ -22060,7 +23082,7 @@
       <w:r>
         <w:t xml:space="preserve"> </w:t>
       </w:r>
-      <w:hyperlink r:id="rId79">
+      <w:hyperlink r:id="rId84">
         <w:r>
           <w:rPr>
             <w:rStyle w:val="Hyperlink"/>
@@ -22091,7 +23113,7 @@
       <w:pPr>
         <w:numPr>
           <w:ilvl w:val="0"/>
-          <w:numId w:val="1025"/>
+          <w:numId w:val="1027"/>
         </w:numPr>
       </w:pPr>
       <w:r>
@@ -22105,7 +23127,7 @@
       <w:pPr>
         <w:numPr>
           <w:ilvl w:val="0"/>
-          <w:numId w:val="1025"/>
+          <w:numId w:val="1027"/>
         </w:numPr>
       </w:pPr>
       <w:r>
@@ -22183,7 +23205,7 @@
       <w:pPr>
         <w:numPr>
           <w:ilvl w:val="0"/>
-          <w:numId w:val="1025"/>
+          <w:numId w:val="1027"/>
         </w:numPr>
       </w:pPr>
       <m:oMath>
@@ -22293,16 +23315,16 @@
           <w:rPr>
             <w:rStyle w:val="Hyperlink"/>
           </w:rPr>
-          <w:t xml:space="preserve">Example 19</w:t>
+          <w:t xml:space="preserve">Example 20</w:t>
         </w:r>
       </w:hyperlink>
       <w:r>
         <w:t xml:space="preserve">, in a different order.</w:t>
       </w:r>
     </w:p>
-    <w:bookmarkEnd w:id="100"/>
-    <w:bookmarkEnd w:id="101"/>
-    <w:bookmarkStart w:id="139" w:name="outer-product"/>
+    <w:bookmarkEnd w:id="105"/>
+    <w:bookmarkEnd w:id="106"/>
+    <w:bookmarkStart w:id="144" w:name="outer-product"/>
     <w:p>
       <w:pPr>
         <w:pStyle w:val="Heading2"/>
@@ -22311,7 +23333,7 @@
         <w:t xml:space="preserve">4 Outer product</w:t>
       </w:r>
     </w:p>
-    <w:bookmarkStart w:id="103" w:name="def-outer-product"/>
+    <w:bookmarkStart w:id="108" w:name="def-outer-product"/>
     <w:p>
       <w:pPr>
         <w:pStyle w:val="FirstParagraph"/>
@@ -22426,7 +23448,7 @@
       <w:r>
         <w:t xml:space="preserve">matrix product (</w:t>
       </w:r>
-      <w:hyperlink r:id="rId102">
+      <w:hyperlink r:id="rId107">
         <w:r>
           <w:rPr>
             <w:rStyle w:val="Hyperlink"/>
@@ -22489,8 +23511,8 @@
     $$</w:t>
       </w:r>
     </w:p>
-    <w:bookmarkEnd w:id="103"/>
-    <w:bookmarkStart w:id="104" w:name="exm-outer-product"/>
+    <w:bookmarkEnd w:id="108"/>
+    <w:bookmarkStart w:id="109" w:name="exm-outer-product"/>
     <w:p>
       <w:pPr>
         <w:pStyle w:val="FirstParagraph"/>
@@ -22500,7 +23522,7 @@
           <w:b/>
           <w:bCs/>
         </w:rPr>
-        <w:t xml:space="preserve">Example 26 (An outer product)</w:t>
+        <w:t xml:space="preserve">Example 27 (An outer product)</w:t>
       </w:r>
       <w:r>
         <w:t xml:space="preserve"> </w:t>
@@ -22559,8 +23581,8 @@
     $$</w:t>
       </w:r>
     </w:p>
-    <w:bookmarkEnd w:id="104"/>
-    <w:bookmarkStart w:id="106" w:name="rem-outer-vs-dot-product"/>
+    <w:bookmarkEnd w:id="109"/>
+    <w:bookmarkStart w:id="111" w:name="rem-outer-vs-dot-product"/>
     <w:p>
       <w:pPr>
         <w:pStyle w:val="FirstParagraph"/>
@@ -22590,7 +23612,7 @@
       <w:r>
         <w:t xml:space="preserve">(</w:t>
       </w:r>
-      <w:hyperlink r:id="rId105">
+      <w:hyperlink r:id="rId110">
         <w:r>
           <w:rPr>
             <w:rStyle w:val="Hyperlink"/>
@@ -22674,7 +23696,7 @@
           <w:rPr>
             <w:rStyle w:val="Hyperlink"/>
           </w:rPr>
-          <w:t xml:space="preserve">Example 26</w:t>
+          <w:t xml:space="preserve">Example 27</w:t>
         </w:r>
       </w:hyperlink>
       <w:r>
@@ -22769,8 +23791,8 @@
     $$</w:t>
       </w:r>
     </w:p>
-    <w:bookmarkEnd w:id="106"/>
-    <w:bookmarkStart w:id="108" w:name="thm-outer-product-rank"/>
+    <w:bookmarkEnd w:id="111"/>
+    <w:bookmarkStart w:id="113" w:name="thm-outer-product-rank"/>
     <w:p>
       <w:pPr>
         <w:pStyle w:val="FirstParagraph"/>
@@ -22780,7 +23802,7 @@
           <w:b/>
           <w:bCs/>
         </w:rPr>
-        <w:t xml:space="preserve">Theorem 11 (An outer product has rank one)</w:t>
+        <w:t xml:space="preserve">Theorem 12 (An outer product has rank one)</w:t>
       </w:r>
       <w:r>
         <w:t xml:space="preserve"> </w:t>
@@ -22855,7 +23877,7 @@
       <w:r>
         <w:t xml:space="preserve">(</w:t>
       </w:r>
-      <w:hyperlink r:id="rId107">
+      <w:hyperlink r:id="rId112">
         <w:r>
           <w:rPr>
             <w:rStyle w:val="Hyperlink"/>
@@ -22867,7 +23889,7 @@
         <w:t xml:space="preserve">).</w:t>
       </w:r>
     </w:p>
-    <w:bookmarkEnd w:id="108"/>
+    <w:bookmarkEnd w:id="113"/>
     <w:p>
       <w:pPr>
         <w:pStyle w:val="BodyText"/>
@@ -23538,7 +24560,7 @@
         <w:t xml:space="preserve">The largest linearly independent set of columns therefore has one column.</w:t>
       </w:r>
     </w:p>
-    <w:bookmarkStart w:id="109" w:name="exm-outer-product-rank"/>
+    <w:bookmarkStart w:id="114" w:name="exm-outer-product-rank"/>
     <w:p>
       <w:pPr>
         <w:pStyle w:val="BodyText"/>
@@ -23548,7 +24570,7 @@
           <w:b/>
           <w:bCs/>
         </w:rPr>
-        <w:t xml:space="preserve">Example 27 (The rank of an outer product)</w:t>
+        <w:t xml:space="preserve">Example 28 (The rank of an outer product)</w:t>
       </w:r>
       <w:r>
         <w:t xml:space="preserve"> </w:t>
@@ -23564,7 +24586,7 @@
           <w:rPr>
             <w:rStyle w:val="Hyperlink"/>
           </w:rPr>
-          <w:t xml:space="preserve">Example 26</w:t>
+          <w:t xml:space="preserve">Example 27</w:t>
         </w:r>
       </w:hyperlink>
       <w:r>
@@ -23773,9 +24795,9 @@
         <w:t xml:space="preserve">.</w:t>
       </w:r>
     </w:p>
-    <w:bookmarkEnd w:id="109"/>
-    <w:bookmarkStart w:id="138" w:name="refs"/>
-    <w:bookmarkStart w:id="111" w:name="ref-wikipedia_inner_product_space"/>
+    <w:bookmarkEnd w:id="114"/>
+    <w:bookmarkStart w:id="143" w:name="refs"/>
+    <w:bookmarkStart w:id="116" w:name="ref-wikipedia_inner_product_space"/>
     <w:p>
       <w:pPr>
         <w:pStyle w:val="Bibliography"/>
@@ -23822,7 +24844,7 @@
       <w:r>
         <w:t xml:space="preserve"> </w:t>
       </w:r>
-      <w:hyperlink r:id="rId110">
+      <w:hyperlink r:id="rId115">
         <w:r>
           <w:rPr>
             <w:rStyle w:val="Hyperlink"/>
@@ -23831,8 +24853,8 @@
         </w:r>
       </w:hyperlink>
     </w:p>
-    <w:bookmarkEnd w:id="111"/>
-    <w:bookmarkStart w:id="113" w:name="ref-axler2024linear"/>
+    <w:bookmarkEnd w:id="116"/>
+    <w:bookmarkStart w:id="118" w:name="ref-axler2024linear"/>
     <w:p>
       <w:pPr>
         <w:pStyle w:val="Bibliography"/>
@@ -23865,7 +24887,7 @@
       <w:r>
         <w:t xml:space="preserve"> </w:t>
       </w:r>
-      <w:hyperlink r:id="rId112">
+      <w:hyperlink r:id="rId117">
         <w:r>
           <w:rPr>
             <w:rStyle w:val="Hyperlink"/>
@@ -23877,8 +24899,8 @@
         <w:t xml:space="preserve">.</w:t>
       </w:r>
     </w:p>
-    <w:bookmarkEnd w:id="113"/>
-    <w:bookmarkStart w:id="115" w:name="ref-banerjee2014linear"/>
+    <w:bookmarkEnd w:id="118"/>
+    <w:bookmarkStart w:id="120" w:name="ref-banerjee2014linear"/>
     <w:p>
       <w:pPr>
         <w:pStyle w:val="Bibliography"/>
@@ -23911,7 +24933,7 @@
       <w:r>
         <w:t xml:space="preserve"> </w:t>
       </w:r>
-      <w:hyperlink r:id="rId114">
+      <w:hyperlink r:id="rId119">
         <w:r>
           <w:rPr>
             <w:rStyle w:val="Hyperlink"/>
@@ -23920,8 +24942,8 @@
         </w:r>
       </w:hyperlink>
     </w:p>
-    <w:bookmarkEnd w:id="115"/>
-    <w:bookmarkStart w:id="117" w:name="ref-zhou2024vector"/>
+    <w:bookmarkEnd w:id="120"/>
+    <w:bookmarkStart w:id="122" w:name="ref-zhou2024vector"/>
     <w:p>
       <w:pPr>
         <w:pStyle w:val="Bibliography"/>
@@ -23953,7 +24975,7 @@
       <w:r>
         <w:t xml:space="preserve"> </w:t>
       </w:r>
-      <w:hyperlink r:id="rId116">
+      <w:hyperlink r:id="rId121">
         <w:r>
           <w:rPr>
             <w:rStyle w:val="Hyperlink"/>
@@ -23962,8 +24984,8 @@
         </w:r>
       </w:hyperlink>
     </w:p>
-    <w:bookmarkEnd w:id="117"/>
-    <w:bookmarkStart w:id="119" w:name="ref-wikipedia_pythagorean_theorem"/>
+    <w:bookmarkEnd w:id="122"/>
+    <w:bookmarkStart w:id="124" w:name="ref-wikipedia_pythagorean_theorem"/>
     <w:p>
       <w:pPr>
         <w:pStyle w:val="Bibliography"/>
@@ -24010,7 +25032,7 @@
       <w:r>
         <w:t xml:space="preserve"> </w:t>
       </w:r>
-      <w:hyperlink r:id="rId118">
+      <w:hyperlink r:id="rId123">
         <w:r>
           <w:rPr>
             <w:rStyle w:val="Hyperlink"/>
@@ -24019,8 +25041,8 @@
         </w:r>
       </w:hyperlink>
     </w:p>
-    <w:bookmarkEnd w:id="119"/>
-    <w:bookmarkStart w:id="121" w:name="ref-wikipedia_cauchy_schwarz_inequality"/>
+    <w:bookmarkEnd w:id="124"/>
+    <w:bookmarkStart w:id="126" w:name="ref-wikipedia_cauchy_schwarz_inequality"/>
     <w:p>
       <w:pPr>
         <w:pStyle w:val="Bibliography"/>
@@ -24067,7 +25089,7 @@
       <w:r>
         <w:t xml:space="preserve"> </w:t>
       </w:r>
-      <w:hyperlink r:id="rId120">
+      <w:hyperlink r:id="rId125">
         <w:r>
           <w:rPr>
             <w:rStyle w:val="Hyperlink"/>
@@ -24076,8 +25098,8 @@
         </w:r>
       </w:hyperlink>
     </w:p>
-    <w:bookmarkEnd w:id="121"/>
-    <w:bookmarkStart w:id="123" w:name="ref-wikipedia_norm_mathematics"/>
+    <w:bookmarkEnd w:id="126"/>
+    <w:bookmarkStart w:id="128" w:name="ref-wikipedia_norm_mathematics"/>
     <w:p>
       <w:pPr>
         <w:pStyle w:val="Bibliography"/>
@@ -24124,7 +25146,7 @@
       <w:r>
         <w:t xml:space="preserve"> </w:t>
       </w:r>
-      <w:hyperlink r:id="rId122">
+      <w:hyperlink r:id="rId127">
         <w:r>
           <w:rPr>
             <w:rStyle w:val="Hyperlink"/>
@@ -24133,8 +25155,8 @@
         </w:r>
       </w:hyperlink>
     </w:p>
-    <w:bookmarkEnd w:id="123"/>
-    <w:bookmarkStart w:id="125" w:name="ref-wikipedia_triangle_inequality"/>
+    <w:bookmarkEnd w:id="128"/>
+    <w:bookmarkStart w:id="130" w:name="ref-wikipedia_triangle_inequality"/>
     <w:p>
       <w:pPr>
         <w:pStyle w:val="Bibliography"/>
@@ -24181,7 +25203,7 @@
       <w:r>
         <w:t xml:space="preserve"> </w:t>
       </w:r>
-      <w:hyperlink r:id="rId124">
+      <w:hyperlink r:id="rId129">
         <w:r>
           <w:rPr>
             <w:rStyle w:val="Hyperlink"/>
@@ -24190,8 +25212,8 @@
         </w:r>
       </w:hyperlink>
     </w:p>
-    <w:bookmarkEnd w:id="125"/>
-    <w:bookmarkStart w:id="127" w:name="ref-wikipedia_lp_space"/>
+    <w:bookmarkEnd w:id="130"/>
+    <w:bookmarkStart w:id="132" w:name="ref-wikipedia_lp_space"/>
     <w:p>
       <w:pPr>
         <w:pStyle w:val="Bibliography"/>
@@ -24238,7 +25260,7 @@
       <w:r>
         <w:t xml:space="preserve"> </w:t>
       </w:r>
-      <w:hyperlink r:id="rId126">
+      <w:hyperlink r:id="rId131">
         <w:r>
           <w:rPr>
             <w:rStyle w:val="Hyperlink"/>
@@ -24247,8 +25269,8 @@
         </w:r>
       </w:hyperlink>
     </w:p>
-    <w:bookmarkEnd w:id="127"/>
-    <w:bookmarkStart w:id="129" w:name="ref-wikipedia_uniform_norm"/>
+    <w:bookmarkEnd w:id="132"/>
+    <w:bookmarkStart w:id="134" w:name="ref-wikipedia_uniform_norm"/>
     <w:p>
       <w:pPr>
         <w:pStyle w:val="Bibliography"/>
@@ -24295,7 +25317,7 @@
       <w:r>
         <w:t xml:space="preserve"> </w:t>
       </w:r>
-      <w:hyperlink r:id="rId128">
+      <w:hyperlink r:id="rId133">
         <w:r>
           <w:rPr>
             <w:rStyle w:val="Hyperlink"/>
@@ -24304,8 +25326,8 @@
         </w:r>
       </w:hyperlink>
     </w:p>
-    <w:bookmarkEnd w:id="129"/>
-    <w:bookmarkStart w:id="131" w:name="ref-wikipedia_cosine_similarity"/>
+    <w:bookmarkEnd w:id="134"/>
+    <w:bookmarkStart w:id="136" w:name="ref-wikipedia_cosine_similarity"/>
     <w:p>
       <w:pPr>
         <w:pStyle w:val="Bibliography"/>
@@ -24352,7 +25374,7 @@
       <w:r>
         <w:t xml:space="preserve"> </w:t>
       </w:r>
-      <w:hyperlink r:id="rId130">
+      <w:hyperlink r:id="rId135">
         <w:r>
           <w:rPr>
             <w:rStyle w:val="Hyperlink"/>
@@ -24361,8 +25383,8 @@
         </w:r>
       </w:hyperlink>
     </w:p>
-    <w:bookmarkEnd w:id="131"/>
-    <w:bookmarkStart w:id="133" w:name="ref-wikipedia_orthonormal_basis"/>
+    <w:bookmarkEnd w:id="136"/>
+    <w:bookmarkStart w:id="138" w:name="ref-wikipedia_orthonormal_basis"/>
     <w:p>
       <w:pPr>
         <w:pStyle w:val="Bibliography"/>
@@ -24409,7 +25431,7 @@
       <w:r>
         <w:t xml:space="preserve"> </w:t>
       </w:r>
-      <w:hyperlink r:id="rId132">
+      <w:hyperlink r:id="rId137">
         <w:r>
           <w:rPr>
             <w:rStyle w:val="Hyperlink"/>
@@ -24418,8 +25440,8 @@
         </w:r>
       </w:hyperlink>
     </w:p>
-    <w:bookmarkEnd w:id="133"/>
-    <w:bookmarkStart w:id="135" w:name="ref-wikipedia_gram_schmidt_process"/>
+    <w:bookmarkEnd w:id="138"/>
+    <w:bookmarkStart w:id="140" w:name="ref-wikipedia_gram_schmidt_process"/>
     <w:p>
       <w:pPr>
         <w:pStyle w:val="Bibliography"/>
@@ -24466,7 +25488,7 @@
       <w:r>
         <w:t xml:space="preserve"> </w:t>
       </w:r>
-      <w:hyperlink r:id="rId134">
+      <w:hyperlink r:id="rId139">
         <w:r>
           <w:rPr>
             <w:rStyle w:val="Hyperlink"/>
@@ -24475,8 +25497,8 @@
         </w:r>
       </w:hyperlink>
     </w:p>
-    <w:bookmarkEnd w:id="135"/>
-    <w:bookmarkStart w:id="137" w:name="ref-wikipedia_outer_product"/>
+    <w:bookmarkEnd w:id="140"/>
+    <w:bookmarkStart w:id="142" w:name="ref-wikipedia_outer_product"/>
     <w:p>
       <w:pPr>
         <w:pStyle w:val="Bibliography"/>
@@ -24523,7 +25545,7 @@
       <w:r>
         <w:t xml:space="preserve"> </w:t>
       </w:r>
-      <w:hyperlink r:id="rId136">
+      <w:hyperlink r:id="rId141">
         <w:r>
           <w:rPr>
             <w:rStyle w:val="Hyperlink"/>
@@ -24532,9 +25554,9 @@
         </w:r>
       </w:hyperlink>
     </w:p>
-    <w:bookmarkEnd w:id="137"/>
-    <w:bookmarkEnd w:id="138"/>
-    <w:bookmarkEnd w:id="139"/>
+    <w:bookmarkEnd w:id="142"/>
+    <w:bookmarkEnd w:id="143"/>
+    <w:bookmarkEnd w:id="144"/>
     <w:sectPr>
       <w:footnotePr>
         <w:numRestart w:val="eachSect"/>
@@ -25090,34 +26112,7 @@
     <w:abstractNumId w:val="991"/>
   </w:num>
   <w:num w:numId="1021">
-    <w:abstractNumId w:val="99411"/>
-    <w:lvlOverride w:ilvl="0">
-      <w:startOverride w:val="1"/>
-    </w:lvlOverride>
-    <w:lvlOverride w:ilvl="1">
-      <w:startOverride w:val="1"/>
-    </w:lvlOverride>
-    <w:lvlOverride w:ilvl="2">
-      <w:startOverride w:val="1"/>
-    </w:lvlOverride>
-    <w:lvlOverride w:ilvl="3">
-      <w:startOverride w:val="1"/>
-    </w:lvlOverride>
-    <w:lvlOverride w:ilvl="4">
-      <w:startOverride w:val="1"/>
-    </w:lvlOverride>
-    <w:lvlOverride w:ilvl="5">
-      <w:startOverride w:val="1"/>
-    </w:lvlOverride>
-    <w:lvlOverride w:ilvl="6">
-      <w:startOverride w:val="1"/>
-    </w:lvlOverride>
-    <w:lvlOverride w:ilvl="7">
-      <w:startOverride w:val="1"/>
-    </w:lvlOverride>
-    <w:lvlOverride w:ilvl="8">
-      <w:startOverride w:val="1"/>
-    </w:lvlOverride>
+    <w:abstractNumId w:val="991"/>
   </w:num>
   <w:num w:numId="1022">
     <w:abstractNumId w:val="991"/>
@@ -25156,6 +26151,39 @@
     <w:abstractNumId w:val="991"/>
   </w:num>
   <w:num w:numId="1025">
+    <w:abstractNumId w:val="99411"/>
+    <w:lvlOverride w:ilvl="0">
+      <w:startOverride w:val="1"/>
+    </w:lvlOverride>
+    <w:lvlOverride w:ilvl="1">
+      <w:startOverride w:val="1"/>
+    </w:lvlOverride>
+    <w:lvlOverride w:ilvl="2">
+      <w:startOverride w:val="1"/>
+    </w:lvlOverride>
+    <w:lvlOverride w:ilvl="3">
+      <w:startOverride w:val="1"/>
+    </w:lvlOverride>
+    <w:lvlOverride w:ilvl="4">
+      <w:startOverride w:val="1"/>
+    </w:lvlOverride>
+    <w:lvlOverride w:ilvl="5">
+      <w:startOverride w:val="1"/>
+    </w:lvlOverride>
+    <w:lvlOverride w:ilvl="6">
+      <w:startOverride w:val="1"/>
+    </w:lvlOverride>
+    <w:lvlOverride w:ilvl="7">
+      <w:startOverride w:val="1"/>
+    </w:lvlOverride>
+    <w:lvlOverride w:ilvl="8">
+      <w:startOverride w:val="1"/>
+    </w:lvlOverride>
+  </w:num>
+  <w:num w:numId="1026">
+    <w:abstractNumId w:val="991"/>
+  </w:num>
+  <w:num w:numId="1027">
     <w:abstractNumId w:val="99411"/>
     <w:lvlOverride w:ilvl="0">
       <w:startOverride w:val="1"/>

</xml_diff>